<commit_message>
done all data sorted now mostly
</commit_message>
<xml_diff>
--- a/templates/quotation-template.docx
+++ b/templates/quotation-template.docx
@@ -853,28 +853,39 @@
     </w:p>
     <w:p>
       <w:pPr>
-        <w:rPr>
-          <w:rFonts w:asciiTheme="majorHAnsi" w:hAnsiTheme="majorHAnsi"/>
-        </w:rPr>
-      </w:pPr>
-      <w:r>
-        <w:rPr>
-          <w:rFonts w:asciiTheme="majorHAnsi" w:hAnsiTheme="majorHAnsi"/>
-        </w:rPr>
-        <w:t>This quotation has been prepared using the following drawing:</w:t>
-      </w:r>
-      <w:r>
-        <w:rPr>
-          <w:rFonts w:asciiTheme="majorHAnsi" w:hAnsiTheme="majorHAnsi"/>
-        </w:rPr>
-        <w:t xml:space="preserve"> </w:t>
-      </w:r>
-      <w:r>
-        <w:rPr>
-          <w:rFonts w:asciiTheme="majorHAnsi" w:hAnsiTheme="majorHAnsi"/>
-          <w:highlight w:val="yellow"/>
-        </w:rPr>
-        <w:t>XXXX</w:t>
+        <w:framePr w:w="0" w:h="0" w:vAnchor="margin" w:hAnchor="text" w:x="0" w:y="0"/>
+        <w:pBdr>
+          <w:top w:val="none" w:sz="4" w:space="0"/>
+          <w:left w:val="none" w:sz="4" w:space="0"/>
+          <w:bottom w:val="none" w:sz="4" w:space="0"/>
+          <w:right w:val="none" w:sz="4" w:space="0"/>
+          <w:between w:val="none" w:sz="4" w:space="0"/>
+          <w:bar w:val="none" w:sz="4" w:space="0"/>
+        </w:pBdr>
+        <w:shd w:val="clear" w:fill="auto"/>
+        <w:bidi w:val="off"/>
+        <w:spacing w:before="0" w:after="0" w:line="240" w:lineRule="auto"/>
+        <w:ind w:left="0" w:right="0" w:firstLine="0"/>
+        <w:jc w:val="left"/>
+        <w:rPr>
+          <w:rFonts w:asciiTheme="majorHAnsi" w:hAnsiTheme="majorHAnsi"/>
+        </w:rPr>
+      </w:pPr>
+      <w:r>
+        <w:rPr>
+          <w:rFonts w:asciiTheme="majorHAnsi" w:hAnsiTheme="majorHAnsi"/>
+        </w:rPr>
+        <w:t xml:space="preserve">This quotation has been prepared using the following drawing: </w:t>
+      </w:r>
+      <w:r>
+        <w:rPr>
+          <w:rFonts w:ascii="Segoe UI"/>
+          <w:color w:val="000000"/>
+          <w:sz w:val="18"/>
+          <w:rtl w:val="off"/>
+          <w:lang w:val="en-US"/>
+        </w:rPr>
+        <w:t>{drawing}</w:t>
       </w:r>
     </w:p>
     <w:tbl>
@@ -971,11 +982,34 @@
           </w:tcPr>
           <w:p>
             <w:pPr>
-              <w:spacing w:after="0"/>
-              <w:rPr>
-                <w:rFonts w:asciiTheme="majorHAnsi" w:hAnsiTheme="majorHAnsi"/>
-              </w:rPr>
-            </w:pPr>
+              <w:framePr w:w="0" w:h="0" w:vAnchor="margin" w:hAnchor="text" w:x="0" w:y="0"/>
+              <w:pBdr>
+                <w:top w:val="none" w:sz="4" w:space="0"/>
+                <w:left w:val="none" w:sz="4" w:space="0"/>
+                <w:bottom w:val="none" w:sz="4" w:space="0"/>
+                <w:right w:val="none" w:sz="4" w:space="0"/>
+                <w:between w:val="none" w:sz="4" w:space="0"/>
+                <w:bar w:val="none" w:sz="4" w:space="0"/>
+              </w:pBdr>
+              <w:shd w:val="clear" w:fill="auto"/>
+              <w:bidi w:val="off"/>
+              <w:spacing w:before="0" w:after="0" w:line="240" w:lineRule="auto"/>
+              <w:ind w:left="0" w:right="0" w:firstLine="0"/>
+              <w:jc w:val="left"/>
+              <w:rPr>
+                <w:rFonts w:asciiTheme="majorHAnsi" w:hAnsiTheme="majorHAnsi"/>
+              </w:rPr>
+            </w:pPr>
+            <w:r>
+              <w:rPr>
+                <w:rFonts w:ascii="Segoe UI"/>
+                <w:color w:val="000000"/>
+                <w:sz w:val="18"/>
+                <w:rtl w:val="off"/>
+                <w:lang w:val="en-US"/>
+              </w:rPr>
+              <w:t>{totalPlots}</w:t>
+            </w:r>
           </w:p>
         </w:tc>
       </w:tr>
@@ -1012,11 +1046,34 @@
           </w:tcPr>
           <w:p>
             <w:pPr>
-              <w:spacing w:after="0"/>
-              <w:rPr>
-                <w:rFonts w:asciiTheme="majorHAnsi" w:hAnsiTheme="majorHAnsi"/>
-              </w:rPr>
-            </w:pPr>
+              <w:framePr w:w="0" w:h="0" w:vAnchor="margin" w:hAnchor="text" w:x="0" w:y="0"/>
+              <w:pBdr>
+                <w:top w:val="none" w:sz="4" w:space="0"/>
+                <w:left w:val="none" w:sz="4" w:space="0"/>
+                <w:bottom w:val="none" w:sz="4" w:space="0"/>
+                <w:right w:val="none" w:sz="4" w:space="0"/>
+                <w:between w:val="none" w:sz="4" w:space="0"/>
+                <w:bar w:val="none" w:sz="4" w:space="0"/>
+              </w:pBdr>
+              <w:shd w:val="clear" w:fill="auto"/>
+              <w:bidi w:val="off"/>
+              <w:spacing w:before="0" w:after="0" w:line="240" w:lineRule="auto"/>
+              <w:ind w:left="0" w:right="0" w:firstLine="0"/>
+              <w:jc w:val="left"/>
+              <w:rPr>
+                <w:rFonts w:asciiTheme="majorHAnsi" w:hAnsiTheme="majorHAnsi"/>
+              </w:rPr>
+            </w:pPr>
+            <w:r>
+              <w:rPr>
+                <w:rFonts w:ascii="Segoe UI"/>
+                <w:color w:val="000000"/>
+                <w:sz w:val="18"/>
+                <w:rtl w:val="off"/>
+                <w:lang w:val="en-US"/>
+              </w:rPr>
+              <w:t>{futurePhaseAllowance}</w:t>
+            </w:r>
           </w:p>
         </w:tc>
       </w:tr>
@@ -1053,11 +1110,34 @@
           </w:tcPr>
           <w:p>
             <w:pPr>
-              <w:spacing w:after="0"/>
-              <w:rPr>
-                <w:rFonts w:asciiTheme="majorHAnsi" w:hAnsiTheme="majorHAnsi"/>
-              </w:rPr>
-            </w:pPr>
+              <w:framePr w:w="0" w:h="0" w:vAnchor="margin" w:hAnchor="text" w:x="0" w:y="0"/>
+              <w:pBdr>
+                <w:top w:val="none" w:sz="4" w:space="0"/>
+                <w:left w:val="none" w:sz="4" w:space="0"/>
+                <w:bottom w:val="none" w:sz="4" w:space="0"/>
+                <w:right w:val="none" w:sz="4" w:space="0"/>
+                <w:between w:val="none" w:sz="4" w:space="0"/>
+                <w:bar w:val="none" w:sz="4" w:space="0"/>
+              </w:pBdr>
+              <w:shd w:val="clear" w:fill="auto"/>
+              <w:bidi w:val="off"/>
+              <w:spacing w:before="0" w:after="0" w:line="240" w:lineRule="auto"/>
+              <w:ind w:left="0" w:right="0" w:firstLine="0"/>
+              <w:jc w:val="left"/>
+              <w:rPr>
+                <w:rFonts w:asciiTheme="majorHAnsi" w:hAnsiTheme="majorHAnsi"/>
+              </w:rPr>
+            </w:pPr>
+            <w:r>
+              <w:rPr>
+                <w:rFonts w:ascii="Segoe UI"/>
+                <w:color w:val="000000"/>
+                <w:sz w:val="18"/>
+                <w:rtl w:val="off"/>
+                <w:lang w:val="en-US"/>
+              </w:rPr>
+              <w:t>{totalLoadAllowance}</w:t>
+            </w:r>
           </w:p>
         </w:tc>
       </w:tr>
@@ -1094,11 +1174,34 @@
           </w:tcPr>
           <w:p>
             <w:pPr>
-              <w:spacing w:after="0"/>
-              <w:rPr>
-                <w:rFonts w:asciiTheme="majorHAnsi" w:hAnsiTheme="majorHAnsi"/>
-              </w:rPr>
-            </w:pPr>
+              <w:framePr w:w="0" w:h="0" w:vAnchor="margin" w:hAnchor="text" w:x="0" w:y="0"/>
+              <w:pBdr>
+                <w:top w:val="none" w:sz="4" w:space="0"/>
+                <w:left w:val="none" w:sz="4" w:space="0"/>
+                <w:bottom w:val="none" w:sz="4" w:space="0"/>
+                <w:right w:val="none" w:sz="4" w:space="0"/>
+                <w:between w:val="none" w:sz="4" w:space="0"/>
+                <w:bar w:val="none" w:sz="4" w:space="0"/>
+              </w:pBdr>
+              <w:shd w:val="clear" w:fill="auto"/>
+              <w:bidi w:val="off"/>
+              <w:spacing w:before="0" w:after="0" w:line="240" w:lineRule="auto"/>
+              <w:ind w:left="0" w:right="0" w:firstLine="0"/>
+              <w:jc w:val="left"/>
+              <w:rPr>
+                <w:rFonts w:asciiTheme="majorHAnsi" w:hAnsiTheme="majorHAnsi"/>
+              </w:rPr>
+            </w:pPr>
+            <w:r>
+              <w:rPr>
+                <w:rFonts w:ascii="Segoe UI"/>
+                <w:color w:val="000000"/>
+                <w:sz w:val="18"/>
+                <w:rtl w:val="off"/>
+                <w:lang w:val="en-US"/>
+              </w:rPr>
+              <w:t>{heatingType}</w:t>
+            </w:r>
           </w:p>
         </w:tc>
       </w:tr>
@@ -1135,11 +1238,34 @@
           </w:tcPr>
           <w:p>
             <w:pPr>
-              <w:spacing w:after="0"/>
-              <w:rPr>
-                <w:rFonts w:asciiTheme="majorHAnsi" w:hAnsiTheme="majorHAnsi"/>
-              </w:rPr>
-            </w:pPr>
+              <w:framePr w:w="0" w:h="0" w:vAnchor="margin" w:hAnchor="text" w:x="0" w:y="0"/>
+              <w:pBdr>
+                <w:top w:val="none" w:sz="4" w:space="0"/>
+                <w:left w:val="none" w:sz="4" w:space="0"/>
+                <w:bottom w:val="none" w:sz="4" w:space="0"/>
+                <w:right w:val="none" w:sz="4" w:space="0"/>
+                <w:between w:val="none" w:sz="4" w:space="0"/>
+                <w:bar w:val="none" w:sz="4" w:space="0"/>
+              </w:pBdr>
+              <w:shd w:val="clear" w:fill="auto"/>
+              <w:bidi w:val="off"/>
+              <w:spacing w:before="0" w:after="0" w:line="240" w:lineRule="auto"/>
+              <w:ind w:left="0" w:right="0" w:firstLine="0"/>
+              <w:jc w:val="left"/>
+              <w:rPr>
+                <w:rFonts w:asciiTheme="majorHAnsi" w:hAnsiTheme="majorHAnsi"/>
+              </w:rPr>
+            </w:pPr>
+            <w:r>
+              <w:rPr>
+                <w:rFonts w:ascii="Segoe UI"/>
+                <w:color w:val="000000"/>
+                <w:sz w:val="18"/>
+                <w:rtl w:val="off"/>
+                <w:lang w:val="en-US"/>
+              </w:rPr>
+              <w:t>{plotConnections}</w:t>
+            </w:r>
           </w:p>
         </w:tc>
       </w:tr>
@@ -1176,11 +1302,34 @@
           </w:tcPr>
           <w:p>
             <w:pPr>
-              <w:spacing w:after="0"/>
-              <w:rPr>
-                <w:rFonts w:asciiTheme="majorHAnsi" w:hAnsiTheme="majorHAnsi"/>
-              </w:rPr>
-            </w:pPr>
+              <w:framePr w:w="0" w:h="0" w:vAnchor="margin" w:hAnchor="text" w:x="0" w:y="0"/>
+              <w:pBdr>
+                <w:top w:val="none" w:sz="4" w:space="0"/>
+                <w:left w:val="none" w:sz="4" w:space="0"/>
+                <w:bottom w:val="none" w:sz="4" w:space="0"/>
+                <w:right w:val="none" w:sz="4" w:space="0"/>
+                <w:between w:val="none" w:sz="4" w:space="0"/>
+                <w:bar w:val="none" w:sz="4" w:space="0"/>
+              </w:pBdr>
+              <w:shd w:val="clear" w:fill="auto"/>
+              <w:bidi w:val="off"/>
+              <w:spacing w:before="0" w:after="0" w:line="240" w:lineRule="auto"/>
+              <w:ind w:left="0" w:right="0" w:firstLine="0"/>
+              <w:jc w:val="left"/>
+              <w:rPr>
+                <w:rFonts w:asciiTheme="majorHAnsi" w:hAnsiTheme="majorHAnsi"/>
+              </w:rPr>
+            </w:pPr>
+            <w:r>
+              <w:rPr>
+                <w:rFonts w:ascii="Segoe UI"/>
+                <w:color w:val="000000"/>
+                <w:sz w:val="18"/>
+                <w:rtl w:val="off"/>
+                <w:lang w:val="en-US"/>
+              </w:rPr>
+              <w:t>{meters}</w:t>
+            </w:r>
           </w:p>
         </w:tc>
       </w:tr>
@@ -1217,11 +1366,34 @@
           </w:tcPr>
           <w:p>
             <w:pPr>
-              <w:spacing w:after="0"/>
-              <w:rPr>
-                <w:rFonts w:asciiTheme="majorHAnsi" w:hAnsiTheme="majorHAnsi"/>
-              </w:rPr>
-            </w:pPr>
+              <w:framePr w:w="0" w:h="0" w:vAnchor="margin" w:hAnchor="text" w:x="0" w:y="0"/>
+              <w:pBdr>
+                <w:top w:val="none" w:sz="4" w:space="0"/>
+                <w:left w:val="none" w:sz="4" w:space="0"/>
+                <w:bottom w:val="none" w:sz="4" w:space="0"/>
+                <w:right w:val="none" w:sz="4" w:space="0"/>
+                <w:between w:val="none" w:sz="4" w:space="0"/>
+                <w:bar w:val="none" w:sz="4" w:space="0"/>
+              </w:pBdr>
+              <w:shd w:val="clear" w:fill="auto"/>
+              <w:bidi w:val="off"/>
+              <w:spacing w:before="0" w:after="0" w:line="240" w:lineRule="auto"/>
+              <w:ind w:left="0" w:right="0" w:firstLine="0"/>
+              <w:jc w:val="left"/>
+              <w:rPr>
+                <w:rFonts w:asciiTheme="majorHAnsi" w:hAnsiTheme="majorHAnsi"/>
+              </w:rPr>
+            </w:pPr>
+            <w:r>
+              <w:rPr>
+                <w:rFonts w:ascii="Segoe UI"/>
+                <w:color w:val="000000"/>
+                <w:sz w:val="18"/>
+                <w:rtl w:val="off"/>
+                <w:lang w:val="en-US"/>
+              </w:rPr>
+              <w:t>{electricConnectionVoltage}</w:t>
+            </w:r>
           </w:p>
         </w:tc>
       </w:tr>
@@ -1258,11 +1430,34 @@
           </w:tcPr>
           <w:p>
             <w:pPr>
-              <w:spacing w:after="0"/>
-              <w:rPr>
-                <w:rFonts w:asciiTheme="majorHAnsi" w:hAnsiTheme="majorHAnsi"/>
-              </w:rPr>
-            </w:pPr>
+              <w:framePr w:w="0" w:h="0" w:vAnchor="margin" w:hAnchor="text" w:x="0" w:y="0"/>
+              <w:pBdr>
+                <w:top w:val="none" w:sz="4" w:space="0"/>
+                <w:left w:val="none" w:sz="4" w:space="0"/>
+                <w:bottom w:val="none" w:sz="4" w:space="0"/>
+                <w:right w:val="none" w:sz="4" w:space="0"/>
+                <w:between w:val="none" w:sz="4" w:space="0"/>
+                <w:bar w:val="none" w:sz="4" w:space="0"/>
+              </w:pBdr>
+              <w:shd w:val="clear" w:fill="auto"/>
+              <w:bidi w:val="off"/>
+              <w:spacing w:before="0" w:after="0" w:line="240" w:lineRule="auto"/>
+              <w:ind w:left="0" w:right="0" w:firstLine="0"/>
+              <w:jc w:val="left"/>
+              <w:rPr>
+                <w:rFonts w:asciiTheme="majorHAnsi" w:hAnsiTheme="majorHAnsi"/>
+              </w:rPr>
+            </w:pPr>
+            <w:r>
+              <w:rPr>
+                <w:rFonts w:ascii="Segoe UI"/>
+                <w:color w:val="000000"/>
+                <w:sz w:val="18"/>
+                <w:rtl w:val="off"/>
+                <w:lang w:val="en-US"/>
+              </w:rPr>
+              <w:t>{waterMainType}</w:t>
+            </w:r>
           </w:p>
         </w:tc>
       </w:tr>
@@ -1315,11 +1510,34 @@
           </w:tcPr>
           <w:p>
             <w:pPr>
-              <w:spacing w:after="0"/>
-              <w:rPr>
-                <w:rFonts w:asciiTheme="majorHAnsi" w:hAnsiTheme="majorHAnsi"/>
-              </w:rPr>
-            </w:pPr>
+              <w:framePr w:w="0" w:h="0" w:vAnchor="margin" w:hAnchor="text" w:x="0" w:y="0"/>
+              <w:pBdr>
+                <w:top w:val="none" w:sz="4" w:space="0"/>
+                <w:left w:val="none" w:sz="4" w:space="0"/>
+                <w:bottom w:val="none" w:sz="4" w:space="0"/>
+                <w:right w:val="none" w:sz="4" w:space="0"/>
+                <w:between w:val="none" w:sz="4" w:space="0"/>
+                <w:bar w:val="none" w:sz="4" w:space="0"/>
+              </w:pBdr>
+              <w:shd w:val="clear" w:fill="auto"/>
+              <w:bidi w:val="off"/>
+              <w:spacing w:before="0" w:after="0" w:line="240" w:lineRule="auto"/>
+              <w:ind w:left="0" w:right="0" w:firstLine="0"/>
+              <w:jc w:val="left"/>
+              <w:rPr>
+                <w:rFonts w:asciiTheme="majorHAnsi" w:hAnsiTheme="majorHAnsi"/>
+              </w:rPr>
+            </w:pPr>
+            <w:r>
+              <w:rPr>
+                <w:rFonts w:ascii="Segoe UI"/>
+                <w:color w:val="000000"/>
+                <w:sz w:val="18"/>
+                <w:rtl w:val="off"/>
+                <w:lang w:val="en-US"/>
+              </w:rPr>
+              <w:t>{waterWasteSustainability}</w:t>
+            </w:r>
           </w:p>
         </w:tc>
       </w:tr>
@@ -1356,11 +1574,34 @@
           </w:tcPr>
           <w:p>
             <w:pPr>
-              <w:spacing w:after="0"/>
-              <w:rPr>
-                <w:rFonts w:asciiTheme="majorHAnsi" w:hAnsiTheme="majorHAnsi"/>
-              </w:rPr>
-            </w:pPr>
+              <w:framePr w:w="0" w:h="0" w:vAnchor="margin" w:hAnchor="text" w:x="0" w:y="0"/>
+              <w:pBdr>
+                <w:top w:val="none" w:sz="4" w:space="0"/>
+                <w:left w:val="none" w:sz="4" w:space="0"/>
+                <w:bottom w:val="none" w:sz="4" w:space="0"/>
+                <w:right w:val="none" w:sz="4" w:space="0"/>
+                <w:between w:val="none" w:sz="4" w:space="0"/>
+                <w:bar w:val="none" w:sz="4" w:space="0"/>
+              </w:pBdr>
+              <w:shd w:val="clear" w:fill="auto"/>
+              <w:bidi w:val="off"/>
+              <w:spacing w:before="0" w:after="0" w:line="240" w:lineRule="auto"/>
+              <w:ind w:left="0" w:right="0" w:firstLine="0"/>
+              <w:jc w:val="left"/>
+              <w:rPr>
+                <w:rFonts w:asciiTheme="majorHAnsi" w:hAnsiTheme="majorHAnsi"/>
+              </w:rPr>
+            </w:pPr>
+            <w:r>
+              <w:rPr>
+                <w:rFonts w:ascii="Segoe UI"/>
+                <w:color w:val="000000"/>
+                <w:sz w:val="18"/>
+                <w:rtl w:val="off"/>
+                <w:lang w:val="en-US"/>
+              </w:rPr>
+              <w:t>{mainsConnections}</w:t>
+            </w:r>
           </w:p>
         </w:tc>
       </w:tr>
@@ -8797,342 +9038,6 @@
       <w:pPr>
         <w:rPr>
           <w:rFonts w:asciiTheme="majorHAnsi" w:hAnsiTheme="majorHAnsi"/>
-        </w:rPr>
-      </w:pPr>
-    </w:p>
-    <w:p>
-      <w:pPr>
-        <w:rPr>
-          <w:rFonts w:asciiTheme="majorHAnsi" w:hAnsiTheme="majorHAnsi"/>
-        </w:rPr>
-      </w:pPr>
-    </w:p>
-    <w:p>
-      <w:pPr>
-        <w:rPr>
-          <w:rFonts w:asciiTheme="majorHAnsi" w:hAnsiTheme="majorHAnsi"/>
-          <w:b/>
-          <w:bCs/>
-        </w:rPr>
-      </w:pPr>
-      <w:r>
-        <w:rPr>
-          <w:rFonts w:asciiTheme="majorHAnsi" w:hAnsiTheme="majorHAnsi"/>
-          <w:b/>
-          <w:bCs/>
-          <w:color w:val="4b92d9" w:themeColor="text2" w:themeTint="80"/>
-        </w:rPr>
-        <w:t xml:space="preserve">SITE SPECIFIC CLARIFICATIONS </w:t>
-      </w:r>
-      <w:r>
-        <w:rPr>
-          <w:rFonts w:asciiTheme="majorHAnsi" w:hAnsiTheme="majorHAnsi"/>
-          <w:b/>
-          <w:bCs/>
-        </w:rPr>
-        <w:tab/>
-      </w:r>
-      <w:r>
-        <w:rPr>
-          <w:rFonts w:asciiTheme="majorHAnsi" w:hAnsiTheme="majorHAnsi"/>
-          <w:b/>
-          <w:bCs/>
-        </w:rPr>
-        <w:tab/>
-      </w:r>
-    </w:p>
-    <w:p>
-      <w:pPr>
-        <w:pStyle w:val="ListParagraph"/>
-        <w:numPr>
-          <w:ilvl w:val="0"/>
-          <w:numId w:val="1"/>
-        </w:numPr>
-        <w:rPr>
-          <w:rFonts w:asciiTheme="majorHAnsi" w:hAnsiTheme="majorHAnsi"/>
-        </w:rPr>
-      </w:pPr>
-      <w:r>
-        <w:rPr>
-          <w:rFonts w:asciiTheme="majorHAnsi" w:hAnsiTheme="majorHAnsi"/>
-        </w:rPr>
-        <w:t xml:space="preserve">Please note that unless stated, our tender price includes plat service material provision of; </w:t>
-      </w:r>
-      <w:r>
-        <w:rPr>
-          <w:rFonts w:asciiTheme="majorHAnsi" w:hAnsiTheme="majorHAnsi"/>
-          <w:b/>
-          <w:bCs/>
-        </w:rPr>
-        <w:t xml:space="preserve">electric meter boxes, </w:t>
-      </w:r>
-      <w:r>
-        <w:rPr>
-          <w:rFonts w:asciiTheme="majorHAnsi" w:hAnsiTheme="majorHAnsi"/>
-          <w:b/>
-          <w:bCs/>
-        </w:rPr>
-        <w:t>Atplas</w:t>
-      </w:r>
-      <w:r>
-        <w:rPr>
-          <w:rFonts w:asciiTheme="majorHAnsi" w:hAnsiTheme="majorHAnsi"/>
-          <w:b/>
-          <w:bCs/>
-        </w:rPr>
-        <w:t xml:space="preserve"> boxes, electric service ducting and hockey sticks. </w:t>
-      </w:r>
-      <w:r>
-        <w:rPr>
-          <w:rFonts w:asciiTheme="majorHAnsi" w:hAnsiTheme="majorHAnsi"/>
-        </w:rPr>
-        <w:t>Please</w:t>
-      </w:r>
-      <w:r>
-        <w:rPr>
-          <w:rFonts w:asciiTheme="majorHAnsi" w:hAnsiTheme="majorHAnsi"/>
-          <w:b/>
-          <w:bCs/>
-        </w:rPr>
-        <w:t xml:space="preserve"> </w:t>
-      </w:r>
-      <w:r>
-        <w:rPr>
-          <w:rFonts w:asciiTheme="majorHAnsi" w:hAnsiTheme="majorHAnsi"/>
-        </w:rPr>
-        <w:t>be</w:t>
-      </w:r>
-      <w:r>
-        <w:rPr>
-          <w:rFonts w:asciiTheme="majorHAnsi" w:hAnsiTheme="majorHAnsi"/>
-        </w:rPr>
-        <w:t xml:space="preserve"> </w:t>
-      </w:r>
-      <w:r>
-        <w:rPr>
-          <w:rFonts w:asciiTheme="majorHAnsi" w:hAnsiTheme="majorHAnsi"/>
-        </w:rPr>
-        <w:t>aware that</w:t>
-      </w:r>
-      <w:r>
-        <w:rPr>
-          <w:rFonts w:asciiTheme="majorHAnsi" w:hAnsiTheme="majorHAnsi"/>
-          <w:b/>
-          <w:bCs/>
-        </w:rPr>
-        <w:t xml:space="preserve"> </w:t>
-      </w:r>
-      <w:r>
-        <w:rPr>
-          <w:rFonts w:asciiTheme="majorHAnsi" w:hAnsiTheme="majorHAnsi"/>
-        </w:rPr>
-        <w:t xml:space="preserve">most of our competitors exclude all or some of these items, which amounts to approximately £150 per plot. We encourage you to consider this in your appraisal. Should you wish to provide this material yourselves, we can omit this and reduce our tender accordingly – Please see page 2. </w:t>
-      </w:r>
-    </w:p>
-    <w:p>
-      <w:pPr>
-        <w:pStyle w:val="ListParagraph"/>
-        <w:numPr>
-          <w:ilvl w:val="0"/>
-          <w:numId w:val="1"/>
-        </w:numPr>
-        <w:rPr>
-          <w:rFonts w:asciiTheme="majorHAnsi" w:hAnsiTheme="majorHAnsi"/>
-        </w:rPr>
-      </w:pPr>
-      <w:r>
-        <w:rPr>
-          <w:rFonts w:asciiTheme="majorHAnsi" w:hAnsiTheme="majorHAnsi"/>
-        </w:rPr>
-        <w:t xml:space="preserve">We have assumed that the surface within the redline boundary provided by the client consists of unmade ground. Accordingly, it is understood that all excavation and backfilling within this area will be the responsibility of the client. </w:t>
-      </w:r>
-    </w:p>
-    <w:p>
-      <w:pPr>
-        <w:pStyle w:val="ListParagraph"/>
-        <w:numPr>
-          <w:ilvl w:val="0"/>
-          <w:numId w:val="1"/>
-        </w:numPr>
-        <w:rPr>
-          <w:rFonts w:asciiTheme="majorHAnsi" w:hAnsiTheme="majorHAnsi"/>
-        </w:rPr>
-      </w:pPr>
-      <w:r>
-        <w:rPr>
-          <w:rFonts w:asciiTheme="majorHAnsi" w:hAnsiTheme="majorHAnsi"/>
-        </w:rPr>
-        <w:t xml:space="preserve">This tender is based upon the first connection being made in the area shown below via a single entrance. Should this deviate, please advise, as a review of the payment profile will be required </w:t>
-      </w:r>
-    </w:p>
-    <w:p>
-      <w:pPr>
-        <w:ind w:left="360"/>
-        <w:rPr>
-          <w:rFonts w:asciiTheme="majorHAnsi" w:hAnsiTheme="majorHAnsi"/>
-        </w:rPr>
-      </w:pPr>
-    </w:p>
-    <w:p>
-      <w:pPr>
-        <w:ind w:left="360"/>
-        <w:rPr>
-          <w:rFonts w:asciiTheme="majorHAnsi" w:hAnsiTheme="majorHAnsi"/>
-        </w:rPr>
-      </w:pPr>
-      <w:r>
-        <w:rPr>
-          <w:rFonts w:asciiTheme="majorHAnsi" w:hAnsiTheme="majorHAnsi"/>
-          <w:highlight w:val="yellow"/>
-        </w:rPr>
-        <w:t>Add image/drawing</w:t>
-      </w:r>
-    </w:p>
-    <w:p>
-      <w:pPr>
-        <w:ind w:left="360"/>
-        <w:rPr>
-          <w:rFonts w:asciiTheme="majorHAnsi" w:hAnsiTheme="majorHAnsi"/>
-        </w:rPr>
-      </w:pPr>
-    </w:p>
-    <w:p>
-      <w:pPr>
-        <w:rPr>
-          <w:rFonts w:asciiTheme="majorHAnsi" w:hAnsiTheme="majorHAnsi"/>
-        </w:rPr>
-      </w:pPr>
-    </w:p>
-    <w:p>
-      <w:pPr>
-        <w:rPr>
-          <w:rFonts w:asciiTheme="majorHAnsi" w:hAnsiTheme="majorHAnsi"/>
-        </w:rPr>
-      </w:pPr>
-    </w:p>
-    <w:p>
-      <w:pPr>
-        <w:rPr>
-          <w:rFonts w:asciiTheme="majorHAnsi" w:hAnsiTheme="majorHAnsi"/>
-        </w:rPr>
-      </w:pPr>
-    </w:p>
-    <w:p>
-      <w:pPr>
-        <w:rPr>
-          <w:rFonts w:asciiTheme="majorHAnsi" w:hAnsiTheme="majorHAnsi"/>
-        </w:rPr>
-      </w:pPr>
-    </w:p>
-    <w:p>
-      <w:pPr>
-        <w:rPr>
-          <w:rFonts w:asciiTheme="majorHAnsi" w:hAnsiTheme="majorHAnsi"/>
-        </w:rPr>
-      </w:pPr>
-    </w:p>
-    <w:p>
-      <w:pPr>
-        <w:rPr>
-          <w:rFonts w:asciiTheme="majorHAnsi" w:hAnsiTheme="majorHAnsi"/>
-        </w:rPr>
-      </w:pPr>
-    </w:p>
-    <w:p>
-      <w:pPr>
-        <w:rPr>
-          <w:rFonts w:asciiTheme="majorHAnsi" w:hAnsiTheme="majorHAnsi"/>
-        </w:rPr>
-      </w:pPr>
-    </w:p>
-    <w:p>
-      <w:pPr>
-        <w:rPr>
-          <w:rFonts w:asciiTheme="majorHAnsi" w:hAnsiTheme="majorHAnsi"/>
-        </w:rPr>
-      </w:pPr>
-    </w:p>
-    <w:p>
-      <w:pPr>
-        <w:rPr>
-          <w:rFonts w:asciiTheme="majorHAnsi" w:hAnsiTheme="majorHAnsi"/>
-        </w:rPr>
-      </w:pPr>
-    </w:p>
-    <w:p>
-      <w:pPr>
-        <w:rPr>
-          <w:rFonts w:asciiTheme="majorHAnsi" w:hAnsiTheme="majorHAnsi"/>
-        </w:rPr>
-      </w:pPr>
-    </w:p>
-    <w:p>
-      <w:pPr>
-        <w:rPr>
-          <w:rFonts w:asciiTheme="majorHAnsi" w:hAnsiTheme="majorHAnsi"/>
-        </w:rPr>
-      </w:pPr>
-    </w:p>
-    <w:p>
-      <w:pPr>
-        <w:rPr>
-          <w:rFonts w:asciiTheme="majorHAnsi" w:hAnsiTheme="majorHAnsi"/>
-        </w:rPr>
-      </w:pPr>
-    </w:p>
-    <w:p>
-      <w:pPr>
-        <w:rPr>
-          <w:rFonts w:asciiTheme="majorHAnsi" w:hAnsiTheme="majorHAnsi"/>
-        </w:rPr>
-      </w:pPr>
-    </w:p>
-    <w:p>
-      <w:pPr>
-        <w:rPr>
-          <w:rFonts w:asciiTheme="majorHAnsi" w:hAnsiTheme="majorHAnsi"/>
-        </w:rPr>
-      </w:pPr>
-    </w:p>
-    <w:p>
-      <w:pPr>
-        <w:rPr>
-          <w:rFonts w:asciiTheme="majorHAnsi" w:hAnsiTheme="majorHAnsi"/>
-        </w:rPr>
-      </w:pPr>
-    </w:p>
-    <w:p>
-      <w:pPr>
-        <w:rPr>
-          <w:rFonts w:asciiTheme="majorHAnsi" w:hAnsiTheme="majorHAnsi"/>
-        </w:rPr>
-      </w:pPr>
-    </w:p>
-    <w:p>
-      <w:pPr>
-        <w:rPr>
-          <w:rFonts w:asciiTheme="majorHAnsi" w:hAnsiTheme="majorHAnsi"/>
-        </w:rPr>
-      </w:pPr>
-    </w:p>
-    <w:p>
-      <w:pPr>
-        <w:rPr>
-          <w:rFonts w:asciiTheme="majorHAnsi" w:hAnsiTheme="majorHAnsi"/>
-        </w:rPr>
-      </w:pPr>
-    </w:p>
-    <w:p>
-      <w:pPr>
-        <w:rPr>
-          <w:rFonts w:asciiTheme="majorHAnsi" w:hAnsiTheme="majorHAnsi"/>
-        </w:rPr>
-      </w:pPr>
-    </w:p>
-    <w:p>
-      <w:pPr>
-        <w:rPr>
-          <w:rFonts w:asciiTheme="majorHAnsi" w:hAnsiTheme="majorHAnsi"/>
           <w:b/>
           <w:bCs/>
           <w:color w:val="45b1e1" w:themeColor="accent1" w:themeTint="99"/>
@@ -9188,7 +9093,7 @@
       </w:tblPr>
       <w:tblGrid>
         <w:gridCol w:w="4248"/>
-        <w:gridCol w:w="2126"/>
+        <w:gridCol w:w="2223"/>
       </w:tblGrid>
       <w:tr>
         <w:trPr/>
@@ -9219,17 +9124,33 @@
           </w:tcPr>
           <w:p>
             <w:pPr>
-              <w:spacing w:after="0"/>
-              <w:rPr>
-                <w:rFonts w:asciiTheme="majorHAnsi" w:hAnsiTheme="majorHAnsi"/>
-              </w:rPr>
-            </w:pPr>
-            <w:r>
-              <w:rPr>
-                <w:rFonts w:asciiTheme="majorHAnsi" w:hAnsiTheme="majorHAnsi"/>
-                <w:highlight w:val="yellow"/>
-              </w:rPr>
-              <w:t>xxxx</w:t>
+              <w:framePr w:w="0" w:h="0" w:vAnchor="margin" w:hAnchor="text" w:x="0" w:y="0"/>
+              <w:pBdr>
+                <w:top w:val="none" w:sz="4" w:space="0"/>
+                <w:left w:val="none" w:sz="4" w:space="0"/>
+                <w:bottom w:val="none" w:sz="4" w:space="0"/>
+                <w:right w:val="none" w:sz="4" w:space="0"/>
+                <w:between w:val="none" w:sz="4" w:space="0"/>
+                <w:bar w:val="none" w:sz="4" w:space="0"/>
+              </w:pBdr>
+              <w:shd w:val="clear" w:fill="auto"/>
+              <w:bidi w:val="off"/>
+              <w:spacing w:before="0" w:after="0" w:line="240" w:lineRule="auto"/>
+              <w:ind w:left="0" w:right="0" w:firstLine="0"/>
+              <w:jc w:val="left"/>
+              <w:rPr>
+                <w:rFonts w:asciiTheme="majorHAnsi" w:hAnsiTheme="majorHAnsi"/>
+              </w:rPr>
+            </w:pPr>
+            <w:r>
+              <w:rPr>
+                <w:rFonts w:ascii="Segoe UI"/>
+                <w:color w:val="000000"/>
+                <w:sz w:val="18"/>
+                <w:rtl w:val="off"/>
+                <w:lang w:val="en-US"/>
+              </w:rPr>
+              <w:t>{ashpNumPlots}</w:t>
             </w:r>
           </w:p>
         </w:tc>
@@ -9263,7 +9184,20 @@
           </w:tcPr>
           <w:p>
             <w:pPr>
-              <w:spacing w:after="0"/>
+              <w:framePr w:w="0" w:h="0" w:vAnchor="margin" w:hAnchor="text" w:x="0" w:y="0"/>
+              <w:pBdr>
+                <w:top w:val="none" w:sz="4" w:space="0"/>
+                <w:left w:val="none" w:sz="4" w:space="0"/>
+                <w:bottom w:val="none" w:sz="4" w:space="0"/>
+                <w:right w:val="none" w:sz="4" w:space="0"/>
+                <w:between w:val="none" w:sz="4" w:space="0"/>
+                <w:bar w:val="none" w:sz="4" w:space="0"/>
+              </w:pBdr>
+              <w:shd w:val="clear" w:fill="auto"/>
+              <w:bidi w:val="off"/>
+              <w:spacing w:before="0" w:after="0" w:line="240" w:lineRule="auto"/>
+              <w:ind w:left="0" w:right="0" w:firstLine="0"/>
+              <w:jc w:val="left"/>
               <w:rPr>
                 <w:rFonts w:asciiTheme="majorHAnsi" w:hAnsiTheme="majorHAnsi"/>
                 <w:highlight w:val="yellow"/>
@@ -9271,10 +9205,13 @@
             </w:pPr>
             <w:r>
               <w:rPr>
-                <w:rFonts w:asciiTheme="majorHAnsi" w:hAnsiTheme="majorHAnsi"/>
-                <w:highlight w:val="yellow"/>
-              </w:rPr>
-              <w:t>xxxx</w:t>
+                <w:rFonts w:ascii="Segoe UI"/>
+                <w:color w:val="000000"/>
+                <w:sz w:val="18"/>
+                <w:rtl w:val="off"/>
+                <w:lang w:val="en-US"/>
+              </w:rPr>
+              <w:t>{ashpPlotNumbers}</w:t>
             </w:r>
           </w:p>
         </w:tc>
@@ -9308,7 +9245,20 @@
           </w:tcPr>
           <w:p>
             <w:pPr>
-              <w:spacing w:after="0"/>
+              <w:framePr w:w="0" w:h="0" w:vAnchor="margin" w:hAnchor="text" w:x="0" w:y="0"/>
+              <w:pBdr>
+                <w:top w:val="none" w:sz="4" w:space="0"/>
+                <w:left w:val="none" w:sz="4" w:space="0"/>
+                <w:bottom w:val="none" w:sz="4" w:space="0"/>
+                <w:right w:val="none" w:sz="4" w:space="0"/>
+                <w:between w:val="none" w:sz="4" w:space="0"/>
+                <w:bar w:val="none" w:sz="4" w:space="0"/>
+              </w:pBdr>
+              <w:shd w:val="clear" w:fill="auto"/>
+              <w:bidi w:val="off"/>
+              <w:spacing w:before="0" w:after="0" w:line="240" w:lineRule="auto"/>
+              <w:ind w:left="0" w:right="0" w:firstLine="0"/>
+              <w:jc w:val="left"/>
               <w:rPr>
                 <w:rFonts w:asciiTheme="majorHAnsi" w:hAnsiTheme="majorHAnsi"/>
                 <w:highlight w:val="yellow"/>
@@ -9316,10 +9266,13 @@
             </w:pPr>
             <w:r>
               <w:rPr>
-                <w:rFonts w:asciiTheme="majorHAnsi" w:hAnsiTheme="majorHAnsi"/>
-                <w:highlight w:val="yellow"/>
-              </w:rPr>
-              <w:t>xxxx</w:t>
+                <w:rFonts w:ascii="Segoe UI"/>
+                <w:color w:val="000000"/>
+                <w:sz w:val="18"/>
+                <w:rtl w:val="off"/>
+                <w:lang w:val="en-US"/>
+              </w:rPr>
+              <w:t>{ashpDataSheetProvided}</w:t>
             </w:r>
           </w:p>
         </w:tc>
@@ -9353,7 +9306,20 @@
           </w:tcPr>
           <w:p>
             <w:pPr>
-              <w:spacing w:after="0"/>
+              <w:framePr w:w="0" w:h="0" w:vAnchor="margin" w:hAnchor="text" w:x="0" w:y="0"/>
+              <w:pBdr>
+                <w:top w:val="none" w:sz="4" w:space="0"/>
+                <w:left w:val="none" w:sz="4" w:space="0"/>
+                <w:bottom w:val="none" w:sz="4" w:space="0"/>
+                <w:right w:val="none" w:sz="4" w:space="0"/>
+                <w:between w:val="none" w:sz="4" w:space="0"/>
+                <w:bar w:val="none" w:sz="4" w:space="0"/>
+              </w:pBdr>
+              <w:shd w:val="clear" w:fill="auto"/>
+              <w:bidi w:val="off"/>
+              <w:spacing w:before="0" w:after="0" w:line="240" w:lineRule="auto"/>
+              <w:ind w:left="0" w:right="0" w:firstLine="0"/>
+              <w:jc w:val="left"/>
               <w:rPr>
                 <w:rFonts w:asciiTheme="majorHAnsi" w:hAnsiTheme="majorHAnsi"/>
                 <w:highlight w:val="yellow"/>
@@ -9361,10 +9327,13 @@
             </w:pPr>
             <w:r>
               <w:rPr>
-                <w:rFonts w:asciiTheme="majorHAnsi" w:hAnsiTheme="majorHAnsi"/>
-                <w:highlight w:val="yellow"/>
-              </w:rPr>
-              <w:t>xxxx</w:t>
+                <w:rFonts w:ascii="Segoe UI"/>
+                <w:color w:val="000000"/>
+                <w:sz w:val="18"/>
+                <w:rtl w:val="off"/>
+                <w:lang w:val="en-US"/>
+              </w:rPr>
+              <w:t>{ashpPumpModel}</w:t>
             </w:r>
           </w:p>
         </w:tc>
@@ -9398,7 +9367,23 @@
           </w:tcPr>
           <w:p>
             <w:pPr>
-              <w:spacing w:after="0"/>
+              <w:framePr w:w="0" w:h="0" w:vAnchor="margin" w:hAnchor="text" w:x="0" w:y="0"/>
+              <w:pBdr>
+                <w:top w:val="none" w:sz="4" w:space="0"/>
+                <w:left w:val="none" w:sz="4" w:space="0"/>
+                <w:bottom w:val="none" w:sz="4" w:space="0"/>
+                <w:right w:val="none" w:sz="4" w:space="0"/>
+                <w:between w:val="none" w:sz="4" w:space="0"/>
+                <w:bar w:val="none" w:sz="4" w:space="0"/>
+              </w:pBdr>
+              <w:shd w:val="clear" w:fill="auto"/>
+              <w:tabs>
+                <w:tab w:val="left" w:pos="720"/>
+              </w:tabs>
+              <w:bidi w:val="off"/>
+              <w:spacing w:before="0" w:after="0" w:line="240" w:lineRule="auto"/>
+              <w:ind w:right="0"/>
+              <w:jc w:val="left"/>
               <w:rPr>
                 <w:rFonts w:asciiTheme="majorHAnsi" w:hAnsiTheme="majorHAnsi"/>
                 <w:highlight w:val="yellow"/>
@@ -9406,10 +9391,13 @@
             </w:pPr>
             <w:r>
               <w:rPr>
-                <w:rFonts w:asciiTheme="majorHAnsi" w:hAnsiTheme="majorHAnsi"/>
-                <w:highlight w:val="yellow"/>
-              </w:rPr>
-              <w:t>xxxx</w:t>
+                <w:rFonts w:ascii="Segoe UI"/>
+                <w:color w:val="000000"/>
+                <w:sz w:val="18"/>
+                <w:rtl w:val="off"/>
+                <w:lang w:val="en-US"/>
+              </w:rPr>
+              <w:t>{ashpNumPlots}</w:t>
             </w:r>
           </w:p>
         </w:tc>
@@ -9460,7 +9448,7 @@
       </w:tblPr>
       <w:tblGrid>
         <w:gridCol w:w="4248"/>
-        <w:gridCol w:w="2126"/>
+        <w:gridCol w:w="2410"/>
       </w:tblGrid>
       <w:tr>
         <w:trPr/>
@@ -9542,17 +9530,33 @@
           </w:tcPr>
           <w:p>
             <w:pPr>
-              <w:spacing w:after="0"/>
-              <w:rPr>
-                <w:rFonts w:asciiTheme="majorHAnsi" w:hAnsiTheme="majorHAnsi"/>
-              </w:rPr>
-            </w:pPr>
-            <w:r>
-              <w:rPr>
-                <w:rFonts w:asciiTheme="majorHAnsi" w:hAnsiTheme="majorHAnsi"/>
-                <w:highlight w:val="yellow"/>
-              </w:rPr>
-              <w:t>xxxx</w:t>
+              <w:framePr w:w="0" w:h="0" w:vAnchor="margin" w:hAnchor="text" w:x="0" w:y="0"/>
+              <w:pBdr>
+                <w:top w:val="none" w:sz="4" w:space="0"/>
+                <w:left w:val="none" w:sz="4" w:space="0"/>
+                <w:bottom w:val="none" w:sz="4" w:space="0"/>
+                <w:right w:val="none" w:sz="4" w:space="0"/>
+                <w:between w:val="none" w:sz="4" w:space="0"/>
+                <w:bar w:val="none" w:sz="4" w:space="0"/>
+              </w:pBdr>
+              <w:shd w:val="clear" w:fill="auto"/>
+              <w:bidi w:val="off"/>
+              <w:spacing w:before="0" w:after="0" w:line="240" w:lineRule="auto"/>
+              <w:ind w:left="0" w:right="0" w:firstLine="0"/>
+              <w:jc w:val="left"/>
+              <w:rPr>
+                <w:rFonts w:asciiTheme="majorHAnsi" w:hAnsiTheme="majorHAnsi"/>
+              </w:rPr>
+            </w:pPr>
+            <w:r>
+              <w:rPr>
+                <w:rFonts w:ascii="Segoe UI"/>
+                <w:color w:val="000000"/>
+                <w:sz w:val="18"/>
+                <w:rtl w:val="off"/>
+                <w:lang w:val="en-US"/>
+              </w:rPr>
+              <w:t>{electricPOC}</w:t>
             </w:r>
           </w:p>
         </w:tc>
@@ -9586,18 +9590,45 @@
           </w:tcPr>
           <w:p>
             <w:pPr>
-              <w:spacing w:after="0"/>
-              <w:rPr>
-                <w:rFonts w:asciiTheme="majorHAnsi" w:hAnsiTheme="majorHAnsi"/>
-              </w:rPr>
-            </w:pPr>
-            <w:r>
-              <w:rPr>
-                <w:rFonts w:asciiTheme="majorHAnsi" w:hAnsiTheme="majorHAnsi"/>
-                <w:highlight w:val="yellow"/>
-              </w:rPr>
-              <w:t>xxxx</w:t>
-            </w:r>
+              <w:framePr w:w="0" w:h="0" w:vAnchor="margin" w:hAnchor="text" w:x="0" w:y="0"/>
+              <w:pBdr>
+                <w:top w:val="none" w:sz="4" w:space="0"/>
+                <w:left w:val="none" w:sz="4" w:space="0"/>
+                <w:bottom w:val="none" w:sz="4" w:space="0"/>
+                <w:right w:val="none" w:sz="4" w:space="0"/>
+                <w:between w:val="none" w:sz="4" w:space="0"/>
+                <w:bar w:val="none" w:sz="4" w:space="0"/>
+              </w:pBdr>
+              <w:shd w:val="clear" w:fill="auto"/>
+              <w:bidi w:val="off"/>
+              <w:spacing w:before="0" w:after="0" w:line="240" w:lineRule="auto"/>
+              <w:ind w:left="0" w:right="0" w:firstLine="0"/>
+              <w:jc w:val="left"/>
+              <w:rPr>
+                <w:rFonts w:ascii="Segoe UI"/>
+                <w:color w:val="000000"/>
+                <w:sz w:val="18"/>
+                <w:lang w:val="en-US"/>
+              </w:rPr>
+            </w:pPr>
+            <w:r>
+              <w:rPr>
+                <w:rFonts w:ascii="Segoe UI"/>
+                <w:color w:val="000000"/>
+                <w:sz w:val="18"/>
+                <w:rtl w:val="off"/>
+                <w:lang w:val="en-US"/>
+              </w:rPr>
+              <w:t>{waterPOCIncumbent}</w:t>
+            </w:r>
+          </w:p>
+          <w:p>
+            <w:pPr>
+              <w:spacing w:after="0"/>
+              <w:rPr>
+                <w:rFonts w:asciiTheme="majorHAnsi" w:hAnsiTheme="majorHAnsi"/>
+              </w:rPr>
+            </w:pPr>
           </w:p>
         </w:tc>
       </w:tr>
@@ -9630,17 +9661,33 @@
           </w:tcPr>
           <w:p>
             <w:pPr>
-              <w:spacing w:after="0"/>
-              <w:rPr>
-                <w:rFonts w:asciiTheme="majorHAnsi" w:hAnsiTheme="majorHAnsi"/>
-              </w:rPr>
-            </w:pPr>
-            <w:r>
-              <w:rPr>
-                <w:rFonts w:asciiTheme="majorHAnsi" w:hAnsiTheme="majorHAnsi"/>
-                <w:highlight w:val="yellow"/>
-              </w:rPr>
-              <w:t>xxxx</w:t>
+              <w:framePr w:w="0" w:h="0" w:vAnchor="margin" w:hAnchor="text" w:x="0" w:y="0"/>
+              <w:pBdr>
+                <w:top w:val="none" w:sz="4" w:space="0"/>
+                <w:left w:val="none" w:sz="4" w:space="0"/>
+                <w:bottom w:val="none" w:sz="4" w:space="0"/>
+                <w:right w:val="none" w:sz="4" w:space="0"/>
+                <w:between w:val="none" w:sz="4" w:space="0"/>
+                <w:bar w:val="none" w:sz="4" w:space="0"/>
+              </w:pBdr>
+              <w:shd w:val="clear" w:fill="auto"/>
+              <w:bidi w:val="off"/>
+              <w:spacing w:before="0" w:after="0" w:line="240" w:lineRule="auto"/>
+              <w:ind w:left="0" w:right="0" w:firstLine="0"/>
+              <w:jc w:val="left"/>
+              <w:rPr>
+                <w:rFonts w:asciiTheme="majorHAnsi" w:hAnsiTheme="majorHAnsi"/>
+              </w:rPr>
+            </w:pPr>
+            <w:r>
+              <w:rPr>
+                <w:rFonts w:ascii="Segoe UI"/>
+                <w:color w:val="000000"/>
+                <w:sz w:val="18"/>
+                <w:rtl w:val="off"/>
+                <w:lang w:val="en-US"/>
+              </w:rPr>
+              <w:t>{waterInfraFees}</w:t>
             </w:r>
           </w:p>
         </w:tc>
@@ -9674,17 +9721,36 @@
           </w:tcPr>
           <w:p>
             <w:pPr>
-              <w:spacing w:after="0"/>
-              <w:rPr>
-                <w:rFonts w:asciiTheme="majorHAnsi" w:hAnsiTheme="majorHAnsi"/>
-              </w:rPr>
-            </w:pPr>
-            <w:r>
-              <w:rPr>
-                <w:rFonts w:asciiTheme="majorHAnsi" w:hAnsiTheme="majorHAnsi"/>
-                <w:highlight w:val="yellow"/>
-              </w:rPr>
-              <w:t>xxxx</w:t>
+              <w:framePr w:w="0" w:h="0" w:vAnchor="margin" w:hAnchor="text" w:x="0" w:y="0"/>
+              <w:pBdr>
+                <w:top w:val="none" w:sz="4" w:space="0"/>
+                <w:left w:val="none" w:sz="4" w:space="0"/>
+                <w:bottom w:val="none" w:sz="4" w:space="0"/>
+                <w:right w:val="none" w:sz="4" w:space="0"/>
+                <w:between w:val="none" w:sz="4" w:space="0"/>
+                <w:bar w:val="none" w:sz="4" w:space="0"/>
+              </w:pBdr>
+              <w:shd w:val="clear" w:fill="auto"/>
+              <w:tabs>
+                <w:tab w:val="left" w:pos="720"/>
+              </w:tabs>
+              <w:bidi w:val="off"/>
+              <w:spacing w:before="0" w:after="0" w:line="240" w:lineRule="auto"/>
+              <w:ind w:right="0"/>
+              <w:jc w:val="left"/>
+              <w:rPr>
+                <w:rFonts w:asciiTheme="majorHAnsi" w:hAnsiTheme="majorHAnsi"/>
+              </w:rPr>
+            </w:pPr>
+            <w:r>
+              <w:rPr>
+                <w:rFonts w:ascii="Segoe UI"/>
+                <w:color w:val="000000"/>
+                <w:sz w:val="18"/>
+                <w:rtl w:val="off"/>
+                <w:lang w:val="en-US"/>
+              </w:rPr>
+              <w:t>{wasteWaterInfraFees}</w:t>
             </w:r>
           </w:p>
         </w:tc>
@@ -9718,17 +9784,36 @@
           </w:tcPr>
           <w:p>
             <w:pPr>
-              <w:spacing w:after="0"/>
-              <w:rPr>
-                <w:rFonts w:asciiTheme="majorHAnsi" w:hAnsiTheme="majorHAnsi"/>
-              </w:rPr>
-            </w:pPr>
-            <w:r>
-              <w:rPr>
-                <w:rFonts w:asciiTheme="majorHAnsi" w:hAnsiTheme="majorHAnsi"/>
-                <w:highlight w:val="yellow"/>
-              </w:rPr>
-              <w:t>xxxx</w:t>
+              <w:framePr w:w="0" w:h="0" w:vAnchor="margin" w:hAnchor="text" w:x="0" w:y="0"/>
+              <w:pBdr>
+                <w:top w:val="none" w:sz="4" w:space="0"/>
+                <w:left w:val="none" w:sz="4" w:space="0"/>
+                <w:bottom w:val="none" w:sz="4" w:space="0"/>
+                <w:right w:val="none" w:sz="4" w:space="0"/>
+                <w:between w:val="none" w:sz="4" w:space="0"/>
+                <w:bar w:val="none" w:sz="4" w:space="0"/>
+              </w:pBdr>
+              <w:shd w:val="clear" w:fill="auto"/>
+              <w:tabs>
+                <w:tab w:val="left" w:pos="720"/>
+              </w:tabs>
+              <w:bidi w:val="off"/>
+              <w:spacing w:before="0" w:after="0" w:line="240" w:lineRule="auto"/>
+              <w:ind w:right="0"/>
+              <w:jc w:val="left"/>
+              <w:rPr>
+                <w:rFonts w:asciiTheme="majorHAnsi" w:hAnsiTheme="majorHAnsi"/>
+              </w:rPr>
+            </w:pPr>
+            <w:r>
+              <w:rPr>
+                <w:rFonts w:ascii="Segoe UI"/>
+                <w:color w:val="000000"/>
+                <w:sz w:val="18"/>
+                <w:rtl w:val="off"/>
+                <w:lang w:val="en-US"/>
+              </w:rPr>
+              <w:t>{environmentalComponent}</w:t>
             </w:r>
           </w:p>
         </w:tc>
@@ -9762,17 +9847,36 @@
           </w:tcPr>
           <w:p>
             <w:pPr>
-              <w:spacing w:after="0"/>
-              <w:rPr>
-                <w:rFonts w:asciiTheme="majorHAnsi" w:hAnsiTheme="majorHAnsi"/>
-              </w:rPr>
-            </w:pPr>
-            <w:r>
-              <w:rPr>
-                <w:rFonts w:asciiTheme="majorHAnsi" w:hAnsiTheme="majorHAnsi"/>
-                <w:highlight w:val="yellow"/>
-              </w:rPr>
-              <w:t>xxxx</w:t>
+              <w:framePr w:w="0" w:h="0" w:vAnchor="margin" w:hAnchor="text" w:x="0" w:y="0"/>
+              <w:pBdr>
+                <w:top w:val="none" w:sz="4" w:space="0"/>
+                <w:left w:val="none" w:sz="4" w:space="0"/>
+                <w:bottom w:val="none" w:sz="4" w:space="0"/>
+                <w:right w:val="none" w:sz="4" w:space="0"/>
+                <w:between w:val="none" w:sz="4" w:space="0"/>
+                <w:bar w:val="none" w:sz="4" w:space="0"/>
+              </w:pBdr>
+              <w:shd w:val="clear" w:fill="auto"/>
+              <w:tabs>
+                <w:tab w:val="left" w:pos="720"/>
+              </w:tabs>
+              <w:bidi w:val="off"/>
+              <w:spacing w:before="0" w:after="0" w:line="240" w:lineRule="auto"/>
+              <w:ind w:right="0"/>
+              <w:jc w:val="left"/>
+              <w:rPr>
+                <w:rFonts w:asciiTheme="majorHAnsi" w:hAnsiTheme="majorHAnsi"/>
+              </w:rPr>
+            </w:pPr>
+            <w:r>
+              <w:rPr>
+                <w:rFonts w:ascii="Segoe UI"/>
+                <w:color w:val="000000"/>
+                <w:sz w:val="18"/>
+                <w:rtl w:val="off"/>
+                <w:lang w:val="en-US"/>
+              </w:rPr>
+              <w:t>{meterAdminCharges}</w:t>
             </w:r>
           </w:p>
         </w:tc>
@@ -9795,7 +9899,7 @@
               <w:rPr>
                 <w:rFonts w:asciiTheme="majorHAnsi" w:hAnsiTheme="majorHAnsi"/>
               </w:rPr>
-              <w:t xml:space="preserve">Unted utilities approval fee </w:t>
+              <w:t xml:space="preserve">United utilities approval fee </w:t>
             </w:r>
           </w:p>
         </w:tc>
@@ -9806,17 +9910,36 @@
           </w:tcPr>
           <w:p>
             <w:pPr>
-              <w:spacing w:after="0"/>
-              <w:rPr>
-                <w:rFonts w:asciiTheme="majorHAnsi" w:hAnsiTheme="majorHAnsi"/>
-              </w:rPr>
-            </w:pPr>
-            <w:r>
-              <w:rPr>
-                <w:rFonts w:asciiTheme="majorHAnsi" w:hAnsiTheme="majorHAnsi"/>
-                <w:highlight w:val="yellow"/>
-              </w:rPr>
-              <w:t>xxxx</w:t>
+              <w:framePr w:w="0" w:h="0" w:vAnchor="margin" w:hAnchor="text" w:x="0" w:y="0"/>
+              <w:pBdr>
+                <w:top w:val="none" w:sz="4" w:space="0"/>
+                <w:left w:val="none" w:sz="4" w:space="0"/>
+                <w:bottom w:val="none" w:sz="4" w:space="0"/>
+                <w:right w:val="none" w:sz="4" w:space="0"/>
+                <w:between w:val="none" w:sz="4" w:space="0"/>
+                <w:bar w:val="none" w:sz="4" w:space="0"/>
+              </w:pBdr>
+              <w:shd w:val="clear" w:fill="auto"/>
+              <w:tabs>
+                <w:tab w:val="left" w:pos="720"/>
+              </w:tabs>
+              <w:bidi w:val="off"/>
+              <w:spacing w:before="0" w:after="0" w:line="240" w:lineRule="auto"/>
+              <w:ind w:right="0"/>
+              <w:jc w:val="left"/>
+              <w:rPr>
+                <w:rFonts w:asciiTheme="majorHAnsi" w:hAnsiTheme="majorHAnsi"/>
+              </w:rPr>
+            </w:pPr>
+            <w:r>
+              <w:rPr>
+                <w:rFonts w:ascii="Segoe UI"/>
+                <w:color w:val="000000"/>
+                <w:sz w:val="18"/>
+                <w:rtl w:val="off"/>
+                <w:lang w:val="en-US"/>
+              </w:rPr>
+              <w:t>{uuApprovalFee}</w:t>
             </w:r>
           </w:p>
         </w:tc>
@@ -9850,7 +9973,20 @@
           </w:tcPr>
           <w:p>
             <w:pPr>
-              <w:spacing w:after="0"/>
+              <w:framePr w:w="0" w:h="0" w:vAnchor="margin" w:hAnchor="text" w:x="0" w:y="0"/>
+              <w:pBdr>
+                <w:top w:val="none" w:sz="4" w:space="0"/>
+                <w:left w:val="none" w:sz="4" w:space="0"/>
+                <w:bottom w:val="none" w:sz="4" w:space="0"/>
+                <w:right w:val="none" w:sz="4" w:space="0"/>
+                <w:between w:val="none" w:sz="4" w:space="0"/>
+                <w:bar w:val="none" w:sz="4" w:space="0"/>
+              </w:pBdr>
+              <w:shd w:val="clear" w:fill="auto"/>
+              <w:bidi w:val="off"/>
+              <w:spacing w:before="0" w:after="0" w:line="240" w:lineRule="auto"/>
+              <w:ind w:left="0" w:right="0" w:firstLine="0"/>
+              <w:jc w:val="left"/>
               <w:rPr>
                 <w:rFonts w:asciiTheme="majorHAnsi" w:hAnsiTheme="majorHAnsi"/>
                 <w:highlight w:val="yellow"/>
@@ -9858,10 +9994,13 @@
             </w:pPr>
             <w:r>
               <w:rPr>
-                <w:rFonts w:asciiTheme="majorHAnsi" w:hAnsiTheme="majorHAnsi"/>
-                <w:highlight w:val="yellow"/>
-              </w:rPr>
-              <w:t>xxxx</w:t>
+                <w:rFonts w:ascii="Segoe UI"/>
+                <w:color w:val="000000"/>
+                <w:sz w:val="18"/>
+                <w:rtl w:val="off"/>
+                <w:lang w:val="en-US"/>
+              </w:rPr>
+              <w:t>{councilCharges}</w:t>
             </w:r>
           </w:p>
         </w:tc>
@@ -9882,406 +10021,23 @@
           <w:bCs/>
         </w:rPr>
       </w:pPr>
-      <w:r>
+    </w:p>
+    <w:p>
+      <w:pPr>
         <w:rPr>
           <w:rFonts w:asciiTheme="majorHAnsi" w:hAnsiTheme="majorHAnsi"/>
           <w:b/>
           <w:bCs/>
         </w:rPr>
-        <w:t xml:space="preserve">DELIVERY STANDARDS </w:t>
-      </w:r>
-    </w:p>
-    <w:tbl>
-      <w:tblPr>
-        <w:tblStyle w:val="TableGrid"/>
-        <w:tblW w:w="0" w:type="auto"/>
-        <w:tblLook w:val="04A0"/>
-      </w:tblPr>
-      <w:tblGrid>
-        <w:gridCol w:w="3005"/>
-        <w:gridCol w:w="1526"/>
-        <w:gridCol w:w="4485"/>
-      </w:tblGrid>
-      <w:tr>
-        <w:trPr/>
-        <w:tc>
-          <w:tcPr>
-            <w:cnfStyle w:val="101000000000"/>
-            <w:tcW w:w="3005" w:type="dxa"/>
-          </w:tcPr>
-          <w:p>
-            <w:pPr>
-              <w:rPr>
-                <w:rFonts w:asciiTheme="majorHAnsi" w:hAnsiTheme="majorHAnsi"/>
-                <w:b/>
-                <w:bCs/>
-              </w:rPr>
-            </w:pPr>
-            <w:r>
-              <w:rPr>
-                <w:rFonts w:asciiTheme="majorHAnsi" w:hAnsiTheme="majorHAnsi"/>
-                <w:b/>
-                <w:bCs/>
-              </w:rPr>
-              <w:t>Description</w:t>
-            </w:r>
-          </w:p>
-        </w:tc>
-        <w:tc>
-          <w:tcPr>
-            <w:cnfStyle w:val="100000000000"/>
-            <w:tcW w:w="1526" w:type="dxa"/>
-          </w:tcPr>
-          <w:p>
-            <w:pPr>
-              <w:rPr>
-                <w:rFonts w:asciiTheme="majorHAnsi" w:hAnsiTheme="majorHAnsi"/>
-                <w:b/>
-                <w:bCs/>
-              </w:rPr>
-            </w:pPr>
-            <w:r>
-              <w:rPr>
-                <w:rFonts w:asciiTheme="majorHAnsi" w:hAnsiTheme="majorHAnsi"/>
-                <w:b/>
-                <w:bCs/>
-              </w:rPr>
-              <w:t xml:space="preserve">Timescale </w:t>
-            </w:r>
-          </w:p>
-        </w:tc>
-        <w:tc>
-          <w:tcPr>
-            <w:cnfStyle w:val="100000000000"/>
-            <w:tcW w:w="4485" w:type="dxa"/>
-          </w:tcPr>
-          <w:p>
-            <w:pPr>
-              <w:rPr>
-                <w:rFonts w:asciiTheme="majorHAnsi" w:hAnsiTheme="majorHAnsi"/>
-                <w:b/>
-                <w:bCs/>
-              </w:rPr>
-            </w:pPr>
-            <w:r>
-              <w:rPr>
-                <w:rFonts w:asciiTheme="majorHAnsi" w:hAnsiTheme="majorHAnsi"/>
-                <w:b/>
-                <w:bCs/>
-              </w:rPr>
-              <w:t xml:space="preserve">Comments </w:t>
-            </w:r>
-          </w:p>
-        </w:tc>
-      </w:tr>
-      <w:tr>
-        <w:trPr/>
-        <w:tc>
-          <w:tcPr>
-            <w:cnfStyle w:val="001000100000"/>
-            <w:tcW w:w="3005" w:type="dxa"/>
-          </w:tcPr>
-          <w:p>
-            <w:pPr>
-              <w:rPr>
-                <w:rFonts w:asciiTheme="majorHAnsi" w:hAnsiTheme="majorHAnsi"/>
-              </w:rPr>
-            </w:pPr>
-            <w:r>
-              <w:rPr>
-                <w:rFonts w:asciiTheme="majorHAnsi" w:hAnsiTheme="majorHAnsi"/>
-              </w:rPr>
-              <w:t>Service Call off (via call off sheet</w:t>
-            </w:r>
-          </w:p>
-        </w:tc>
-        <w:tc>
-          <w:tcPr>
-            <w:cnfStyle w:val="000000100000"/>
-            <w:tcW w:w="1526" w:type="dxa"/>
-          </w:tcPr>
-          <w:p>
-            <w:pPr>
-              <w:rPr>
-                <w:rFonts w:asciiTheme="majorHAnsi" w:hAnsiTheme="majorHAnsi"/>
-              </w:rPr>
-            </w:pPr>
-            <w:r>
-              <w:rPr>
-                <w:rFonts w:asciiTheme="majorHAnsi" w:hAnsiTheme="majorHAnsi"/>
-                <w:highlight w:val="yellow"/>
-              </w:rPr>
-              <w:t>xx</w:t>
-            </w:r>
-            <w:r>
-              <w:rPr>
-                <w:rFonts w:asciiTheme="majorHAnsi" w:hAnsiTheme="majorHAnsi"/>
-              </w:rPr>
-              <w:t xml:space="preserve"> </w:t>
-            </w:r>
-            <w:r>
-              <w:rPr>
-                <w:rFonts w:asciiTheme="majorHAnsi" w:hAnsiTheme="majorHAnsi"/>
-              </w:rPr>
-              <w:t xml:space="preserve">days </w:t>
-            </w:r>
-          </w:p>
-        </w:tc>
-        <w:tc>
-          <w:tcPr>
-            <w:cnfStyle w:val="000000100000"/>
-            <w:tcW w:w="4485" w:type="dxa"/>
-          </w:tcPr>
-          <w:p>
-            <w:pPr>
-              <w:rPr>
-                <w:rFonts w:asciiTheme="majorHAnsi" w:hAnsiTheme="majorHAnsi"/>
-                <w:i/>
-                <w:iCs/>
-              </w:rPr>
-            </w:pPr>
-            <w:r>
-              <w:rPr>
-                <w:rFonts w:asciiTheme="majorHAnsi" w:hAnsiTheme="majorHAnsi"/>
-                <w:i/>
-                <w:iCs/>
-              </w:rPr>
-              <w:t xml:space="preserve">Subject to any highway notice required – if required </w:t>
-            </w:r>
-          </w:p>
-        </w:tc>
-      </w:tr>
-      <w:tr>
-        <w:trPr/>
-        <w:tc>
-          <w:tcPr>
-            <w:cnfStyle w:val="001000010000"/>
-            <w:tcW w:w="3005" w:type="dxa"/>
-          </w:tcPr>
-          <w:p>
-            <w:pPr>
-              <w:rPr>
-                <w:rFonts w:asciiTheme="majorHAnsi" w:hAnsiTheme="majorHAnsi"/>
-              </w:rPr>
-            </w:pPr>
-            <w:r>
-              <w:rPr>
-                <w:rFonts w:asciiTheme="majorHAnsi" w:hAnsiTheme="majorHAnsi"/>
-              </w:rPr>
-              <w:t>Mains call off (via call off sheet)</w:t>
-            </w:r>
-          </w:p>
-        </w:tc>
-        <w:tc>
-          <w:tcPr>
-            <w:cnfStyle w:val="000000010000"/>
-            <w:tcW w:w="1526" w:type="dxa"/>
-          </w:tcPr>
-          <w:p>
-            <w:pPr>
-              <w:rPr>
-                <w:rFonts w:asciiTheme="majorHAnsi" w:hAnsiTheme="majorHAnsi"/>
-              </w:rPr>
-            </w:pPr>
-            <w:r>
-              <w:rPr>
-                <w:rFonts w:asciiTheme="majorHAnsi" w:hAnsiTheme="majorHAnsi"/>
-                <w:highlight w:val="yellow"/>
-              </w:rPr>
-              <w:t>xx</w:t>
-            </w:r>
-            <w:r>
-              <w:rPr>
-                <w:rFonts w:asciiTheme="majorHAnsi" w:hAnsiTheme="majorHAnsi"/>
-              </w:rPr>
-              <w:t xml:space="preserve"> Weeks </w:t>
-            </w:r>
-          </w:p>
-        </w:tc>
-        <w:tc>
-          <w:tcPr>
-            <w:cnfStyle w:val="000000010000"/>
-            <w:tcW w:w="4485" w:type="dxa"/>
-          </w:tcPr>
-          <w:p>
-            <w:pPr>
-              <w:rPr>
-                <w:rFonts w:asciiTheme="majorHAnsi" w:hAnsiTheme="majorHAnsi"/>
-                <w:i/>
-                <w:iCs/>
-              </w:rPr>
-            </w:pPr>
-            <w:r>
-              <w:rPr>
-                <w:rFonts w:asciiTheme="majorHAnsi" w:hAnsiTheme="majorHAnsi"/>
-                <w:i/>
-                <w:iCs/>
-              </w:rPr>
-              <w:t>Subject to any highway notices, resource availability at the time</w:t>
-            </w:r>
-          </w:p>
-        </w:tc>
-      </w:tr>
-      <w:tr>
-        <w:trPr/>
-        <w:tc>
-          <w:tcPr>
-            <w:cnfStyle w:val="001000100000"/>
-            <w:tcW w:w="3005" w:type="dxa"/>
-          </w:tcPr>
-          <w:p>
-            <w:pPr>
-              <w:rPr>
-                <w:rFonts w:asciiTheme="majorHAnsi" w:hAnsiTheme="majorHAnsi"/>
-              </w:rPr>
-            </w:pPr>
-            <w:r>
-              <w:rPr>
-                <w:rFonts w:asciiTheme="majorHAnsi" w:hAnsiTheme="majorHAnsi"/>
-              </w:rPr>
-              <w:t>Mobilisation to site after contract award – design approval and pre-start preparation</w:t>
-            </w:r>
-          </w:p>
-        </w:tc>
-        <w:tc>
-          <w:tcPr>
-            <w:cnfStyle w:val="000000100000"/>
-            <w:tcW w:w="1526" w:type="dxa"/>
-          </w:tcPr>
-          <w:p>
-            <w:pPr>
-              <w:rPr>
-                <w:rFonts w:asciiTheme="majorHAnsi" w:hAnsiTheme="majorHAnsi"/>
-              </w:rPr>
-            </w:pPr>
-            <w:r>
-              <w:rPr>
-                <w:rFonts w:asciiTheme="majorHAnsi" w:hAnsiTheme="majorHAnsi"/>
-                <w:highlight w:val="yellow"/>
-              </w:rPr>
-              <w:t>xx</w:t>
-            </w:r>
-            <w:r>
-              <w:rPr>
-                <w:rFonts w:asciiTheme="majorHAnsi" w:hAnsiTheme="majorHAnsi"/>
-              </w:rPr>
-              <w:t xml:space="preserve"> weeks</w:t>
-            </w:r>
-          </w:p>
-        </w:tc>
-        <w:tc>
-          <w:tcPr>
-            <w:cnfStyle w:val="000000100000"/>
-            <w:tcW w:w="4485" w:type="dxa"/>
-          </w:tcPr>
-          <w:p>
-            <w:pPr>
-              <w:rPr>
-                <w:rFonts w:asciiTheme="majorHAnsi" w:hAnsiTheme="majorHAnsi"/>
-                <w:i/>
-                <w:iCs/>
-              </w:rPr>
-            </w:pPr>
-            <w:r>
-              <w:rPr>
-                <w:rFonts w:asciiTheme="majorHAnsi" w:hAnsiTheme="majorHAnsi"/>
-                <w:i/>
-                <w:iCs/>
-              </w:rPr>
-              <w:t>Subject to receipt of all required information and conditional upon full settlement of initial payment. This process duration is wholly dependent on the collaborative effort between Air Utilities and the customer. WE strongly advise acceptance of this tender is made at the earliest opportunity to avoid unknown delays etc.</w:t>
-            </w:r>
-          </w:p>
-        </w:tc>
-      </w:tr>
-      <w:tr>
-        <w:trPr/>
-        <w:tc>
-          <w:tcPr>
-            <w:cnfStyle w:val="001000010000"/>
-            <w:tcW w:w="3005" w:type="dxa"/>
-          </w:tcPr>
-          <w:p>
-            <w:pPr>
-              <w:rPr>
-                <w:rFonts w:asciiTheme="majorHAnsi" w:hAnsiTheme="majorHAnsi"/>
-              </w:rPr>
-            </w:pPr>
-            <w:r>
-              <w:rPr>
-                <w:rFonts w:asciiTheme="majorHAnsi" w:hAnsiTheme="majorHAnsi"/>
-              </w:rPr>
-              <w:t xml:space="preserve">Draft duct layouts </w:t>
-            </w:r>
-          </w:p>
-        </w:tc>
-        <w:tc>
-          <w:tcPr>
-            <w:cnfStyle w:val="000000010000"/>
-            <w:tcW w:w="1526" w:type="dxa"/>
-          </w:tcPr>
-          <w:p>
-            <w:pPr>
-              <w:rPr>
-                <w:rFonts w:asciiTheme="majorHAnsi" w:hAnsiTheme="majorHAnsi"/>
-              </w:rPr>
-            </w:pPr>
-            <w:r>
-              <w:rPr>
-                <w:rFonts w:asciiTheme="majorHAnsi" w:hAnsiTheme="majorHAnsi"/>
-                <w:highlight w:val="yellow"/>
-              </w:rPr>
-              <w:t>xx</w:t>
-            </w:r>
-            <w:r>
-              <w:rPr>
-                <w:rFonts w:asciiTheme="majorHAnsi" w:hAnsiTheme="majorHAnsi"/>
-              </w:rPr>
-              <w:t xml:space="preserve"> weeks </w:t>
-            </w:r>
-          </w:p>
-        </w:tc>
-        <w:tc>
-          <w:tcPr>
-            <w:cnfStyle w:val="000000010000"/>
-            <w:tcW w:w="4485" w:type="dxa"/>
-          </w:tcPr>
-          <w:p>
-            <w:pPr>
-              <w:rPr>
-                <w:rFonts w:asciiTheme="majorHAnsi" w:hAnsiTheme="majorHAnsi"/>
-                <w:i/>
-                <w:iCs/>
-              </w:rPr>
-            </w:pPr>
-            <w:r>
-              <w:rPr>
-                <w:rFonts w:asciiTheme="majorHAnsi" w:hAnsiTheme="majorHAnsi"/>
-                <w:i/>
-                <w:iCs/>
-              </w:rPr>
-              <w:t xml:space="preserve">Draft – based on unapproved designs, to assist ground works </w:t>
-            </w:r>
-          </w:p>
-        </w:tc>
-      </w:tr>
-    </w:tbl>
-    <w:p>
-      <w:pPr>
+      </w:pPr>
+      <w:r>
         <w:rPr>
           <w:rFonts w:asciiTheme="majorHAnsi" w:hAnsiTheme="majorHAnsi"/>
           <w:b/>
           <w:bCs/>
         </w:rPr>
-      </w:pPr>
-    </w:p>
-    <w:p>
-      <w:pPr>
-        <w:rPr>
-          <w:rFonts w:asciiTheme="majorHAnsi" w:hAnsiTheme="majorHAnsi"/>
-          <w:b/>
-          <w:bCs/>
-        </w:rPr>
-      </w:pPr>
+        <w:t xml:space="preserve">DELIVERY STANDARDS </w:t>
+      </w:r>
     </w:p>
     <w:p>
       <w:pPr>
@@ -10618,114 +10374,6 @@
         </w:rPr>
         <w:t xml:space="preserve">– Vary depending on utility and area, please contact AU for more information.  </w:t>
       </w:r>
-    </w:p>
-    <w:p>
-      <w:pPr>
-        <w:rPr>
-          <w:rFonts w:asciiTheme="majorHAnsi" w:hAnsiTheme="majorHAnsi"/>
-          <w:b/>
-          <w:bCs/>
-        </w:rPr>
-      </w:pPr>
-    </w:p>
-    <w:p>
-      <w:pPr>
-        <w:rPr>
-          <w:rFonts w:asciiTheme="majorHAnsi" w:hAnsiTheme="majorHAnsi"/>
-          <w:b/>
-          <w:bCs/>
-        </w:rPr>
-      </w:pPr>
-    </w:p>
-    <w:p>
-      <w:pPr>
-        <w:rPr>
-          <w:rFonts w:asciiTheme="majorHAnsi" w:hAnsiTheme="majorHAnsi"/>
-          <w:b/>
-          <w:bCs/>
-        </w:rPr>
-      </w:pPr>
-    </w:p>
-    <w:p>
-      <w:pPr>
-        <w:rPr>
-          <w:rFonts w:asciiTheme="majorHAnsi" w:hAnsiTheme="majorHAnsi"/>
-          <w:b/>
-          <w:bCs/>
-        </w:rPr>
-      </w:pPr>
-    </w:p>
-    <w:p>
-      <w:pPr>
-        <w:rPr>
-          <w:rFonts w:asciiTheme="majorHAnsi" w:hAnsiTheme="majorHAnsi"/>
-          <w:b/>
-          <w:bCs/>
-        </w:rPr>
-      </w:pPr>
-    </w:p>
-    <w:p>
-      <w:pPr>
-        <w:rPr>
-          <w:rFonts w:asciiTheme="majorHAnsi" w:hAnsiTheme="majorHAnsi"/>
-          <w:b/>
-          <w:bCs/>
-        </w:rPr>
-      </w:pPr>
-    </w:p>
-    <w:p>
-      <w:pPr>
-        <w:rPr>
-          <w:rFonts w:asciiTheme="majorHAnsi" w:hAnsiTheme="majorHAnsi"/>
-          <w:b/>
-          <w:bCs/>
-        </w:rPr>
-      </w:pPr>
-    </w:p>
-    <w:p>
-      <w:pPr>
-        <w:rPr>
-          <w:rFonts w:asciiTheme="majorHAnsi" w:hAnsiTheme="majorHAnsi"/>
-          <w:b/>
-          <w:bCs/>
-        </w:rPr>
-      </w:pPr>
-    </w:p>
-    <w:p>
-      <w:pPr>
-        <w:rPr>
-          <w:rFonts w:asciiTheme="majorHAnsi" w:hAnsiTheme="majorHAnsi"/>
-          <w:b/>
-          <w:bCs/>
-        </w:rPr>
-      </w:pPr>
-    </w:p>
-    <w:p>
-      <w:pPr>
-        <w:rPr>
-          <w:rFonts w:asciiTheme="majorHAnsi" w:hAnsiTheme="majorHAnsi"/>
-          <w:b/>
-          <w:bCs/>
-        </w:rPr>
-      </w:pPr>
-    </w:p>
-    <w:p>
-      <w:pPr>
-        <w:rPr>
-          <w:rFonts w:asciiTheme="majorHAnsi" w:hAnsiTheme="majorHAnsi"/>
-          <w:b/>
-          <w:bCs/>
-        </w:rPr>
-      </w:pPr>
-    </w:p>
-    <w:p>
-      <w:pPr>
-        <w:rPr>
-          <w:rFonts w:asciiTheme="majorHAnsi" w:hAnsiTheme="majorHAnsi"/>
-          <w:b/>
-          <w:bCs/>
-        </w:rPr>
-      </w:pPr>
     </w:p>
     <w:p>
       <w:pPr>
@@ -10745,247 +10393,14 @@
           <w:color w:val="4b92d9" w:themeColor="text2" w:themeTint="80"/>
         </w:rPr>
       </w:pPr>
-      <w:r>
+    </w:p>
+    <w:p>
+      <w:pPr>
         <w:rPr>
           <w:rFonts w:asciiTheme="majorHAnsi" w:hAnsiTheme="majorHAnsi"/>
           <w:b/>
           <w:bCs/>
           <w:color w:val="4b92d9" w:themeColor="text2" w:themeTint="80"/>
-        </w:rPr>
-        <w:t xml:space="preserve">OFF SITE WORKS </w:t>
-      </w:r>
-    </w:p>
-    <w:p>
-      <w:pPr>
-        <w:rPr>
-          <w:rFonts w:asciiTheme="majorHAnsi" w:hAnsiTheme="majorHAnsi"/>
-          <w:b/>
-          <w:bCs/>
-        </w:rPr>
-      </w:pPr>
-      <w:r>
-        <w:rPr>
-          <w:rFonts w:asciiTheme="majorHAnsi" w:hAnsiTheme="majorHAnsi"/>
-          <w:b/>
-          <w:bCs/>
-        </w:rPr>
-        <w:t xml:space="preserve">Connection points on the existing networks </w:t>
-      </w:r>
-      <w:r>
-        <w:rPr>
-          <w:rFonts w:asciiTheme="majorHAnsi" w:hAnsiTheme="majorHAnsi"/>
-          <w:b/>
-          <w:bCs/>
-        </w:rPr>
-        <w:tab/>
-      </w:r>
-    </w:p>
-    <w:p>
-      <w:pPr>
-        <w:rPr>
-          <w:rFonts w:asciiTheme="majorHAnsi" w:hAnsiTheme="majorHAnsi"/>
-        </w:rPr>
-      </w:pPr>
-      <w:r>
-        <w:rPr>
-          <w:rFonts w:asciiTheme="majorHAnsi" w:hAnsiTheme="majorHAnsi"/>
-        </w:rPr>
-        <w:t xml:space="preserve">The below diagram indicates the connection point to the existing network which forms part of our tender. </w:t>
-      </w:r>
-    </w:p>
-    <w:p>
-      <w:pPr>
-        <w:rPr>
-          <w:rFonts w:asciiTheme="majorHAnsi" w:hAnsiTheme="majorHAnsi"/>
-        </w:rPr>
-      </w:pPr>
-    </w:p>
-    <w:p>
-      <w:pPr>
-        <w:rPr>
-          <w:rFonts w:asciiTheme="majorHAnsi" w:hAnsiTheme="majorHAnsi"/>
-        </w:rPr>
-      </w:pPr>
-      <w:r>
-        <w:rPr>
-          <w:rFonts w:asciiTheme="majorHAnsi" w:hAnsiTheme="majorHAnsi"/>
-          <w:highlight w:val="yellow"/>
-        </w:rPr>
-        <w:t>Add image/drawing</w:t>
-      </w:r>
-    </w:p>
-    <w:p>
-      <w:pPr>
-        <w:rPr>
-          <w:rFonts w:asciiTheme="majorHAnsi" w:hAnsiTheme="majorHAnsi"/>
-        </w:rPr>
-      </w:pPr>
-    </w:p>
-    <w:p>
-      <w:pPr>
-        <w:rPr>
-          <w:rFonts w:asciiTheme="majorHAnsi" w:hAnsiTheme="majorHAnsi"/>
-        </w:rPr>
-      </w:pPr>
-    </w:p>
-    <w:p>
-      <w:pPr>
-        <w:rPr>
-          <w:rFonts w:asciiTheme="majorHAnsi" w:hAnsiTheme="majorHAnsi"/>
-        </w:rPr>
-      </w:pPr>
-    </w:p>
-    <w:p>
-      <w:pPr>
-        <w:rPr>
-          <w:rFonts w:asciiTheme="majorHAnsi" w:hAnsiTheme="majorHAnsi"/>
-        </w:rPr>
-      </w:pPr>
-    </w:p>
-    <w:p>
-      <w:pPr>
-        <w:rPr>
-          <w:rFonts w:asciiTheme="majorHAnsi" w:hAnsiTheme="majorHAnsi"/>
-        </w:rPr>
-      </w:pPr>
-    </w:p>
-    <w:p>
-      <w:pPr>
-        <w:rPr>
-          <w:rFonts w:asciiTheme="majorHAnsi" w:hAnsiTheme="majorHAnsi"/>
-        </w:rPr>
-      </w:pPr>
-    </w:p>
-    <w:p>
-      <w:pPr>
-        <w:rPr>
-          <w:rFonts w:asciiTheme="majorHAnsi" w:hAnsiTheme="majorHAnsi"/>
-        </w:rPr>
-      </w:pPr>
-    </w:p>
-    <w:p>
-      <w:pPr>
-        <w:rPr>
-          <w:rFonts w:asciiTheme="majorHAnsi" w:hAnsiTheme="majorHAnsi"/>
-        </w:rPr>
-      </w:pPr>
-    </w:p>
-    <w:p>
-      <w:pPr>
-        <w:rPr>
-          <w:rFonts w:asciiTheme="majorHAnsi" w:hAnsiTheme="majorHAnsi"/>
-        </w:rPr>
-      </w:pPr>
-    </w:p>
-    <w:p>
-      <w:pPr>
-        <w:rPr>
-          <w:rFonts w:asciiTheme="majorHAnsi" w:hAnsiTheme="majorHAnsi"/>
-        </w:rPr>
-      </w:pPr>
-    </w:p>
-    <w:p>
-      <w:pPr>
-        <w:rPr>
-          <w:rFonts w:asciiTheme="majorHAnsi" w:hAnsiTheme="majorHAnsi"/>
-        </w:rPr>
-      </w:pPr>
-    </w:p>
-    <w:p>
-      <w:pPr>
-        <w:rPr>
-          <w:rFonts w:asciiTheme="majorHAnsi" w:hAnsiTheme="majorHAnsi"/>
-        </w:rPr>
-      </w:pPr>
-    </w:p>
-    <w:p>
-      <w:pPr>
-        <w:rPr>
-          <w:rFonts w:asciiTheme="majorHAnsi" w:hAnsiTheme="majorHAnsi"/>
-        </w:rPr>
-      </w:pPr>
-    </w:p>
-    <w:p>
-      <w:pPr>
-        <w:rPr>
-          <w:rFonts w:asciiTheme="majorHAnsi" w:hAnsiTheme="majorHAnsi"/>
-        </w:rPr>
-      </w:pPr>
-    </w:p>
-    <w:p>
-      <w:pPr>
-        <w:rPr>
-          <w:rFonts w:asciiTheme="majorHAnsi" w:hAnsiTheme="majorHAnsi"/>
-        </w:rPr>
-      </w:pPr>
-    </w:p>
-    <w:p>
-      <w:pPr>
-        <w:rPr>
-          <w:rFonts w:asciiTheme="majorHAnsi" w:hAnsiTheme="majorHAnsi"/>
-        </w:rPr>
-      </w:pPr>
-    </w:p>
-    <w:p>
-      <w:pPr>
-        <w:rPr>
-          <w:rFonts w:asciiTheme="majorHAnsi" w:hAnsiTheme="majorHAnsi"/>
-        </w:rPr>
-      </w:pPr>
-    </w:p>
-    <w:p>
-      <w:pPr>
-        <w:rPr>
-          <w:rFonts w:asciiTheme="majorHAnsi" w:hAnsiTheme="majorHAnsi"/>
-        </w:rPr>
-      </w:pPr>
-    </w:p>
-    <w:p>
-      <w:pPr>
-        <w:rPr>
-          <w:rFonts w:asciiTheme="majorHAnsi" w:hAnsiTheme="majorHAnsi"/>
-        </w:rPr>
-      </w:pPr>
-    </w:p>
-    <w:p>
-      <w:pPr>
-        <w:rPr>
-          <w:rFonts w:asciiTheme="majorHAnsi" w:hAnsiTheme="majorHAnsi"/>
-        </w:rPr>
-      </w:pPr>
-    </w:p>
-    <w:p>
-      <w:pPr>
-        <w:rPr>
-          <w:rFonts w:asciiTheme="majorHAnsi" w:hAnsiTheme="majorHAnsi"/>
-        </w:rPr>
-      </w:pPr>
-    </w:p>
-    <w:p>
-      <w:pPr>
-        <w:rPr>
-          <w:rFonts w:asciiTheme="majorHAnsi" w:hAnsiTheme="majorHAnsi"/>
-        </w:rPr>
-      </w:pPr>
-    </w:p>
-    <w:p>
-      <w:pPr>
-        <w:rPr>
-          <w:rFonts w:asciiTheme="majorHAnsi" w:hAnsiTheme="majorHAnsi"/>
-        </w:rPr>
-      </w:pPr>
-    </w:p>
-    <w:p>
-      <w:pPr>
-        <w:rPr>
-          <w:rFonts w:asciiTheme="majorHAnsi" w:hAnsiTheme="majorHAnsi"/>
-        </w:rPr>
-      </w:pPr>
-    </w:p>
-    <w:p>
-      <w:pPr>
-        <w:rPr>
-          <w:rFonts w:asciiTheme="majorHAnsi" w:hAnsiTheme="majorHAnsi"/>
         </w:rPr>
       </w:pPr>
     </w:p>
@@ -11136,23 +10551,33 @@
           </w:tcPr>
           <w:p>
             <w:pPr>
-              <w:jc w:val="center"/>
-              <w:rPr>
-                <w:rFonts w:asciiTheme="majorHAnsi" w:hAnsiTheme="majorHAnsi"/>
-              </w:rPr>
-            </w:pPr>
-            <w:r>
-              <w:rPr>
-                <w:rFonts w:asciiTheme="majorHAnsi" w:hAnsiTheme="majorHAnsi"/>
-                <w:highlight w:val="yellow"/>
-              </w:rPr>
-              <w:t>xxxx</w:t>
-            </w:r>
-            <w:r>
-              <w:rPr>
-                <w:rFonts w:asciiTheme="majorHAnsi" w:hAnsiTheme="majorHAnsi"/>
-              </w:rPr>
-              <w:t xml:space="preserve"> </w:t>
+              <w:framePr w:w="0" w:h="0" w:vAnchor="margin" w:hAnchor="text" w:x="0" w:y="0"/>
+              <w:pBdr>
+                <w:top w:val="none" w:sz="4" w:space="0"/>
+                <w:left w:val="none" w:sz="4" w:space="0"/>
+                <w:bottom w:val="none" w:sz="4" w:space="0"/>
+                <w:right w:val="none" w:sz="4" w:space="0"/>
+                <w:between w:val="none" w:sz="4" w:space="0"/>
+                <w:bar w:val="none" w:sz="4" w:space="0"/>
+              </w:pBdr>
+              <w:shd w:val="clear" w:fill="auto"/>
+              <w:bidi w:val="off"/>
+              <w:spacing w:before="0" w:after="0" w:line="240" w:lineRule="auto"/>
+              <w:ind w:left="0" w:right="0" w:firstLine="0"/>
+              <w:jc w:val="left"/>
+              <w:rPr>
+                <w:rFonts w:asciiTheme="majorHAnsi" w:hAnsiTheme="majorHAnsi"/>
+              </w:rPr>
+            </w:pPr>
+            <w:r>
+              <w:rPr>
+                <w:rFonts w:ascii="Segoe UI"/>
+                <w:color w:val="000000"/>
+                <w:sz w:val="18"/>
+                <w:rtl w:val="off"/>
+                <w:lang w:val="en-US"/>
+              </w:rPr>
+              <w:t xml:space="preserve">              {waterPocRef}</w:t>
             </w:r>
           </w:p>
         </w:tc>
@@ -11163,23 +10588,36 @@
           </w:tcPr>
           <w:p>
             <w:pPr>
-              <w:jc w:val="center"/>
-              <w:rPr>
-                <w:rFonts w:asciiTheme="majorHAnsi" w:hAnsiTheme="majorHAnsi"/>
-              </w:rPr>
-            </w:pPr>
-            <w:r>
-              <w:rPr>
-                <w:rFonts w:asciiTheme="majorHAnsi" w:hAnsiTheme="majorHAnsi"/>
-                <w:highlight w:val="yellow"/>
-              </w:rPr>
-              <w:t>xxxx</w:t>
-            </w:r>
-            <w:r>
-              <w:rPr>
-                <w:rFonts w:asciiTheme="majorHAnsi" w:hAnsiTheme="majorHAnsi"/>
-              </w:rPr>
-              <w:t xml:space="preserve"> </w:t>
+              <w:framePr w:w="0" w:h="0" w:vAnchor="margin" w:hAnchor="text" w:x="0" w:y="0"/>
+              <w:pBdr>
+                <w:top w:val="none" w:sz="4" w:space="0"/>
+                <w:left w:val="none" w:sz="4" w:space="0"/>
+                <w:bottom w:val="none" w:sz="4" w:space="0"/>
+                <w:right w:val="none" w:sz="4" w:space="0"/>
+                <w:between w:val="none" w:sz="4" w:space="0"/>
+                <w:bar w:val="none" w:sz="4" w:space="0"/>
+              </w:pBdr>
+              <w:shd w:val="clear" w:fill="auto"/>
+              <w:tabs>
+                <w:tab w:val="left" w:pos="720"/>
+              </w:tabs>
+              <w:bidi w:val="off"/>
+              <w:spacing w:before="0" w:after="0" w:line="240" w:lineRule="auto"/>
+              <w:ind w:right="0"/>
+              <w:jc w:val="left"/>
+              <w:rPr>
+                <w:rFonts w:asciiTheme="majorHAnsi" w:hAnsiTheme="majorHAnsi"/>
+              </w:rPr>
+            </w:pPr>
+            <w:r>
+              <w:rPr>
+                <w:rFonts w:ascii="Segoe UI"/>
+                <w:color w:val="000000"/>
+                <w:sz w:val="18"/>
+                <w:rtl w:val="off"/>
+                <w:lang w:val="en-US"/>
+              </w:rPr>
+              <w:t xml:space="preserve">            {waterPocExpiry}</w:t>
             </w:r>
           </w:p>
         </w:tc>
@@ -11213,17 +10651,36 @@
           </w:tcPr>
           <w:p>
             <w:pPr>
-              <w:jc w:val="center"/>
-              <w:rPr>
-                <w:rFonts w:asciiTheme="majorHAnsi" w:hAnsiTheme="majorHAnsi"/>
-              </w:rPr>
-            </w:pPr>
-            <w:r>
-              <w:rPr>
-                <w:rFonts w:asciiTheme="majorHAnsi" w:hAnsiTheme="majorHAnsi"/>
-                <w:highlight w:val="yellow"/>
-              </w:rPr>
-              <w:t>xxxx</w:t>
+              <w:framePr w:w="0" w:h="0" w:vAnchor="margin" w:hAnchor="text" w:x="0" w:y="0"/>
+              <w:pBdr>
+                <w:top w:val="none" w:sz="4" w:space="0"/>
+                <w:left w:val="none" w:sz="4" w:space="0"/>
+                <w:bottom w:val="none" w:sz="4" w:space="0"/>
+                <w:right w:val="none" w:sz="4" w:space="0"/>
+                <w:between w:val="none" w:sz="4" w:space="0"/>
+                <w:bar w:val="none" w:sz="4" w:space="0"/>
+              </w:pBdr>
+              <w:shd w:val="clear" w:fill="auto"/>
+              <w:tabs>
+                <w:tab w:val="left" w:pos="720"/>
+              </w:tabs>
+              <w:bidi w:val="off"/>
+              <w:spacing w:before="0" w:after="0" w:line="240" w:lineRule="auto"/>
+              <w:ind w:right="0"/>
+              <w:jc w:val="left"/>
+              <w:rPr>
+                <w:rFonts w:asciiTheme="majorHAnsi" w:hAnsiTheme="majorHAnsi"/>
+              </w:rPr>
+            </w:pPr>
+            <w:r>
+              <w:rPr>
+                <w:rFonts w:ascii="Segoe UI"/>
+                <w:color w:val="000000"/>
+                <w:sz w:val="18"/>
+                <w:rtl w:val="off"/>
+                <w:lang w:val="en-US"/>
+              </w:rPr>
+              <w:t xml:space="preserve">         {mainsElectricPocRef}</w:t>
             </w:r>
           </w:p>
         </w:tc>
@@ -11234,23 +10691,36 @@
           </w:tcPr>
           <w:p>
             <w:pPr>
-              <w:jc w:val="center"/>
-              <w:rPr>
-                <w:rFonts w:asciiTheme="majorHAnsi" w:hAnsiTheme="majorHAnsi"/>
-              </w:rPr>
-            </w:pPr>
-            <w:r>
-              <w:rPr>
-                <w:rFonts w:asciiTheme="majorHAnsi" w:hAnsiTheme="majorHAnsi"/>
-                <w:highlight w:val="yellow"/>
-              </w:rPr>
-              <w:t>xxxx</w:t>
-            </w:r>
-            <w:r>
-              <w:rPr>
-                <w:rFonts w:asciiTheme="majorHAnsi" w:hAnsiTheme="majorHAnsi"/>
-              </w:rPr>
-              <w:t xml:space="preserve"> </w:t>
+              <w:framePr w:w="0" w:h="0" w:vAnchor="margin" w:hAnchor="text" w:x="0" w:y="0"/>
+              <w:pBdr>
+                <w:top w:val="none" w:sz="4" w:space="0"/>
+                <w:left w:val="none" w:sz="4" w:space="0"/>
+                <w:bottom w:val="none" w:sz="4" w:space="0"/>
+                <w:right w:val="none" w:sz="4" w:space="0"/>
+                <w:between w:val="none" w:sz="4" w:space="0"/>
+                <w:bar w:val="none" w:sz="4" w:space="0"/>
+              </w:pBdr>
+              <w:shd w:val="clear" w:fill="auto"/>
+              <w:tabs>
+                <w:tab w:val="left" w:pos="720"/>
+              </w:tabs>
+              <w:bidi w:val="off"/>
+              <w:spacing w:before="0" w:after="0" w:line="240" w:lineRule="auto"/>
+              <w:ind w:right="0"/>
+              <w:jc w:val="left"/>
+              <w:rPr>
+                <w:rFonts w:asciiTheme="majorHAnsi" w:hAnsiTheme="majorHAnsi"/>
+              </w:rPr>
+            </w:pPr>
+            <w:r>
+              <w:rPr>
+                <w:rFonts w:ascii="Segoe UI"/>
+                <w:color w:val="000000"/>
+                <w:sz w:val="18"/>
+                <w:rtl w:val="off"/>
+                <w:lang w:val="en-US"/>
+              </w:rPr>
+              <w:t xml:space="preserve">        {mainsElectricPocExpiry}</w:t>
             </w:r>
           </w:p>
         </w:tc>
@@ -13557,23 +13027,43 @@
     </w:p>
     <w:p>
       <w:pPr>
+        <w:spacing w:after="75" w:line="265" w:lineRule="auto"/>
+        <w:ind w:left="1440" w:right="205" w:firstLine="0"/>
+        <w:jc w:val="both"/>
+        <w:rPr>
+          <w:rFonts w:asciiTheme="majorHAnsi" w:hAnsiTheme="majorHAnsi"/>
+          <w:sz w:val="18"/>
+          <w:szCs w:val="18"/>
+        </w:rPr>
+      </w:pPr>
+    </w:p>
+    <w:p>
+      <w:pPr>
         <w:pStyle w:val="Heading3"/>
         <w:ind w:left="717"/>
-        <w:rPr>
-          <w:rFonts w:asciiTheme="majorHAnsi" w:hAnsiTheme="majorHAnsi"/>
+        <w:rPr/>
+      </w:pPr>
+      <w:r>
+        <w:rPr>
+          <w:rFonts w:asciiTheme="majorHAnsi" w:hAnsiTheme="majorHAnsi"/>
+          <w:b/>
+          <w:bCs/>
+          <w:color w:val="000000" w:themeColor="dk1"/>
+          <w:sz w:val="20"/>
+          <w:szCs w:val="20"/>
+        </w:rPr>
+        <w:t xml:space="preserve">AU Responsibilities </w:t>
+      </w:r>
+      <w:r>
+        <w:rPr>
+          <w:rFonts w:asciiTheme="majorHAnsi" w:hAnsiTheme="majorHAnsi"/>
+          <w:b/>
+          <w:bCs/>
           <w:color w:val="4b92d9" w:themeColor="text2" w:themeTint="80"/>
-          <w:sz w:val="18"/>
-          <w:szCs w:val="18"/>
-        </w:rPr>
-      </w:pPr>
-      <w:r>
-        <w:rPr>
-          <w:rFonts w:asciiTheme="majorHAnsi" w:hAnsiTheme="majorHAnsi"/>
-          <w:color w:val="4b92d9" w:themeColor="text2" w:themeTint="80"/>
-          <w:sz w:val="18"/>
-          <w:szCs w:val="18"/>
-        </w:rPr>
-        <w:t xml:space="preserve">AU Responsibilities  </w:t>
+          <w:sz w:val="20"/>
+          <w:szCs w:val="20"/>
+        </w:rPr>
+        <w:t xml:space="preserve"> </w:t>
       </w:r>
     </w:p>
     <w:p>
@@ -13640,7 +13130,27 @@
           <w:sz w:val="18"/>
           <w:szCs w:val="18"/>
         </w:rPr>
-        <w:t xml:space="preserve">Provide site pack and specific RAMS documentation prior to commencement of works </w:t>
+        <w:t>Provide site pack and specific RAMS documentation prior to commencement of</w:t>
+      </w:r>
+    </w:p>
+    <w:p>
+      <w:pPr>
+        <w:spacing w:after="75" w:line="265" w:lineRule="auto"/>
+        <w:ind w:left="1436" w:right="205" w:firstLine="0"/>
+        <w:jc w:val="both"/>
+        <w:rPr>
+          <w:rFonts w:asciiTheme="majorHAnsi" w:hAnsiTheme="majorHAnsi"/>
+          <w:sz w:val="18"/>
+          <w:szCs w:val="18"/>
+        </w:rPr>
+      </w:pPr>
+      <w:r>
+        <w:rPr>
+          <w:rFonts w:asciiTheme="majorHAnsi" w:hAnsiTheme="majorHAnsi"/>
+          <w:sz w:val="18"/>
+          <w:szCs w:val="18"/>
+        </w:rPr>
+        <w:t xml:space="preserve">works </w:t>
       </w:r>
     </w:p>
     <w:p>
@@ -13773,9 +13283,7 @@
         <w:ind w:right="205" w:firstLine="360"/>
         <w:jc w:val="both"/>
         <w:rPr>
-          <w:rFonts w:asciiTheme="majorHAnsi" w:hAnsiTheme="majorHAnsi"/>
-          <w:sz w:val="18"/>
-          <w:szCs w:val="18"/>
+          <w:color w:val="4b92d9" w:themeColor="text2" w:themeTint="80"/>
         </w:rPr>
       </w:pPr>
       <w:r>
@@ -13786,1321 +13294,6 @@
         </w:rPr>
         <w:t xml:space="preserve">Liaise with adopting companies and ensure works are completed to the highest of standards. </w:t>
       </w:r>
-    </w:p>
-    <w:p>
-      <w:pPr>
-        <w:pStyle w:val="Heading2"/>
-        <w:ind w:left="701"/>
-        <w:rPr>
-          <w:color w:val="4b92d9" w:themeColor="text2" w:themeTint="80"/>
-        </w:rPr>
-      </w:pPr>
-    </w:p>
-    <w:p/>
-    <w:p>
-      <w:pPr>
-        <w:pStyle w:val="Heading2"/>
-        <w:ind w:left="701"/>
-        <w:rPr>
-          <w:color w:val="4b92d9" w:themeColor="text2" w:themeTint="80"/>
-        </w:rPr>
-      </w:pPr>
-      <w:r>
-        <w:rPr>
-          <w:color w:val="4b92d9" w:themeColor="text2" w:themeTint="80"/>
-        </w:rPr>
-        <w:t xml:space="preserve">Legal Documentation  </w:t>
-      </w:r>
-    </w:p>
-    <w:p/>
-    <w:p>
-      <w:pPr>
-        <w:spacing w:after="0" w:line="265" w:lineRule="auto"/>
-        <w:ind w:left="724" w:right="205" w:hanging="5"/>
-        <w:rPr>
-          <w:rFonts w:asciiTheme="majorHAnsi" w:hAnsiTheme="majorHAnsi"/>
-        </w:rPr>
-      </w:pPr>
-      <w:r>
-        <w:rPr>
-          <w:rFonts w:asciiTheme="majorHAnsi" w:hAnsiTheme="majorHAnsi"/>
-        </w:rPr>
-        <w:t xml:space="preserve">The below information is required to progress design approvals and allow the adopting companies to make contact to commence the legal process. To avoid unnecessary delays with legal matters please complete the following form. </w:t>
-      </w:r>
-    </w:p>
-    <w:tbl>
-      <w:tblPr>
-        <w:tblStyle w:val="TableGrid1"/>
-        <w:tblpPr w:leftFromText="180" w:rightFromText="180" w:vertAnchor="page" w:horzAnchor="margin" w:tblpY="4021"/>
-        <w:tblW w:w="9084" w:type="dxa"/>
-        <w:tblInd w:w="0" w:type="dxa"/>
-        <w:tblCellMar>
-          <w:top w:w="11" w:type="dxa"/>
-          <w:left w:w="114" w:type="dxa"/>
-          <w:right w:w="52" w:type="dxa"/>
-        </w:tblCellMar>
-        <w:tblLook w:val="04A0"/>
-      </w:tblPr>
-      <w:tblGrid>
-        <w:gridCol w:w="1206"/>
-        <w:gridCol w:w="73"/>
-        <w:gridCol w:w="2563"/>
-        <w:gridCol w:w="2574"/>
-        <w:gridCol w:w="2668"/>
-      </w:tblGrid>
-      <w:tr>
-        <w:trPr>
-          <w:trHeight w:val="428"/>
-        </w:trPr>
-        <w:tc>
-          <w:tcPr>
-            <w:cnfStyle w:val="101000000000"/>
-            <w:tcW w:w="1279" w:type="dxa"/>
-            <w:gridSpan w:val="2"/>
-            <w:tcBorders>
-              <w:top w:val="single" w:color="000000" w:sz="4" w:space="0"/>
-              <w:left w:val="single" w:color="000000" w:sz="4" w:space="0"/>
-              <w:bottom w:val="single" w:color="000000" w:sz="4" w:space="0"/>
-              <w:right w:val="single" w:color="000000" w:sz="4" w:space="0"/>
-            </w:tcBorders>
-            <w:shd w:val="clear" w:color="auto" w:fill="d9d9d9"/>
-          </w:tcPr>
-          <w:p>
-            <w:pPr>
-              <w:rPr>
-                <w:rFonts w:asciiTheme="majorHAnsi" w:hAnsiTheme="majorHAnsi"/>
-                <w:sz w:val="22"/>
-                <w:szCs w:val="22"/>
-              </w:rPr>
-            </w:pPr>
-          </w:p>
-        </w:tc>
-        <w:tc>
-          <w:tcPr>
-            <w:cnfStyle w:val="100000000000"/>
-            <w:tcW w:w="2563" w:type="dxa"/>
-            <w:tcBorders>
-              <w:top w:val="single" w:color="000000" w:sz="4" w:space="0"/>
-              <w:left w:val="single" w:color="000000" w:sz="4" w:space="0"/>
-              <w:bottom w:val="single" w:color="000000" w:sz="4" w:space="0"/>
-              <w:right w:val="single" w:color="000000" w:sz="4" w:space="0"/>
-            </w:tcBorders>
-            <w:shd w:val="clear" w:color="auto" w:fill="d9d9d9"/>
-          </w:tcPr>
-          <w:p>
-            <w:pPr>
-              <w:ind w:left="1055" w:hanging="972"/>
-              <w:rPr>
-                <w:rFonts w:asciiTheme="majorHAnsi" w:hAnsiTheme="majorHAnsi"/>
-                <w:sz w:val="22"/>
-                <w:szCs w:val="22"/>
-              </w:rPr>
-            </w:pPr>
-            <w:r>
-              <w:rPr>
-                <w:rFonts w:asciiTheme="majorHAnsi" w:hAnsiTheme="majorHAnsi"/>
-                <w:sz w:val="22"/>
-                <w:szCs w:val="22"/>
-              </w:rPr>
-              <w:t xml:space="preserve">Customer contact for general queries  </w:t>
-            </w:r>
-          </w:p>
-        </w:tc>
-        <w:tc>
-          <w:tcPr>
-            <w:cnfStyle w:val="100000000000"/>
-            <w:tcW w:w="2572" w:type="dxa"/>
-            <w:tcBorders>
-              <w:top w:val="single" w:color="000000" w:sz="4" w:space="0"/>
-              <w:left w:val="single" w:color="000000" w:sz="4" w:space="0"/>
-              <w:bottom w:val="single" w:color="000000" w:sz="4" w:space="0"/>
-              <w:right w:val="single" w:color="000000" w:sz="4" w:space="0"/>
-            </w:tcBorders>
-            <w:shd w:val="clear" w:color="auto" w:fill="d9d9d9"/>
-          </w:tcPr>
-          <w:p>
-            <w:pPr>
-              <w:ind w:right="66"/>
-              <w:jc w:val="center"/>
-              <w:rPr>
-                <w:rFonts w:asciiTheme="majorHAnsi" w:hAnsiTheme="majorHAnsi"/>
-                <w:sz w:val="22"/>
-                <w:szCs w:val="22"/>
-              </w:rPr>
-            </w:pPr>
-            <w:r>
-              <w:rPr>
-                <w:rFonts w:asciiTheme="majorHAnsi" w:hAnsiTheme="majorHAnsi"/>
-                <w:sz w:val="22"/>
-                <w:szCs w:val="22"/>
-              </w:rPr>
-              <w:t xml:space="preserve">Landowner Details  </w:t>
-            </w:r>
-          </w:p>
-        </w:tc>
-        <w:tc>
-          <w:tcPr>
-            <w:cnfStyle w:val="100000000000"/>
-            <w:tcW w:w="2668" w:type="dxa"/>
-            <w:tcBorders>
-              <w:top w:val="single" w:color="000000" w:sz="4" w:space="0"/>
-              <w:left w:val="single" w:color="000000" w:sz="4" w:space="0"/>
-              <w:bottom w:val="single" w:color="000000" w:sz="4" w:space="0"/>
-              <w:right w:val="single" w:color="000000" w:sz="4" w:space="0"/>
-            </w:tcBorders>
-            <w:shd w:val="clear" w:color="auto" w:fill="d9d9d9"/>
-          </w:tcPr>
-          <w:p>
-            <w:pPr>
-              <w:ind w:left="900" w:hanging="422"/>
-              <w:rPr>
-                <w:rFonts w:asciiTheme="majorHAnsi" w:hAnsiTheme="majorHAnsi"/>
-                <w:sz w:val="22"/>
-                <w:szCs w:val="22"/>
-              </w:rPr>
-            </w:pPr>
-            <w:r>
-              <w:rPr>
-                <w:rFonts w:asciiTheme="majorHAnsi" w:hAnsiTheme="majorHAnsi"/>
-                <w:sz w:val="22"/>
-                <w:szCs w:val="22"/>
-              </w:rPr>
-              <w:t xml:space="preserve">Solicitors acting for landowner  </w:t>
-            </w:r>
-          </w:p>
-        </w:tc>
-      </w:tr>
-      <w:tr>
-        <w:trPr>
-          <w:trHeight w:val="620"/>
-        </w:trPr>
-        <w:tc>
-          <w:tcPr>
-            <w:cnfStyle w:val="001000100000"/>
-            <w:tcW w:w="1279" w:type="dxa"/>
-            <w:gridSpan w:val="2"/>
-            <w:tcBorders>
-              <w:top w:val="single" w:color="000000" w:sz="4" w:space="0"/>
-              <w:left w:val="single" w:color="000000" w:sz="4" w:space="0"/>
-              <w:bottom w:val="single" w:color="000000" w:sz="4" w:space="0"/>
-              <w:right w:val="single" w:color="000000" w:sz="4" w:space="0"/>
-            </w:tcBorders>
-            <w:shd w:val="clear" w:color="auto" w:fill="d9d9d9"/>
-          </w:tcPr>
-          <w:p>
-            <w:pPr>
-              <w:rPr>
-                <w:rFonts w:asciiTheme="majorHAnsi" w:hAnsiTheme="majorHAnsi"/>
-                <w:sz w:val="22"/>
-                <w:szCs w:val="22"/>
-              </w:rPr>
-            </w:pPr>
-            <w:r>
-              <w:rPr>
-                <w:rFonts w:asciiTheme="majorHAnsi" w:hAnsiTheme="majorHAnsi"/>
-                <w:sz w:val="22"/>
-                <w:szCs w:val="22"/>
-              </w:rPr>
-              <w:t xml:space="preserve">Name  </w:t>
-            </w:r>
-          </w:p>
-        </w:tc>
-        <w:tc>
-          <w:tcPr>
-            <w:cnfStyle w:val="000000100000"/>
-            <w:tcW w:w="2563" w:type="dxa"/>
-            <w:tcBorders>
-              <w:top w:val="single" w:color="000000" w:sz="4" w:space="0"/>
-              <w:left w:val="single" w:color="000000" w:sz="4" w:space="0"/>
-              <w:bottom w:val="single" w:color="000000" w:sz="4" w:space="0"/>
-              <w:right w:val="single" w:color="000000" w:sz="4" w:space="0"/>
-            </w:tcBorders>
-          </w:tcPr>
-          <w:p>
-            <w:pPr>
-              <w:ind w:left="4"/>
-              <w:rPr>
-                <w:rFonts w:asciiTheme="majorHAnsi" w:hAnsiTheme="majorHAnsi"/>
-                <w:sz w:val="22"/>
-                <w:szCs w:val="22"/>
-              </w:rPr>
-            </w:pPr>
-            <w:r>
-              <w:rPr>
-                <w:rFonts w:asciiTheme="majorHAnsi" w:hAnsiTheme="majorHAnsi"/>
-                <w:sz w:val="22"/>
-                <w:szCs w:val="22"/>
-              </w:rPr>
-              <w:t xml:space="preserve"> </w:t>
-            </w:r>
-          </w:p>
-        </w:tc>
-        <w:tc>
-          <w:tcPr>
-            <w:cnfStyle w:val="000000100000"/>
-            <w:tcW w:w="2572" w:type="dxa"/>
-            <w:tcBorders>
-              <w:top w:val="single" w:color="000000" w:sz="4" w:space="0"/>
-              <w:left w:val="single" w:color="000000" w:sz="4" w:space="0"/>
-              <w:bottom w:val="single" w:color="000000" w:sz="4" w:space="0"/>
-              <w:right w:val="single" w:color="000000" w:sz="4" w:space="0"/>
-            </w:tcBorders>
-          </w:tcPr>
-          <w:p>
-            <w:pPr>
-              <w:ind w:left="4"/>
-              <w:rPr>
-                <w:rFonts w:asciiTheme="majorHAnsi" w:hAnsiTheme="majorHAnsi"/>
-                <w:sz w:val="22"/>
-                <w:szCs w:val="22"/>
-              </w:rPr>
-            </w:pPr>
-            <w:r>
-              <w:rPr>
-                <w:rFonts w:asciiTheme="majorHAnsi" w:hAnsiTheme="majorHAnsi"/>
-                <w:sz w:val="22"/>
-                <w:szCs w:val="22"/>
-              </w:rPr>
-              <w:t xml:space="preserve"> </w:t>
-            </w:r>
-          </w:p>
-        </w:tc>
-        <w:tc>
-          <w:tcPr>
-            <w:cnfStyle w:val="000000100000"/>
-            <w:tcW w:w="2668" w:type="dxa"/>
-            <w:tcBorders>
-              <w:top w:val="single" w:color="000000" w:sz="4" w:space="0"/>
-              <w:left w:val="single" w:color="000000" w:sz="4" w:space="0"/>
-              <w:bottom w:val="single" w:color="000000" w:sz="4" w:space="0"/>
-              <w:right w:val="single" w:color="000000" w:sz="4" w:space="0"/>
-            </w:tcBorders>
-          </w:tcPr>
-          <w:p>
-            <w:pPr>
-              <w:ind w:left="2"/>
-              <w:rPr>
-                <w:rFonts w:asciiTheme="majorHAnsi" w:hAnsiTheme="majorHAnsi"/>
-                <w:sz w:val="22"/>
-                <w:szCs w:val="22"/>
-              </w:rPr>
-            </w:pPr>
-            <w:r>
-              <w:rPr>
-                <w:rFonts w:asciiTheme="majorHAnsi" w:hAnsiTheme="majorHAnsi"/>
-                <w:sz w:val="22"/>
-                <w:szCs w:val="22"/>
-              </w:rPr>
-              <w:t xml:space="preserve"> </w:t>
-            </w:r>
-          </w:p>
-        </w:tc>
-      </w:tr>
-      <w:tr>
-        <w:trPr>
-          <w:trHeight w:val="739"/>
-        </w:trPr>
-        <w:tc>
-          <w:tcPr>
-            <w:cnfStyle w:val="001000010000"/>
-            <w:tcW w:w="1279" w:type="dxa"/>
-            <w:gridSpan w:val="2"/>
-            <w:tcBorders>
-              <w:top w:val="single" w:color="000000" w:sz="4" w:space="0"/>
-              <w:left w:val="single" w:color="000000" w:sz="4" w:space="0"/>
-              <w:bottom w:val="single" w:color="000000" w:sz="4" w:space="0"/>
-              <w:right w:val="single" w:color="000000" w:sz="4" w:space="0"/>
-            </w:tcBorders>
-            <w:shd w:val="clear" w:color="auto" w:fill="d9d9d9"/>
-          </w:tcPr>
-          <w:p>
-            <w:pPr>
-              <w:spacing w:after="2"/>
-              <w:ind w:right="13"/>
-              <w:rPr>
-                <w:rFonts w:asciiTheme="majorHAnsi" w:hAnsiTheme="majorHAnsi"/>
-                <w:sz w:val="22"/>
-                <w:szCs w:val="22"/>
-              </w:rPr>
-            </w:pPr>
-            <w:r>
-              <w:rPr>
-                <w:rFonts w:asciiTheme="majorHAnsi" w:hAnsiTheme="majorHAnsi"/>
-                <w:sz w:val="22"/>
-                <w:szCs w:val="22"/>
-              </w:rPr>
-              <w:t xml:space="preserve">Project Ref / Case </w:t>
-            </w:r>
-          </w:p>
-          <w:p>
-            <w:pPr>
-              <w:rPr>
-                <w:rFonts w:asciiTheme="majorHAnsi" w:hAnsiTheme="majorHAnsi"/>
-                <w:sz w:val="22"/>
-                <w:szCs w:val="22"/>
-              </w:rPr>
-            </w:pPr>
-            <w:r>
-              <w:rPr>
-                <w:rFonts w:asciiTheme="majorHAnsi" w:hAnsiTheme="majorHAnsi"/>
-                <w:sz w:val="22"/>
-                <w:szCs w:val="22"/>
-              </w:rPr>
-              <w:t xml:space="preserve">ref  </w:t>
-            </w:r>
-          </w:p>
-        </w:tc>
-        <w:tc>
-          <w:tcPr>
-            <w:cnfStyle w:val="000000010000"/>
-            <w:tcW w:w="2563" w:type="dxa"/>
-            <w:tcBorders>
-              <w:top w:val="single" w:color="000000" w:sz="4" w:space="0"/>
-              <w:left w:val="single" w:color="000000" w:sz="4" w:space="0"/>
-              <w:bottom w:val="single" w:color="000000" w:sz="4" w:space="0"/>
-              <w:right w:val="single" w:color="000000" w:sz="4" w:space="0"/>
-            </w:tcBorders>
-          </w:tcPr>
-          <w:p>
-            <w:pPr>
-              <w:ind w:left="4"/>
-              <w:rPr>
-                <w:rFonts w:asciiTheme="majorHAnsi" w:hAnsiTheme="majorHAnsi"/>
-                <w:sz w:val="22"/>
-                <w:szCs w:val="22"/>
-              </w:rPr>
-            </w:pPr>
-            <w:r>
-              <w:rPr>
-                <w:rFonts w:asciiTheme="majorHAnsi" w:hAnsiTheme="majorHAnsi"/>
-                <w:sz w:val="22"/>
-                <w:szCs w:val="22"/>
-              </w:rPr>
-              <w:t xml:space="preserve"> </w:t>
-            </w:r>
-          </w:p>
-        </w:tc>
-        <w:tc>
-          <w:tcPr>
-            <w:cnfStyle w:val="000000010000"/>
-            <w:tcW w:w="2572" w:type="dxa"/>
-            <w:tcBorders>
-              <w:top w:val="single" w:color="000000" w:sz="4" w:space="0"/>
-              <w:left w:val="single" w:color="000000" w:sz="4" w:space="0"/>
-              <w:bottom w:val="single" w:color="000000" w:sz="4" w:space="0"/>
-              <w:right w:val="single" w:color="000000" w:sz="4" w:space="0"/>
-            </w:tcBorders>
-          </w:tcPr>
-          <w:p>
-            <w:pPr>
-              <w:ind w:left="4"/>
-              <w:rPr>
-                <w:rFonts w:asciiTheme="majorHAnsi" w:hAnsiTheme="majorHAnsi"/>
-                <w:sz w:val="22"/>
-                <w:szCs w:val="22"/>
-              </w:rPr>
-            </w:pPr>
-            <w:r>
-              <w:rPr>
-                <w:rFonts w:asciiTheme="majorHAnsi" w:hAnsiTheme="majorHAnsi"/>
-                <w:sz w:val="22"/>
-                <w:szCs w:val="22"/>
-              </w:rPr>
-              <w:t xml:space="preserve"> </w:t>
-            </w:r>
-          </w:p>
-        </w:tc>
-        <w:tc>
-          <w:tcPr>
-            <w:cnfStyle w:val="000000010000"/>
-            <w:tcW w:w="2668" w:type="dxa"/>
-            <w:tcBorders>
-              <w:top w:val="single" w:color="000000" w:sz="4" w:space="0"/>
-              <w:left w:val="single" w:color="000000" w:sz="4" w:space="0"/>
-              <w:bottom w:val="single" w:color="000000" w:sz="4" w:space="0"/>
-              <w:right w:val="single" w:color="000000" w:sz="4" w:space="0"/>
-            </w:tcBorders>
-          </w:tcPr>
-          <w:p>
-            <w:pPr>
-              <w:ind w:left="2"/>
-              <w:rPr>
-                <w:rFonts w:asciiTheme="majorHAnsi" w:hAnsiTheme="majorHAnsi"/>
-                <w:sz w:val="22"/>
-                <w:szCs w:val="22"/>
-              </w:rPr>
-            </w:pPr>
-            <w:r>
-              <w:rPr>
-                <w:rFonts w:asciiTheme="majorHAnsi" w:hAnsiTheme="majorHAnsi"/>
-                <w:sz w:val="22"/>
-                <w:szCs w:val="22"/>
-              </w:rPr>
-              <w:t xml:space="preserve"> </w:t>
-            </w:r>
-          </w:p>
-        </w:tc>
-      </w:tr>
-      <w:tr>
-        <w:trPr>
-          <w:trHeight w:val="530"/>
-        </w:trPr>
-        <w:tc>
-          <w:tcPr>
-            <w:cnfStyle w:val="001000100000"/>
-            <w:tcW w:w="1279" w:type="dxa"/>
-            <w:gridSpan w:val="2"/>
-            <w:tcBorders>
-              <w:top w:val="single" w:color="000000" w:sz="4" w:space="0"/>
-              <w:left w:val="single" w:color="000000" w:sz="4" w:space="0"/>
-              <w:bottom w:val="single" w:color="000000" w:sz="4" w:space="0"/>
-              <w:right w:val="single" w:color="000000" w:sz="4" w:space="0"/>
-            </w:tcBorders>
-            <w:shd w:val="clear" w:color="auto" w:fill="d9d9d9"/>
-          </w:tcPr>
-          <w:p>
-            <w:pPr>
-              <w:rPr>
-                <w:rFonts w:asciiTheme="majorHAnsi" w:hAnsiTheme="majorHAnsi"/>
-                <w:sz w:val="22"/>
-                <w:szCs w:val="22"/>
-              </w:rPr>
-            </w:pPr>
-            <w:r>
-              <w:rPr>
-                <w:rFonts w:asciiTheme="majorHAnsi" w:hAnsiTheme="majorHAnsi"/>
-                <w:sz w:val="22"/>
-                <w:szCs w:val="22"/>
-              </w:rPr>
-              <w:t xml:space="preserve">Tel No.  </w:t>
-            </w:r>
-          </w:p>
-        </w:tc>
-        <w:tc>
-          <w:tcPr>
-            <w:cnfStyle w:val="000000100000"/>
-            <w:tcW w:w="2563" w:type="dxa"/>
-            <w:tcBorders>
-              <w:top w:val="single" w:color="000000" w:sz="4" w:space="0"/>
-              <w:left w:val="single" w:color="000000" w:sz="4" w:space="0"/>
-              <w:bottom w:val="single" w:color="000000" w:sz="4" w:space="0"/>
-              <w:right w:val="single" w:color="000000" w:sz="4" w:space="0"/>
-            </w:tcBorders>
-          </w:tcPr>
-          <w:p>
-            <w:pPr>
-              <w:ind w:left="4"/>
-              <w:rPr>
-                <w:rFonts w:asciiTheme="majorHAnsi" w:hAnsiTheme="majorHAnsi"/>
-                <w:sz w:val="22"/>
-                <w:szCs w:val="22"/>
-              </w:rPr>
-            </w:pPr>
-            <w:r>
-              <w:rPr>
-                <w:rFonts w:asciiTheme="majorHAnsi" w:hAnsiTheme="majorHAnsi"/>
-                <w:sz w:val="22"/>
-                <w:szCs w:val="22"/>
-              </w:rPr>
-              <w:t xml:space="preserve"> </w:t>
-            </w:r>
-          </w:p>
-        </w:tc>
-        <w:tc>
-          <w:tcPr>
-            <w:cnfStyle w:val="000000100000"/>
-            <w:tcW w:w="2572" w:type="dxa"/>
-            <w:tcBorders>
-              <w:top w:val="single" w:color="000000" w:sz="4" w:space="0"/>
-              <w:left w:val="single" w:color="000000" w:sz="4" w:space="0"/>
-              <w:bottom w:val="single" w:color="000000" w:sz="4" w:space="0"/>
-              <w:right w:val="single" w:color="000000" w:sz="4" w:space="0"/>
-            </w:tcBorders>
-          </w:tcPr>
-          <w:p>
-            <w:pPr>
-              <w:ind w:left="4"/>
-              <w:rPr>
-                <w:rFonts w:asciiTheme="majorHAnsi" w:hAnsiTheme="majorHAnsi"/>
-                <w:sz w:val="22"/>
-                <w:szCs w:val="22"/>
-              </w:rPr>
-            </w:pPr>
-            <w:r>
-              <w:rPr>
-                <w:rFonts w:asciiTheme="majorHAnsi" w:hAnsiTheme="majorHAnsi"/>
-                <w:sz w:val="22"/>
-                <w:szCs w:val="22"/>
-              </w:rPr>
-              <w:t xml:space="preserve"> </w:t>
-            </w:r>
-          </w:p>
-        </w:tc>
-        <w:tc>
-          <w:tcPr>
-            <w:cnfStyle w:val="000000100000"/>
-            <w:tcW w:w="2668" w:type="dxa"/>
-            <w:tcBorders>
-              <w:top w:val="single" w:color="000000" w:sz="4" w:space="0"/>
-              <w:left w:val="single" w:color="000000" w:sz="4" w:space="0"/>
-              <w:bottom w:val="single" w:color="000000" w:sz="4" w:space="0"/>
-              <w:right w:val="single" w:color="000000" w:sz="4" w:space="0"/>
-            </w:tcBorders>
-          </w:tcPr>
-          <w:p>
-            <w:pPr>
-              <w:ind w:left="2"/>
-              <w:rPr>
-                <w:rFonts w:asciiTheme="majorHAnsi" w:hAnsiTheme="majorHAnsi"/>
-                <w:sz w:val="22"/>
-                <w:szCs w:val="22"/>
-              </w:rPr>
-            </w:pPr>
-            <w:r>
-              <w:rPr>
-                <w:rFonts w:asciiTheme="majorHAnsi" w:hAnsiTheme="majorHAnsi"/>
-                <w:sz w:val="22"/>
-                <w:szCs w:val="22"/>
-              </w:rPr>
-              <w:t xml:space="preserve"> </w:t>
-            </w:r>
-          </w:p>
-        </w:tc>
-      </w:tr>
-      <w:tr>
-        <w:trPr>
-          <w:trHeight w:val="588"/>
-        </w:trPr>
-        <w:tc>
-          <w:tcPr>
-            <w:cnfStyle w:val="001000010000"/>
-            <w:tcW w:w="1279" w:type="dxa"/>
-            <w:gridSpan w:val="2"/>
-            <w:tcBorders>
-              <w:top w:val="single" w:color="000000" w:sz="4" w:space="0"/>
-              <w:left w:val="single" w:color="000000" w:sz="4" w:space="0"/>
-              <w:bottom w:val="single" w:color="000000" w:sz="4" w:space="0"/>
-              <w:right w:val="single" w:color="000000" w:sz="4" w:space="0"/>
-            </w:tcBorders>
-            <w:shd w:val="clear" w:color="auto" w:fill="d9d9d9"/>
-          </w:tcPr>
-          <w:p>
-            <w:pPr>
-              <w:ind w:right="51"/>
-              <w:rPr>
-                <w:rFonts w:asciiTheme="majorHAnsi" w:hAnsiTheme="majorHAnsi"/>
-                <w:sz w:val="22"/>
-                <w:szCs w:val="22"/>
-              </w:rPr>
-            </w:pPr>
-            <w:r>
-              <w:rPr>
-                <w:rFonts w:asciiTheme="majorHAnsi" w:hAnsiTheme="majorHAnsi"/>
-                <w:sz w:val="22"/>
-                <w:szCs w:val="22"/>
-              </w:rPr>
-              <w:t xml:space="preserve">Mobile No.  </w:t>
-            </w:r>
-          </w:p>
-        </w:tc>
-        <w:tc>
-          <w:tcPr>
-            <w:cnfStyle w:val="000000010000"/>
-            <w:tcW w:w="2563" w:type="dxa"/>
-            <w:tcBorders>
-              <w:top w:val="single" w:color="000000" w:sz="4" w:space="0"/>
-              <w:left w:val="single" w:color="000000" w:sz="4" w:space="0"/>
-              <w:bottom w:val="single" w:color="000000" w:sz="4" w:space="0"/>
-              <w:right w:val="single" w:color="000000" w:sz="4" w:space="0"/>
-            </w:tcBorders>
-          </w:tcPr>
-          <w:p>
-            <w:pPr>
-              <w:ind w:left="4"/>
-              <w:rPr>
-                <w:rFonts w:asciiTheme="majorHAnsi" w:hAnsiTheme="majorHAnsi"/>
-                <w:sz w:val="22"/>
-                <w:szCs w:val="22"/>
-              </w:rPr>
-            </w:pPr>
-            <w:r>
-              <w:rPr>
-                <w:rFonts w:asciiTheme="majorHAnsi" w:hAnsiTheme="majorHAnsi"/>
-                <w:sz w:val="22"/>
-                <w:szCs w:val="22"/>
-              </w:rPr>
-              <w:t xml:space="preserve"> </w:t>
-            </w:r>
-          </w:p>
-        </w:tc>
-        <w:tc>
-          <w:tcPr>
-            <w:cnfStyle w:val="000000010000"/>
-            <w:tcW w:w="2572" w:type="dxa"/>
-            <w:tcBorders>
-              <w:top w:val="single" w:color="000000" w:sz="4" w:space="0"/>
-              <w:left w:val="single" w:color="000000" w:sz="4" w:space="0"/>
-              <w:bottom w:val="single" w:color="000000" w:sz="4" w:space="0"/>
-              <w:right w:val="single" w:color="000000" w:sz="4" w:space="0"/>
-            </w:tcBorders>
-          </w:tcPr>
-          <w:p>
-            <w:pPr>
-              <w:ind w:left="4"/>
-              <w:rPr>
-                <w:rFonts w:asciiTheme="majorHAnsi" w:hAnsiTheme="majorHAnsi"/>
-                <w:sz w:val="22"/>
-                <w:szCs w:val="22"/>
-              </w:rPr>
-            </w:pPr>
-            <w:r>
-              <w:rPr>
-                <w:rFonts w:asciiTheme="majorHAnsi" w:hAnsiTheme="majorHAnsi"/>
-                <w:sz w:val="22"/>
-                <w:szCs w:val="22"/>
-              </w:rPr>
-              <w:t xml:space="preserve"> </w:t>
-            </w:r>
-          </w:p>
-        </w:tc>
-        <w:tc>
-          <w:tcPr>
-            <w:cnfStyle w:val="000000010000"/>
-            <w:tcW w:w="2668" w:type="dxa"/>
-            <w:tcBorders>
-              <w:top w:val="single" w:color="000000" w:sz="4" w:space="0"/>
-              <w:left w:val="single" w:color="000000" w:sz="4" w:space="0"/>
-              <w:bottom w:val="single" w:color="000000" w:sz="4" w:space="0"/>
-              <w:right w:val="single" w:color="000000" w:sz="4" w:space="0"/>
-            </w:tcBorders>
-          </w:tcPr>
-          <w:p>
-            <w:pPr>
-              <w:ind w:left="2"/>
-              <w:rPr>
-                <w:rFonts w:asciiTheme="majorHAnsi" w:hAnsiTheme="majorHAnsi"/>
-                <w:sz w:val="22"/>
-                <w:szCs w:val="22"/>
-              </w:rPr>
-            </w:pPr>
-            <w:r>
-              <w:rPr>
-                <w:rFonts w:asciiTheme="majorHAnsi" w:hAnsiTheme="majorHAnsi"/>
-                <w:sz w:val="22"/>
-                <w:szCs w:val="22"/>
-              </w:rPr>
-              <w:t xml:space="preserve"> </w:t>
-            </w:r>
-          </w:p>
-        </w:tc>
-      </w:tr>
-      <w:tr>
-        <w:trPr>
-          <w:trHeight w:val="692"/>
-        </w:trPr>
-        <w:tc>
-          <w:tcPr>
-            <w:cnfStyle w:val="001000100000"/>
-            <w:tcW w:w="1279" w:type="dxa"/>
-            <w:gridSpan w:val="2"/>
-            <w:tcBorders>
-              <w:top w:val="single" w:color="000000" w:sz="4" w:space="0"/>
-              <w:left w:val="single" w:color="000000" w:sz="4" w:space="0"/>
-              <w:bottom w:val="single" w:color="000000" w:sz="4" w:space="0"/>
-              <w:right w:val="single" w:color="000000" w:sz="4" w:space="0"/>
-            </w:tcBorders>
-            <w:shd w:val="clear" w:color="auto" w:fill="d9d9d9"/>
-          </w:tcPr>
-          <w:p>
-            <w:pPr>
-              <w:rPr>
-                <w:rFonts w:asciiTheme="majorHAnsi" w:hAnsiTheme="majorHAnsi"/>
-                <w:sz w:val="22"/>
-                <w:szCs w:val="22"/>
-              </w:rPr>
-            </w:pPr>
-            <w:r>
-              <w:rPr>
-                <w:rFonts w:asciiTheme="majorHAnsi" w:hAnsiTheme="majorHAnsi"/>
-                <w:sz w:val="22"/>
-                <w:szCs w:val="22"/>
-              </w:rPr>
-              <w:t xml:space="preserve">Email  </w:t>
-            </w:r>
-          </w:p>
-        </w:tc>
-        <w:tc>
-          <w:tcPr>
-            <w:cnfStyle w:val="000000100000"/>
-            <w:tcW w:w="2563" w:type="dxa"/>
-            <w:tcBorders>
-              <w:top w:val="single" w:color="000000" w:sz="4" w:space="0"/>
-              <w:left w:val="single" w:color="000000" w:sz="4" w:space="0"/>
-              <w:bottom w:val="single" w:color="000000" w:sz="4" w:space="0"/>
-              <w:right w:val="single" w:color="000000" w:sz="4" w:space="0"/>
-            </w:tcBorders>
-          </w:tcPr>
-          <w:p>
-            <w:pPr>
-              <w:ind w:left="4"/>
-              <w:rPr>
-                <w:rFonts w:asciiTheme="majorHAnsi" w:hAnsiTheme="majorHAnsi"/>
-                <w:sz w:val="22"/>
-                <w:szCs w:val="22"/>
-              </w:rPr>
-            </w:pPr>
-            <w:r>
-              <w:rPr>
-                <w:rFonts w:asciiTheme="majorHAnsi" w:hAnsiTheme="majorHAnsi"/>
-                <w:sz w:val="22"/>
-                <w:szCs w:val="22"/>
-              </w:rPr>
-              <w:t xml:space="preserve"> </w:t>
-            </w:r>
-          </w:p>
-        </w:tc>
-        <w:tc>
-          <w:tcPr>
-            <w:cnfStyle w:val="000000100000"/>
-            <w:tcW w:w="2572" w:type="dxa"/>
-            <w:tcBorders>
-              <w:top w:val="single" w:color="000000" w:sz="4" w:space="0"/>
-              <w:left w:val="single" w:color="000000" w:sz="4" w:space="0"/>
-              <w:bottom w:val="single" w:color="000000" w:sz="4" w:space="0"/>
-              <w:right w:val="single" w:color="000000" w:sz="4" w:space="0"/>
-            </w:tcBorders>
-          </w:tcPr>
-          <w:p>
-            <w:pPr>
-              <w:ind w:left="4"/>
-              <w:rPr>
-                <w:rFonts w:asciiTheme="majorHAnsi" w:hAnsiTheme="majorHAnsi"/>
-                <w:sz w:val="22"/>
-                <w:szCs w:val="22"/>
-              </w:rPr>
-            </w:pPr>
-            <w:r>
-              <w:rPr>
-                <w:rFonts w:asciiTheme="majorHAnsi" w:hAnsiTheme="majorHAnsi"/>
-                <w:sz w:val="22"/>
-                <w:szCs w:val="22"/>
-              </w:rPr>
-              <w:t xml:space="preserve"> </w:t>
-            </w:r>
-          </w:p>
-        </w:tc>
-        <w:tc>
-          <w:tcPr>
-            <w:cnfStyle w:val="000000100000"/>
-            <w:tcW w:w="2668" w:type="dxa"/>
-            <w:tcBorders>
-              <w:top w:val="single" w:color="000000" w:sz="4" w:space="0"/>
-              <w:left w:val="single" w:color="000000" w:sz="4" w:space="0"/>
-              <w:bottom w:val="single" w:color="000000" w:sz="4" w:space="0"/>
-              <w:right w:val="single" w:color="000000" w:sz="4" w:space="0"/>
-            </w:tcBorders>
-          </w:tcPr>
-          <w:p>
-            <w:pPr>
-              <w:ind w:left="2"/>
-              <w:rPr>
-                <w:rFonts w:asciiTheme="majorHAnsi" w:hAnsiTheme="majorHAnsi"/>
-                <w:sz w:val="22"/>
-                <w:szCs w:val="22"/>
-              </w:rPr>
-            </w:pPr>
-            <w:r>
-              <w:rPr>
-                <w:rFonts w:asciiTheme="majorHAnsi" w:hAnsiTheme="majorHAnsi"/>
-                <w:sz w:val="22"/>
-                <w:szCs w:val="22"/>
-              </w:rPr>
-              <w:t xml:space="preserve"> </w:t>
-            </w:r>
-          </w:p>
-        </w:tc>
-      </w:tr>
-      <w:tr>
-        <w:trPr>
-          <w:trHeight w:val="1052"/>
-        </w:trPr>
-        <w:tc>
-          <w:tcPr>
-            <w:cnfStyle w:val="001000010000"/>
-            <w:tcW w:w="1279" w:type="dxa"/>
-            <w:gridSpan w:val="2"/>
-            <w:tcBorders>
-              <w:top w:val="single" w:color="000000" w:sz="4" w:space="0"/>
-              <w:left w:val="single" w:color="000000" w:sz="4" w:space="0"/>
-              <w:bottom w:val="single" w:color="000000" w:sz="4" w:space="0"/>
-              <w:right w:val="single" w:color="000000" w:sz="4" w:space="0"/>
-            </w:tcBorders>
-            <w:shd w:val="clear" w:color="auto" w:fill="d9d9d9"/>
-          </w:tcPr>
-          <w:p>
-            <w:pPr>
-              <w:spacing w:after="1"/>
-              <w:rPr>
-                <w:rFonts w:asciiTheme="majorHAnsi" w:hAnsiTheme="majorHAnsi"/>
-                <w:sz w:val="22"/>
-                <w:szCs w:val="22"/>
-              </w:rPr>
-            </w:pPr>
-            <w:r>
-              <w:rPr>
-                <w:rFonts w:asciiTheme="majorHAnsi" w:hAnsiTheme="majorHAnsi"/>
-                <w:sz w:val="22"/>
-                <w:szCs w:val="22"/>
-              </w:rPr>
-              <w:t xml:space="preserve">Address &amp; </w:t>
-            </w:r>
-          </w:p>
-          <w:p>
-            <w:pPr>
-              <w:rPr>
-                <w:rFonts w:asciiTheme="majorHAnsi" w:hAnsiTheme="majorHAnsi"/>
-                <w:sz w:val="22"/>
-                <w:szCs w:val="22"/>
-              </w:rPr>
-            </w:pPr>
-            <w:r>
-              <w:rPr>
-                <w:rFonts w:asciiTheme="majorHAnsi" w:hAnsiTheme="majorHAnsi"/>
-                <w:sz w:val="22"/>
-                <w:szCs w:val="22"/>
-              </w:rPr>
-              <w:t xml:space="preserve">Postcode  </w:t>
-            </w:r>
-          </w:p>
-        </w:tc>
-        <w:tc>
-          <w:tcPr>
-            <w:cnfStyle w:val="000000010000"/>
-            <w:tcW w:w="2563" w:type="dxa"/>
-            <w:tcBorders>
-              <w:top w:val="single" w:color="000000" w:sz="4" w:space="0"/>
-              <w:left w:val="single" w:color="000000" w:sz="4" w:space="0"/>
-              <w:bottom w:val="single" w:color="000000" w:sz="4" w:space="0"/>
-              <w:right w:val="single" w:color="000000" w:sz="4" w:space="0"/>
-            </w:tcBorders>
-          </w:tcPr>
-          <w:p>
-            <w:pPr>
-              <w:ind w:left="4"/>
-              <w:rPr>
-                <w:rFonts w:asciiTheme="majorHAnsi" w:hAnsiTheme="majorHAnsi"/>
-                <w:sz w:val="22"/>
-                <w:szCs w:val="22"/>
-              </w:rPr>
-            </w:pPr>
-            <w:r>
-              <w:rPr>
-                <w:rFonts w:asciiTheme="majorHAnsi" w:hAnsiTheme="majorHAnsi"/>
-                <w:sz w:val="22"/>
-                <w:szCs w:val="22"/>
-              </w:rPr>
-              <w:t xml:space="preserve"> </w:t>
-            </w:r>
-          </w:p>
-        </w:tc>
-        <w:tc>
-          <w:tcPr>
-            <w:cnfStyle w:val="000000010000"/>
-            <w:tcW w:w="2572" w:type="dxa"/>
-            <w:tcBorders>
-              <w:top w:val="single" w:color="000000" w:sz="4" w:space="0"/>
-              <w:left w:val="single" w:color="000000" w:sz="4" w:space="0"/>
-              <w:bottom w:val="single" w:color="000000" w:sz="4" w:space="0"/>
-              <w:right w:val="single" w:color="000000" w:sz="4" w:space="0"/>
-            </w:tcBorders>
-          </w:tcPr>
-          <w:p>
-            <w:pPr>
-              <w:ind w:left="4"/>
-              <w:rPr>
-                <w:rFonts w:asciiTheme="majorHAnsi" w:hAnsiTheme="majorHAnsi"/>
-                <w:sz w:val="22"/>
-                <w:szCs w:val="22"/>
-              </w:rPr>
-            </w:pPr>
-            <w:r>
-              <w:rPr>
-                <w:rFonts w:asciiTheme="majorHAnsi" w:hAnsiTheme="majorHAnsi"/>
-                <w:sz w:val="22"/>
-                <w:szCs w:val="22"/>
-              </w:rPr>
-              <w:t xml:space="preserve"> </w:t>
-            </w:r>
-          </w:p>
-        </w:tc>
-        <w:tc>
-          <w:tcPr>
-            <w:cnfStyle w:val="000000010000"/>
-            <w:tcW w:w="2668" w:type="dxa"/>
-            <w:tcBorders>
-              <w:top w:val="single" w:color="000000" w:sz="4" w:space="0"/>
-              <w:left w:val="single" w:color="000000" w:sz="4" w:space="0"/>
-              <w:bottom w:val="single" w:color="000000" w:sz="4" w:space="0"/>
-              <w:right w:val="single" w:color="000000" w:sz="4" w:space="0"/>
-            </w:tcBorders>
-          </w:tcPr>
-          <w:p>
-            <w:pPr>
-              <w:ind w:left="2"/>
-              <w:rPr>
-                <w:rFonts w:asciiTheme="majorHAnsi" w:hAnsiTheme="majorHAnsi"/>
-                <w:sz w:val="22"/>
-                <w:szCs w:val="22"/>
-              </w:rPr>
-            </w:pPr>
-            <w:r>
-              <w:rPr>
-                <w:rFonts w:asciiTheme="majorHAnsi" w:hAnsiTheme="majorHAnsi"/>
-                <w:sz w:val="22"/>
-                <w:szCs w:val="22"/>
-              </w:rPr>
-              <w:t xml:space="preserve"> </w:t>
-            </w:r>
-          </w:p>
-        </w:tc>
-      </w:tr>
-      <w:tr>
-        <w:trPr>
-          <w:trHeight w:val="221"/>
-        </w:trPr>
-        <w:tc>
-          <w:tcPr>
-            <w:cnfStyle w:val="001000100000"/>
-            <w:tcW w:w="9084" w:type="dxa"/>
-            <w:gridSpan w:val="5"/>
-            <w:tcBorders>
-              <w:top w:val="single" w:color="000000" w:sz="4" w:space="0"/>
-              <w:left w:val="single" w:color="000000" w:sz="4" w:space="0"/>
-              <w:bottom w:val="single" w:color="000000" w:sz="4" w:space="0"/>
-              <w:right w:val="single" w:color="000000" w:sz="4" w:space="0"/>
-            </w:tcBorders>
-            <w:shd w:val="clear" w:color="auto" w:fill="d9d9d9"/>
-          </w:tcPr>
-          <w:p>
-            <w:pPr>
-              <w:ind w:right="153"/>
-              <w:jc w:val="center"/>
-              <w:rPr>
-                <w:rFonts w:asciiTheme="majorHAnsi" w:hAnsiTheme="majorHAnsi"/>
-                <w:sz w:val="22"/>
-                <w:szCs w:val="22"/>
-              </w:rPr>
-            </w:pPr>
-            <w:r>
-              <w:rPr>
-                <w:rFonts w:asciiTheme="majorHAnsi" w:hAnsiTheme="majorHAnsi"/>
-                <w:sz w:val="22"/>
-                <w:szCs w:val="22"/>
-              </w:rPr>
-              <w:t xml:space="preserve">I can confirm the above information is correct and I am authorised to sign on behalf of the customer  </w:t>
-            </w:r>
-          </w:p>
-        </w:tc>
-      </w:tr>
-      <w:tr>
-        <w:trPr>
-          <w:trHeight w:val="903"/>
-        </w:trPr>
-        <w:tc>
-          <w:tcPr>
-            <w:cnfStyle w:val="001000010000"/>
-            <w:tcW w:w="1206" w:type="dxa"/>
-            <w:tcBorders>
-              <w:top w:val="single" w:color="000000" w:sz="4" w:space="0"/>
-              <w:left w:val="single" w:color="000000" w:sz="4" w:space="0"/>
-              <w:bottom w:val="single" w:color="000000" w:sz="4" w:space="0"/>
-              <w:right w:val="single" w:color="000000" w:sz="4" w:space="0"/>
-            </w:tcBorders>
-            <w:shd w:val="clear" w:color="auto" w:fill="d9d9d9"/>
-          </w:tcPr>
-          <w:p>
-            <w:pPr>
-              <w:rPr>
-                <w:rFonts w:asciiTheme="majorHAnsi" w:hAnsiTheme="majorHAnsi"/>
-                <w:sz w:val="22"/>
-                <w:szCs w:val="22"/>
-              </w:rPr>
-            </w:pPr>
-            <w:r>
-              <w:rPr>
-                <w:rFonts w:asciiTheme="majorHAnsi" w:hAnsiTheme="majorHAnsi"/>
-                <w:sz w:val="22"/>
-                <w:szCs w:val="22"/>
-              </w:rPr>
-              <w:t xml:space="preserve">Name  </w:t>
-            </w:r>
-          </w:p>
-        </w:tc>
-        <w:tc>
-          <w:tcPr>
-            <w:cnfStyle w:val="000000010000"/>
-            <w:tcW w:w="7877" w:type="dxa"/>
-            <w:gridSpan w:val="4"/>
-            <w:tcBorders>
-              <w:top w:val="single" w:color="000000" w:sz="4" w:space="0"/>
-              <w:left w:val="single" w:color="000000" w:sz="4" w:space="0"/>
-              <w:bottom w:val="single" w:color="000000" w:sz="4" w:space="0"/>
-              <w:right w:val="single" w:color="000000" w:sz="4" w:space="0"/>
-            </w:tcBorders>
-          </w:tcPr>
-          <w:p>
-            <w:pPr>
-              <w:ind w:left="2"/>
-              <w:rPr>
-                <w:rFonts w:asciiTheme="majorHAnsi" w:hAnsiTheme="majorHAnsi"/>
-                <w:sz w:val="22"/>
-                <w:szCs w:val="22"/>
-              </w:rPr>
-            </w:pPr>
-            <w:r>
-              <w:rPr>
-                <w:rFonts w:asciiTheme="majorHAnsi" w:hAnsiTheme="majorHAnsi"/>
-                <w:sz w:val="22"/>
-                <w:szCs w:val="22"/>
-              </w:rPr>
-              <w:t xml:space="preserve"> </w:t>
-            </w:r>
-          </w:p>
-        </w:tc>
-      </w:tr>
-      <w:tr>
-        <w:trPr>
-          <w:trHeight w:val="862"/>
-        </w:trPr>
-        <w:tc>
-          <w:tcPr>
-            <w:cnfStyle w:val="001000100000"/>
-            <w:tcW w:w="1206" w:type="dxa"/>
-            <w:tcBorders>
-              <w:top w:val="single" w:color="000000" w:sz="4" w:space="0"/>
-              <w:left w:val="single" w:color="000000" w:sz="4" w:space="0"/>
-              <w:bottom w:val="single" w:color="000000" w:sz="4" w:space="0"/>
-              <w:right w:val="single" w:color="000000" w:sz="4" w:space="0"/>
-            </w:tcBorders>
-            <w:shd w:val="clear" w:color="auto" w:fill="d9d9d9"/>
-          </w:tcPr>
-          <w:p>
-            <w:pPr>
-              <w:rPr>
-                <w:rFonts w:asciiTheme="majorHAnsi" w:hAnsiTheme="majorHAnsi"/>
-                <w:sz w:val="22"/>
-                <w:szCs w:val="22"/>
-              </w:rPr>
-            </w:pPr>
-            <w:r>
-              <w:rPr>
-                <w:rFonts w:asciiTheme="majorHAnsi" w:hAnsiTheme="majorHAnsi"/>
-                <w:sz w:val="22"/>
-                <w:szCs w:val="22"/>
-              </w:rPr>
-              <w:t xml:space="preserve">Signed  </w:t>
-            </w:r>
-          </w:p>
-        </w:tc>
-        <w:tc>
-          <w:tcPr>
-            <w:cnfStyle w:val="000000100000"/>
-            <w:tcW w:w="7877" w:type="dxa"/>
-            <w:gridSpan w:val="4"/>
-            <w:tcBorders>
-              <w:top w:val="single" w:color="000000" w:sz="4" w:space="0"/>
-              <w:left w:val="single" w:color="000000" w:sz="4" w:space="0"/>
-              <w:bottom w:val="single" w:color="000000" w:sz="4" w:space="0"/>
-              <w:right w:val="single" w:color="000000" w:sz="4" w:space="0"/>
-            </w:tcBorders>
-          </w:tcPr>
-          <w:p>
-            <w:pPr>
-              <w:ind w:left="2"/>
-              <w:rPr>
-                <w:rFonts w:asciiTheme="majorHAnsi" w:hAnsiTheme="majorHAnsi"/>
-                <w:sz w:val="22"/>
-                <w:szCs w:val="22"/>
-              </w:rPr>
-            </w:pPr>
-            <w:r>
-              <w:rPr>
-                <w:rFonts w:asciiTheme="majorHAnsi" w:hAnsiTheme="majorHAnsi"/>
-                <w:sz w:val="22"/>
-                <w:szCs w:val="22"/>
-              </w:rPr>
-              <w:t xml:space="preserve"> </w:t>
-            </w:r>
-          </w:p>
-        </w:tc>
-      </w:tr>
-      <w:tr>
-        <w:trPr>
-          <w:trHeight w:val="968"/>
-        </w:trPr>
-        <w:tc>
-          <w:tcPr>
-            <w:cnfStyle w:val="001000010000"/>
-            <w:tcW w:w="1206" w:type="dxa"/>
-            <w:tcBorders>
-              <w:top w:val="single" w:color="000000" w:sz="4" w:space="0"/>
-              <w:left w:val="single" w:color="000000" w:sz="4" w:space="0"/>
-              <w:bottom w:val="single" w:color="000000" w:sz="4" w:space="0"/>
-              <w:right w:val="single" w:color="000000" w:sz="4" w:space="0"/>
-            </w:tcBorders>
-            <w:shd w:val="clear" w:color="auto" w:fill="d9d9d9"/>
-          </w:tcPr>
-          <w:p>
-            <w:pPr>
-              <w:rPr>
-                <w:rFonts w:asciiTheme="majorHAnsi" w:hAnsiTheme="majorHAnsi"/>
-                <w:sz w:val="22"/>
-                <w:szCs w:val="22"/>
-              </w:rPr>
-            </w:pPr>
-            <w:r>
-              <w:rPr>
-                <w:rFonts w:asciiTheme="majorHAnsi" w:hAnsiTheme="majorHAnsi"/>
-                <w:sz w:val="22"/>
-                <w:szCs w:val="22"/>
-              </w:rPr>
-              <w:t xml:space="preserve">Date  </w:t>
-            </w:r>
-          </w:p>
-        </w:tc>
-        <w:tc>
-          <w:tcPr>
-            <w:cnfStyle w:val="000000010000"/>
-            <w:tcW w:w="7877" w:type="dxa"/>
-            <w:gridSpan w:val="4"/>
-            <w:tcBorders>
-              <w:top w:val="single" w:color="000000" w:sz="4" w:space="0"/>
-              <w:left w:val="single" w:color="000000" w:sz="4" w:space="0"/>
-              <w:bottom w:val="single" w:color="000000" w:sz="4" w:space="0"/>
-              <w:right w:val="single" w:color="000000" w:sz="4" w:space="0"/>
-            </w:tcBorders>
-          </w:tcPr>
-          <w:p>
-            <w:pPr>
-              <w:ind w:left="2"/>
-              <w:rPr>
-                <w:rFonts w:asciiTheme="majorHAnsi" w:hAnsiTheme="majorHAnsi"/>
-                <w:sz w:val="22"/>
-                <w:szCs w:val="22"/>
-              </w:rPr>
-            </w:pPr>
-            <w:r>
-              <w:rPr>
-                <w:rFonts w:asciiTheme="majorHAnsi" w:hAnsiTheme="majorHAnsi"/>
-                <w:sz w:val="22"/>
-                <w:szCs w:val="22"/>
-              </w:rPr>
-              <w:t xml:space="preserve"> </w:t>
-            </w:r>
-          </w:p>
-        </w:tc>
-      </w:tr>
-      <w:tr>
-        <w:trPr>
-          <w:trHeight w:val="1069"/>
-        </w:trPr>
-        <w:tc>
-          <w:tcPr>
-            <w:cnfStyle w:val="001000100000"/>
-            <w:tcW w:w="1206" w:type="dxa"/>
-            <w:tcBorders>
-              <w:top w:val="single" w:color="000000" w:sz="4" w:space="0"/>
-              <w:left w:val="single" w:color="000000" w:sz="4" w:space="0"/>
-              <w:bottom w:val="single" w:color="000000" w:sz="4" w:space="0"/>
-              <w:right w:val="single" w:color="000000" w:sz="4" w:space="0"/>
-            </w:tcBorders>
-            <w:shd w:val="clear" w:color="auto" w:fill="d9d9d9"/>
-          </w:tcPr>
-          <w:p>
-            <w:pPr>
-              <w:rPr>
-                <w:rFonts w:asciiTheme="majorHAnsi" w:hAnsiTheme="majorHAnsi"/>
-                <w:sz w:val="22"/>
-                <w:szCs w:val="22"/>
-              </w:rPr>
-            </w:pPr>
-            <w:r>
-              <w:rPr>
-                <w:rFonts w:asciiTheme="majorHAnsi" w:hAnsiTheme="majorHAnsi"/>
-                <w:sz w:val="22"/>
-                <w:szCs w:val="22"/>
-              </w:rPr>
-              <w:t xml:space="preserve">Position  </w:t>
-            </w:r>
-          </w:p>
-        </w:tc>
-        <w:tc>
-          <w:tcPr>
-            <w:cnfStyle w:val="000000100000"/>
-            <w:tcW w:w="7877" w:type="dxa"/>
-            <w:gridSpan w:val="4"/>
-            <w:tcBorders>
-              <w:top w:val="single" w:color="000000" w:sz="4" w:space="0"/>
-              <w:left w:val="single" w:color="000000" w:sz="4" w:space="0"/>
-              <w:bottom w:val="single" w:color="000000" w:sz="4" w:space="0"/>
-              <w:right w:val="single" w:color="000000" w:sz="4" w:space="0"/>
-            </w:tcBorders>
-          </w:tcPr>
-          <w:p>
-            <w:pPr>
-              <w:ind w:left="2"/>
-              <w:rPr>
-                <w:rFonts w:asciiTheme="majorHAnsi" w:hAnsiTheme="majorHAnsi"/>
-                <w:sz w:val="22"/>
-                <w:szCs w:val="22"/>
-              </w:rPr>
-            </w:pPr>
-            <w:r>
-              <w:rPr>
-                <w:rFonts w:asciiTheme="majorHAnsi" w:hAnsiTheme="majorHAnsi"/>
-                <w:sz w:val="22"/>
-                <w:szCs w:val="22"/>
-              </w:rPr>
-              <w:t xml:space="preserve"> </w:t>
-            </w:r>
-          </w:p>
-        </w:tc>
-      </w:tr>
-    </w:tbl>
-    <w:p>
-      <w:pPr>
-        <w:rPr>
-          <w:color w:val="4b92d9" w:themeColor="text2" w:themeTint="80"/>
-        </w:rPr>
-      </w:pPr>
-    </w:p>
-    <w:p>
-      <w:pPr>
-        <w:rPr>
-          <w:color w:val="4b92d9" w:themeColor="text2" w:themeTint="80"/>
-        </w:rPr>
-      </w:pPr>
-    </w:p>
-    <w:p>
-      <w:pPr>
-        <w:rPr>
-          <w:color w:val="4b92d9" w:themeColor="text2" w:themeTint="80"/>
-        </w:rPr>
-      </w:pPr>
-    </w:p>
-    <w:p>
-      <w:pPr>
-        <w:rPr>
-          <w:color w:val="4b92d9" w:themeColor="text2" w:themeTint="80"/>
-        </w:rPr>
-      </w:pPr>
-    </w:p>
-    <w:p>
-      <w:pPr>
-        <w:rPr>
-          <w:color w:val="4b92d9" w:themeColor="text2" w:themeTint="80"/>
-        </w:rPr>
-      </w:pPr>
     </w:p>
     <w:p>
       <w:pPr>
@@ -15279,12 +13472,6 @@
           <w:rFonts w:asciiTheme="majorHAnsi" w:hAnsiTheme="majorHAnsi"/>
         </w:rPr>
       </w:pPr>
-      <w:r>
-        <w:rPr>
-          <w:rFonts w:asciiTheme="majorHAnsi" w:hAnsiTheme="majorHAnsi"/>
-        </w:rPr>
-        <w:t xml:space="preserve">           </w:t>
-      </w:r>
     </w:p>
     <w:p>
       <w:pPr>
@@ -15310,7 +13497,13 @@
         <w:rPr>
           <w:rFonts w:asciiTheme="majorHAnsi" w:hAnsiTheme="majorHAnsi"/>
         </w:rPr>
-        <w:t xml:space="preserve">           Reference: </w:t>
+        <w:t xml:space="preserve">         </w:t>
+      </w:r>
+      <w:r>
+        <w:rPr>
+          <w:rFonts w:asciiTheme="majorHAnsi" w:hAnsiTheme="majorHAnsi"/>
+        </w:rPr>
+        <w:t xml:space="preserve">  Reference: </w:t>
       </w:r>
       <w:r>
         <w:rPr>
@@ -15515,26 +13708,72 @@
     </w:p>
     <w:p>
       <w:pPr>
-        <w:pStyle w:val="Heading3"/>
-        <w:spacing w:after="121"/>
-        <w:ind w:left="717"/>
+        <w:framePr w:w="0" w:h="0" w:vAnchor="margin" w:hAnchor="text" w:x="0" w:y="0"/>
+        <w:pBdr>
+          <w:top w:val="none" w:sz="4" w:space="0"/>
+          <w:left w:val="none" w:sz="4" w:space="0"/>
+          <w:bottom w:val="none" w:sz="4" w:space="0"/>
+          <w:right w:val="none" w:sz="4" w:space="0"/>
+          <w:between w:val="none" w:sz="4" w:space="0"/>
+          <w:bar w:val="none" w:sz="4" w:space="0"/>
+        </w:pBdr>
+        <w:shd w:val="clear" w:fill="auto"/>
+        <w:bidi w:val="off"/>
+        <w:spacing w:before="0" w:after="0" w:line="240" w:lineRule="auto"/>
+        <w:ind w:left="0" w:right="0" w:firstLine="0"/>
+        <w:jc w:val="left"/>
+        <w:rPr>
+          <w:rFonts w:asciiTheme="majorHAnsi" w:hAnsiTheme="majorHAnsi"/>
+        </w:rPr>
+      </w:pPr>
+      <w:r>
         <w:rPr>
           <w:rFonts w:asciiTheme="majorHAnsi" w:hAnsiTheme="majorHAnsi"/>
           <w:color w:val="4b92d9" w:themeColor="text2" w:themeTint="80"/>
         </w:rPr>
-      </w:pPr>
-      <w:r>
+        <w:t xml:space="preserve">    Payment Total: </w:t>
+      </w:r>
+      <w:r>
+        <w:rPr>
+          <w:rFonts w:ascii="Segoe UI"/>
+          <w:color w:val="000000"/>
+          <w:sz w:val="18"/>
+          <w:rtl w:val="off"/>
+          <w:lang w:val="en-US"/>
+        </w:rPr>
+        <w:t>£{totalAmount} + {vatRate}% VAT</w:t>
+      </w:r>
+      <w:r>
+        <w:rPr>
+          <w:rFonts w:asciiTheme="majorHAnsi" w:hAnsiTheme="majorHAnsi"/>
+        </w:rPr>
+        <w:t xml:space="preserve">     </w:t>
+      </w:r>
+    </w:p>
+    <w:p>
+      <w:pPr>
+        <w:framePr w:w="0" w:h="0" w:vAnchor="margin" w:hAnchor="text" w:x="0" w:y="0"/>
+        <w:pBdr>
+          <w:top w:val="none" w:sz="4" w:space="0"/>
+          <w:left w:val="none" w:sz="4" w:space="0"/>
+          <w:bottom w:val="none" w:sz="4" w:space="0"/>
+          <w:right w:val="none" w:sz="4" w:space="0"/>
+          <w:between w:val="none" w:sz="4" w:space="0"/>
+          <w:bar w:val="none" w:sz="4" w:space="0"/>
+        </w:pBdr>
+        <w:shd w:val="clear" w:fill="auto"/>
+        <w:bidi w:val="off"/>
+        <w:spacing w:before="0" w:after="0" w:line="240" w:lineRule="auto"/>
+        <w:ind w:left="0" w:right="0" w:firstLine="0"/>
+        <w:jc w:val="left"/>
         <w:rPr>
           <w:rFonts w:asciiTheme="majorHAnsi" w:hAnsiTheme="majorHAnsi"/>
           <w:color w:val="4b92d9" w:themeColor="text2" w:themeTint="80"/>
         </w:rPr>
-        <w:t>Payment Total: £</w:t>
-      </w:r>
-      <w:r>
-        <w:rPr>
-          <w:rFonts w:asciiTheme="majorHAnsi" w:hAnsiTheme="majorHAnsi"/>
-          <w:b/>
-          <w:highlight w:val="yellow"/>
+      </w:pPr>
+      <w:r>
+        <w:rPr>
+          <w:rFonts w:asciiTheme="majorHAnsi" w:hAnsiTheme="majorHAnsi"/>
         </w:rPr>
         <w:t xml:space="preserve"> </w:t>
       </w:r>
@@ -15542,70 +13781,9 @@
         <w:rPr>
           <w:rFonts w:asciiTheme="majorHAnsi" w:hAnsiTheme="majorHAnsi"/>
           <w:color w:val="4b92d9" w:themeColor="text2" w:themeTint="80"/>
-          <w:highlight w:val="yellow"/>
-        </w:rPr>
-        <w:t>x</w:t>
-      </w:r>
-      <w:r>
-        <w:rPr>
-          <w:rFonts w:asciiTheme="majorHAnsi" w:hAnsiTheme="majorHAnsi"/>
-          <w:color w:val="4b92d9" w:themeColor="text2" w:themeTint="80"/>
-          <w:highlight w:val="yellow"/>
-        </w:rPr>
-        <w:t>xxxxx</w:t>
-      </w:r>
-      <w:r>
-        <w:rPr>
-          <w:rFonts w:asciiTheme="majorHAnsi" w:hAnsiTheme="majorHAnsi"/>
-          <w:color w:val="4b92d9" w:themeColor="text2" w:themeTint="80"/>
-          <w:highlight w:val="yellow"/>
-        </w:rPr>
-        <w:t>.xx</w:t>
-      </w:r>
-      <w:r>
-        <w:rPr>
-          <w:rFonts w:asciiTheme="majorHAnsi" w:hAnsiTheme="majorHAnsi"/>
-          <w:color w:val="4b92d9" w:themeColor="text2" w:themeTint="80"/>
+          <w:sz w:val="18"/>
         </w:rPr>
         <w:t xml:space="preserve"> </w:t>
-      </w:r>
-      <w:r>
-        <w:rPr>
-          <w:rFonts w:asciiTheme="majorHAnsi" w:hAnsiTheme="majorHAnsi"/>
-          <w:color w:val="4b92d9" w:themeColor="text2" w:themeTint="80"/>
-          <w:highlight w:val="yellow"/>
-        </w:rPr>
-        <w:t>Inc</w:t>
-      </w:r>
-      <w:r>
-        <w:rPr>
-          <w:rFonts w:asciiTheme="majorHAnsi" w:hAnsiTheme="majorHAnsi"/>
-          <w:color w:val="4b92d9" w:themeColor="text2" w:themeTint="80"/>
-        </w:rPr>
-        <w:t xml:space="preserve"> </w:t>
-      </w:r>
-      <w:r>
-        <w:rPr>
-          <w:rFonts w:asciiTheme="majorHAnsi" w:hAnsiTheme="majorHAnsi"/>
-          <w:color w:val="4b92d9" w:themeColor="text2" w:themeTint="80"/>
-          <w:highlight w:val="yellow"/>
-        </w:rPr>
-        <w:t>xx</w:t>
-      </w:r>
-      <w:r>
-        <w:rPr>
-          <w:rFonts w:asciiTheme="majorHAnsi" w:hAnsiTheme="majorHAnsi"/>
-          <w:color w:val="4b92d9" w:themeColor="text2" w:themeTint="80"/>
-        </w:rPr>
-        <w:t xml:space="preserve">% VAT </w:t>
-      </w:r>
-      <w:r>
-        <w:rPr>
-          <w:rFonts w:asciiTheme="majorHAnsi" w:hAnsiTheme="majorHAnsi"/>
-          <w:color w:val="4b92d9" w:themeColor="text2" w:themeTint="80"/>
-          <w:sz w:val="18"/>
-        </w:rPr>
-        <w:t xml:space="preserve">(where applicable) </w:t>
       </w:r>
     </w:p>
     <w:p>
@@ -15622,6 +13800,15 @@
         </w:rPr>
         <w:t xml:space="preserve">I/We accept the Utility Infrastructure Quotation referenced above, and hereby agree to the terms and conditions  </w:t>
       </w:r>
+    </w:p>
+    <w:p>
+      <w:pPr>
+        <w:spacing w:after="0" w:line="265" w:lineRule="auto"/>
+        <w:ind w:left="724" w:right="205" w:hanging="5"/>
+        <w:rPr>
+          <w:rFonts w:asciiTheme="majorHAnsi" w:hAnsiTheme="majorHAnsi"/>
+        </w:rPr>
+      </w:pPr>
     </w:p>
     <w:tbl>
       <w:tblPr>
@@ -15742,9 +13929,25 @@
           </w:tcPr>
           <w:p>
             <w:pPr>
-              <w:ind w:left="2"/>
-              <w:rPr>
-                <w:rFonts w:asciiTheme="majorHAnsi" w:hAnsiTheme="majorHAnsi"/>
+              <w:framePr w:w="0" w:h="0" w:vAnchor="margin" w:hAnchor="text" w:x="0" w:y="0"/>
+              <w:pBdr>
+                <w:top w:val="none" w:sz="4" w:space="0"/>
+                <w:left w:val="none" w:sz="4" w:space="0"/>
+                <w:bottom w:val="none" w:sz="4" w:space="0"/>
+                <w:right w:val="none" w:sz="4" w:space="0"/>
+                <w:between w:val="none" w:sz="4" w:space="0"/>
+                <w:bar w:val="none" w:sz="4" w:space="0"/>
+              </w:pBdr>
+              <w:shd w:val="clear" w:fill="auto"/>
+              <w:bidi w:val="off"/>
+              <w:spacing w:before="0" w:after="0" w:line="240" w:lineRule="auto"/>
+              <w:ind w:left="0" w:right="0" w:firstLine="0"/>
+              <w:jc w:val="left"/>
+              <w:rPr>
+                <w:rFonts w:ascii="Segoe UI"/>
+                <w:color w:val="000000"/>
+                <w:sz w:val="18"/>
+                <w:lang w:val="en-US"/>
               </w:rPr>
             </w:pPr>
             <w:r>
@@ -15753,6 +13956,23 @@
               </w:rPr>
               <w:t xml:space="preserve"> </w:t>
             </w:r>
+            <w:r>
+              <w:rPr>
+                <w:rFonts w:ascii="Segoe UI"/>
+                <w:color w:val="000000"/>
+                <w:sz w:val="18"/>
+                <w:rtl w:val="off"/>
+                <w:lang w:val="en-US"/>
+              </w:rPr>
+              <w:t>{acceptanceName}</w:t>
+            </w:r>
+          </w:p>
+          <w:p>
+            <w:pPr>
+              <w:rPr>
+                <w:rFonts w:asciiTheme="majorHAnsi" w:hAnsiTheme="majorHAnsi"/>
+              </w:rPr>
+            </w:pPr>
           </w:p>
         </w:tc>
       </w:tr>
@@ -15806,17 +14026,51 @@
           </w:tcPr>
           <w:p>
             <w:pPr>
+              <w:framePr w:w="0" w:h="0" w:vAnchor="margin" w:hAnchor="text" w:x="0" w:y="0"/>
+              <w:pBdr>
+                <w:top w:val="none" w:sz="4" w:space="0"/>
+                <w:left w:val="none" w:sz="4" w:space="0"/>
+                <w:bottom w:val="none" w:sz="4" w:space="0"/>
+                <w:right w:val="none" w:sz="4" w:space="0"/>
+                <w:between w:val="none" w:sz="4" w:space="0"/>
+                <w:bar w:val="none" w:sz="4" w:space="0"/>
+              </w:pBdr>
+              <w:shd w:val="clear" w:fill="auto"/>
+              <w:bidi w:val="off"/>
+              <w:spacing w:before="0" w:after="0" w:line="240" w:lineRule="auto"/>
+              <w:ind w:left="0" w:right="0" w:firstLine="0"/>
+              <w:jc w:val="left"/>
+              <w:rPr>
+                <w:rFonts w:ascii="Segoe UI"/>
+                <w:color w:val="000000"/>
+                <w:sz w:val="18"/>
+                <w:lang w:val="en-US"/>
+              </w:rPr>
+            </w:pPr>
+            <w:r>
+              <w:rPr>
+                <w:rFonts w:asciiTheme="majorHAnsi" w:hAnsiTheme="majorHAnsi"/>
+              </w:rPr>
+              <w:t xml:space="preserve"> </w:t>
+            </w:r>
+            <w:r>
+              <w:rPr>
+                <w:rFonts w:ascii="Segoe UI"/>
+                <w:color w:val="000000"/>
+                <w:sz w:val="18"/>
+                <w:rtl w:val="off"/>
+                <w:lang w:val="en-US"/>
+              </w:rPr>
+              <w:t>{signature}</w:t>
+            </w:r>
+          </w:p>
+          <w:p>
+            <w:pPr>
               <w:ind w:left="2"/>
               <w:rPr>
                 <w:rFonts w:asciiTheme="majorHAnsi" w:hAnsiTheme="majorHAnsi"/>
               </w:rPr>
             </w:pPr>
-            <w:r>
-              <w:rPr>
-                <w:rFonts w:asciiTheme="majorHAnsi" w:hAnsiTheme="majorHAnsi"/>
-              </w:rPr>
-              <w:t xml:space="preserve"> </w:t>
-            </w:r>
           </w:p>
         </w:tc>
       </w:tr>
@@ -15870,9 +14124,25 @@
           </w:tcPr>
           <w:p>
             <w:pPr>
-              <w:ind w:left="2"/>
-              <w:rPr>
-                <w:rFonts w:asciiTheme="majorHAnsi" w:hAnsiTheme="majorHAnsi"/>
+              <w:framePr w:w="0" w:h="0" w:vAnchor="margin" w:hAnchor="text" w:x="0" w:y="0"/>
+              <w:pBdr>
+                <w:top w:val="none" w:sz="4" w:space="0"/>
+                <w:left w:val="none" w:sz="4" w:space="0"/>
+                <w:bottom w:val="none" w:sz="4" w:space="0"/>
+                <w:right w:val="none" w:sz="4" w:space="0"/>
+                <w:between w:val="none" w:sz="4" w:space="0"/>
+                <w:bar w:val="none" w:sz="4" w:space="0"/>
+              </w:pBdr>
+              <w:shd w:val="clear" w:fill="auto"/>
+              <w:bidi w:val="off"/>
+              <w:spacing w:before="0" w:after="0" w:line="240" w:lineRule="auto"/>
+              <w:ind w:left="0" w:right="0" w:firstLine="0"/>
+              <w:jc w:val="left"/>
+              <w:rPr>
+                <w:rFonts w:ascii="Segoe UI"/>
+                <w:color w:val="000000"/>
+                <w:sz w:val="18"/>
+                <w:lang w:val="en-US"/>
               </w:rPr>
             </w:pPr>
             <w:r>
@@ -15881,6 +14151,23 @@
               </w:rPr>
               <w:t xml:space="preserve"> </w:t>
             </w:r>
+            <w:r>
+              <w:rPr>
+                <w:rFonts w:ascii="Segoe UI"/>
+                <w:color w:val="000000"/>
+                <w:sz w:val="18"/>
+                <w:rtl w:val="off"/>
+                <w:lang w:val="en-US"/>
+              </w:rPr>
+              <w:t>{acceptancePosition}</w:t>
+            </w:r>
+          </w:p>
+          <w:p>
+            <w:pPr>
+              <w:rPr>
+                <w:rFonts w:asciiTheme="majorHAnsi" w:hAnsiTheme="majorHAnsi"/>
+              </w:rPr>
+            </w:pPr>
           </w:p>
         </w:tc>
       </w:tr>
@@ -15934,17 +14221,51 @@
           </w:tcPr>
           <w:p>
             <w:pPr>
+              <w:framePr w:w="0" w:h="0" w:vAnchor="margin" w:hAnchor="text" w:x="0" w:y="0"/>
+              <w:pBdr>
+                <w:top w:val="none" w:sz="4" w:space="0"/>
+                <w:left w:val="none" w:sz="4" w:space="0"/>
+                <w:bottom w:val="none" w:sz="4" w:space="0"/>
+                <w:right w:val="none" w:sz="4" w:space="0"/>
+                <w:between w:val="none" w:sz="4" w:space="0"/>
+                <w:bar w:val="none" w:sz="4" w:space="0"/>
+              </w:pBdr>
+              <w:shd w:val="clear" w:fill="auto"/>
+              <w:bidi w:val="off"/>
+              <w:spacing w:before="0" w:after="0" w:line="240" w:lineRule="auto"/>
+              <w:ind w:left="0" w:right="0" w:firstLine="0"/>
+              <w:jc w:val="left"/>
+              <w:rPr>
+                <w:rFonts w:ascii="Segoe UI"/>
+                <w:color w:val="000000"/>
+                <w:sz w:val="18"/>
+                <w:lang w:val="en-US"/>
+              </w:rPr>
+            </w:pPr>
+            <w:r>
+              <w:rPr>
+                <w:rFonts w:asciiTheme="majorHAnsi" w:hAnsiTheme="majorHAnsi"/>
+              </w:rPr>
+              <w:t xml:space="preserve"> </w:t>
+            </w:r>
+            <w:r>
+              <w:rPr>
+                <w:rFonts w:ascii="Segoe UI"/>
+                <w:color w:val="000000"/>
+                <w:sz w:val="18"/>
+                <w:rtl w:val="off"/>
+                <w:lang w:val="en-US"/>
+              </w:rPr>
+              <w:t>{acceptanceContactNumbers}</w:t>
+            </w:r>
+          </w:p>
+          <w:p>
+            <w:pPr>
               <w:ind w:left="2"/>
               <w:rPr>
                 <w:rFonts w:asciiTheme="majorHAnsi" w:hAnsiTheme="majorHAnsi"/>
               </w:rPr>
             </w:pPr>
-            <w:r>
-              <w:rPr>
-                <w:rFonts w:asciiTheme="majorHAnsi" w:hAnsiTheme="majorHAnsi"/>
-              </w:rPr>
-              <w:t xml:space="preserve"> </w:t>
-            </w:r>
           </w:p>
         </w:tc>
       </w:tr>
@@ -15998,17 +14319,51 @@
           </w:tcPr>
           <w:p>
             <w:pPr>
+              <w:framePr w:w="0" w:h="0" w:vAnchor="margin" w:hAnchor="text" w:x="0" w:y="0"/>
+              <w:pBdr>
+                <w:top w:val="none" w:sz="4" w:space="0"/>
+                <w:left w:val="none" w:sz="4" w:space="0"/>
+                <w:bottom w:val="none" w:sz="4" w:space="0"/>
+                <w:right w:val="none" w:sz="4" w:space="0"/>
+                <w:between w:val="none" w:sz="4" w:space="0"/>
+                <w:bar w:val="none" w:sz="4" w:space="0"/>
+              </w:pBdr>
+              <w:shd w:val="clear" w:fill="auto"/>
+              <w:bidi w:val="off"/>
+              <w:spacing w:before="0" w:after="0" w:line="240" w:lineRule="auto"/>
+              <w:ind w:left="0" w:right="0" w:firstLine="0"/>
+              <w:jc w:val="left"/>
+              <w:rPr>
+                <w:rFonts w:ascii="Segoe UI"/>
+                <w:color w:val="000000"/>
+                <w:sz w:val="18"/>
+                <w:lang w:val="en-US"/>
+              </w:rPr>
+            </w:pPr>
+            <w:r>
+              <w:rPr>
+                <w:rFonts w:asciiTheme="majorHAnsi" w:hAnsiTheme="majorHAnsi"/>
+              </w:rPr>
+              <w:t xml:space="preserve"> </w:t>
+            </w:r>
+            <w:r>
+              <w:rPr>
+                <w:rFonts w:ascii="Segoe UI"/>
+                <w:color w:val="000000"/>
+                <w:sz w:val="18"/>
+                <w:rtl w:val="off"/>
+                <w:lang w:val="en-US"/>
+              </w:rPr>
+              <w:t>{acceptanceEmail}</w:t>
+            </w:r>
+          </w:p>
+          <w:p>
+            <w:pPr>
               <w:ind w:left="2"/>
               <w:rPr>
                 <w:rFonts w:asciiTheme="majorHAnsi" w:hAnsiTheme="majorHAnsi"/>
               </w:rPr>
             </w:pPr>
-            <w:r>
-              <w:rPr>
-                <w:rFonts w:asciiTheme="majorHAnsi" w:hAnsiTheme="majorHAnsi"/>
-              </w:rPr>
-              <w:t xml:space="preserve"> </w:t>
-            </w:r>
           </w:p>
         </w:tc>
       </w:tr>
@@ -16062,17 +14417,54 @@
           </w:tcPr>
           <w:p>
             <w:pPr>
+              <w:framePr w:w="0" w:h="0" w:vAnchor="margin" w:hAnchor="text" w:x="0" w:y="0"/>
+              <w:pBdr>
+                <w:top w:val="none" w:sz="4" w:space="0"/>
+                <w:left w:val="none" w:sz="4" w:space="0"/>
+                <w:bottom w:val="none" w:sz="4" w:space="0"/>
+                <w:right w:val="none" w:sz="4" w:space="0"/>
+                <w:between w:val="none" w:sz="4" w:space="0"/>
+                <w:bar w:val="none" w:sz="4" w:space="0"/>
+              </w:pBdr>
+              <w:shd w:val="clear" w:fill="auto"/>
+              <w:tabs>
+                <w:tab w:val="left" w:pos="720"/>
+              </w:tabs>
+              <w:bidi w:val="off"/>
+              <w:spacing w:before="0" w:after="0" w:line="240" w:lineRule="auto"/>
+              <w:ind w:right="0"/>
+              <w:jc w:val="left"/>
+              <w:rPr>
+                <w:rFonts w:ascii="Segoe UI"/>
+                <w:color w:val="000000"/>
+                <w:sz w:val="18"/>
+                <w:lang w:val="en-US"/>
+              </w:rPr>
+            </w:pPr>
+            <w:r>
+              <w:rPr>
+                <w:rFonts w:asciiTheme="majorHAnsi" w:hAnsiTheme="majorHAnsi"/>
+              </w:rPr>
+              <w:t xml:space="preserve"> </w:t>
+            </w:r>
+            <w:r>
+              <w:rPr>
+                <w:rFonts w:ascii="Segoe UI"/>
+                <w:color w:val="000000"/>
+                <w:sz w:val="18"/>
+                <w:rtl w:val="off"/>
+                <w:lang w:val="en-US"/>
+              </w:rPr>
+              <w:t>{acceptanceAnticipatedStartDate}</w:t>
+            </w:r>
+          </w:p>
+          <w:p>
+            <w:pPr>
               <w:ind w:left="2"/>
               <w:rPr>
                 <w:rFonts w:asciiTheme="majorHAnsi" w:hAnsiTheme="majorHAnsi"/>
               </w:rPr>
             </w:pPr>
-            <w:r>
-              <w:rPr>
-                <w:rFonts w:asciiTheme="majorHAnsi" w:hAnsiTheme="majorHAnsi"/>
-              </w:rPr>
-              <w:t xml:space="preserve"> </w:t>
-            </w:r>
           </w:p>
         </w:tc>
       </w:tr>
@@ -16126,21 +14518,67 @@
           </w:tcPr>
           <w:p>
             <w:pPr>
+              <w:framePr w:w="0" w:h="0" w:vAnchor="margin" w:hAnchor="text" w:x="0" w:y="0"/>
+              <w:pBdr>
+                <w:top w:val="none" w:sz="4" w:space="0"/>
+                <w:left w:val="none" w:sz="4" w:space="0"/>
+                <w:bottom w:val="none" w:sz="4" w:space="0"/>
+                <w:right w:val="none" w:sz="4" w:space="0"/>
+                <w:between w:val="none" w:sz="4" w:space="0"/>
+                <w:bar w:val="none" w:sz="4" w:space="0"/>
+              </w:pBdr>
+              <w:shd w:val="clear" w:fill="auto"/>
+              <w:tabs>
+                <w:tab w:val="left" w:pos="720"/>
+              </w:tabs>
+              <w:bidi w:val="off"/>
+              <w:spacing w:before="0" w:after="0" w:line="240" w:lineRule="auto"/>
+              <w:ind w:right="0"/>
+              <w:jc w:val="left"/>
+              <w:rPr>
+                <w:rFonts w:ascii="Segoe UI"/>
+                <w:color w:val="000000"/>
+                <w:sz w:val="18"/>
+                <w:lang w:val="en-US"/>
+              </w:rPr>
+            </w:pPr>
+            <w:r>
+              <w:rPr>
+                <w:rFonts w:asciiTheme="majorHAnsi" w:hAnsiTheme="majorHAnsi"/>
+              </w:rPr>
+              <w:t xml:space="preserve"> </w:t>
+            </w:r>
+            <w:r>
+              <w:rPr>
+                <w:rFonts w:ascii="Segoe UI"/>
+                <w:color w:val="000000"/>
+                <w:sz w:val="18"/>
+                <w:rtl w:val="off"/>
+                <w:lang w:val="en-US"/>
+              </w:rPr>
+              <w:t>{acceptanceSiteContact}</w:t>
+            </w:r>
+          </w:p>
+          <w:p>
+            <w:pPr>
               <w:ind w:left="2"/>
               <w:rPr>
                 <w:rFonts w:asciiTheme="majorHAnsi" w:hAnsiTheme="majorHAnsi"/>
               </w:rPr>
             </w:pPr>
-            <w:r>
-              <w:rPr>
-                <w:rFonts w:asciiTheme="majorHAnsi" w:hAnsiTheme="majorHAnsi"/>
-              </w:rPr>
-              <w:t xml:space="preserve"> </w:t>
-            </w:r>
           </w:p>
         </w:tc>
       </w:tr>
     </w:tbl>
+    <w:p>
+      <w:pPr>
+        <w:spacing w:after="75" w:line="265" w:lineRule="auto"/>
+        <w:ind w:left="724" w:right="205" w:hanging="5"/>
+        <w:rPr>
+          <w:rFonts w:asciiTheme="majorHAnsi" w:hAnsiTheme="majorHAnsi"/>
+        </w:rPr>
+      </w:pPr>
+    </w:p>
     <w:p>
       <w:pPr>
         <w:spacing w:after="75" w:line="265" w:lineRule="auto"/>
@@ -16225,7 +14663,7 @@
               <wp:extent cx="4710176" cy="722630"/>
               <wp:effectExtent l="0" t="0" r="0" b="0"/>
               <wp:wrapSquare wrapText="bothSides"/>
-              <wp:docPr id="1066330373" name="Group 19431"/>
+              <wp:docPr id="1066330383" name="Group 19431"/>
               <wp:cNvGraphicFramePr>
                 <a:graphicFrameLocks xmlns:a="http://schemas.openxmlformats.org/drawingml/2006/main"/>
               </wp:cNvGraphicFramePr>
@@ -16650,60 +15088,60 @@
         </mc:Choice>
         <mc:Fallback>
           <w:pict>
-            <v:group id="BB512C47-B40F-7581-34877B41F621" coordsize="4710176,722630" style="position:absolute;width:370.88pt;height:56.9pt;margin-top:0pt;margin-left:0pt;mso-wrap-distance-left:9pt;mso-wrap-distance-right:9pt;mso-wrap-distance-top:0pt;mso-wrap-distance-bottom:0pt;mso-position-horizontal:center;mso-position-horizontal-relative:margin;mso-position-vertical:bottom;mso-position-vertical-relative:page;rotation:0.000000;z-index:251661312;">
-              <v:rect id="076CA1BB-CC4B-7A1A-8BDFE91052FF" style="width:1891284;height:190500;left:0;top:17907;rotation:0.000000;" stroked="f" o:spt="75">
+            <v:group id="2A6C5515-E58B-23C7-80285D757951" coordsize="4710176,722630" style="position:absolute;width:370.88pt;height:56.9pt;margin-top:0pt;margin-left:0pt;mso-wrap-distance-left:9pt;mso-wrap-distance-right:9pt;mso-wrap-distance-top:0pt;mso-wrap-distance-bottom:0pt;mso-position-horizontal:center;mso-position-horizontal-relative:margin;mso-position-vertical:bottom;mso-position-vertical-relative:page;rotation:0.000000;z-index:251661312;">
+              <v:rect id="5CEDFFC5-7EDA-18F8-350873245103" style="width:1891284;height:190500;left:0;top:17907;rotation:0.000000;" stroked="f" o:spt="75">
                 <v:imagedata r:id="rId17" o:title=""/>
                 <o:lock/>
               </v:rect>
-              <v:shape id="44C127E5-0CEF-0EFB-F9E703CB42F7" coordsize="21600,21600" style="width:1903278;height:142889;left:305;top:44422;rotation:0.000000;" stroked="f" o:spt="1" path="m0,0 l0,21600 r21600,0 l21600,0 x e">
+              <v:shape id="18F16FF5-6BFF-DC37-8F8C6649EB33" coordsize="21600,21600" style="width:1903278;height:142889;left:305;top:44422;rotation:0.000000;" stroked="f" o:spt="1" path="m0,0 l0,21600 r21600,0 l21600,0 x e">
                 <o:lock/>
               </v:shape>
-              <v:shape id="9955C9C6-285A-8661-66742EFAF4E8" coordsize="21600,21600" style="width:42236;height:169501;left:1429766;top:24194;rotation:0.000000;" stroked="f" o:spt="1" path="m0,0 l0,21600 r21600,0 l21600,0 x e">
+              <v:shape id="4FE76486-F2F5-87C9-724216E42528" coordsize="21600,21600" style="width:42236;height:169501;left:1429766;top:24194;rotation:0.000000;" stroked="f" o:spt="1" path="m0,0 l0,21600 r21600,0 l21600,0 x e">
                 <o:lock/>
               </v:shape>
-              <v:rect id="29DDDD76-0451-D265-94D40EDBA551" style="width:463296;height:190500;left:1421892;top:17907;rotation:0.000000;" stroked="f" o:spt="75">
+              <v:rect id="2BAF0A5B-4DB1-5D2A-6A67DAD36859" style="width:463296;height:190500;left:1421892;top:17907;rotation:0.000000;" stroked="f" o:spt="75">
                 <v:imagedata r:id="rId18" o:title=""/>
                 <o:lock/>
               </v:rect>
-              <v:shape id="B8B71FA0-94C9-D1FA-2B1BC8A17442" coordsize="21600,21600" style="width:465938;height:142889;left:1422146;top:44422;rotation:0.000000;" stroked="f" o:spt="1" path="m0,0 l0,21600 r21600,0 l21600,0 x e">
+              <v:shape id="C3E38407-0644-1C9F-5D3C1C91F72F" coordsize="21600,21600" style="width:465938;height:142889;left:1422146;top:44422;rotation:0.000000;" stroked="f" o:spt="1" path="m0,0 l0,21600 r21600,0 l21600,0 x e">
                 <o:lock/>
               </v:shape>
-              <v:shape id="80A3E14F-176A-1604-30792A3D40D7" coordsize="21600,21600" style="width:42236;height:169501;left:1771523;top:24194;rotation:0.000000;" stroked="f" o:spt="1" path="m0,0 l0,21600 r21600,0 l21600,0 x e">
+              <v:shape id="927E153A-BDE3-67CE-C5D7520C926A" coordsize="21600,21600" style="width:42236;height:169501;left:1771523;top:24194;rotation:0.000000;" stroked="f" o:spt="1" path="m0,0 l0,21600 r21600,0 l21600,0 x e">
                 <o:lock/>
               </v:shape>
-              <v:rect id="7163465F-616C-E301-20302549BE08" style="width:377952;height:190500;left:1770888;top:17907;rotation:0.000000;" stroked="f" o:spt="75">
+              <v:rect id="27764DA6-701F-F97B-6E7ECBC2502E" style="width:377952;height:190500;left:1770888;top:17907;rotation:0.000000;" stroked="f" o:spt="75">
                 <v:imagedata r:id="rId19" o:title=""/>
                 <o:lock/>
               </v:rect>
-              <v:shape id="831CD9BD-E092-9EFD-C94B569EA7C2" coordsize="21600,21600" style="width:382784;height:142889;left:1771523;top:44422;rotation:0.000000;" stroked="f" o:spt="1" path="m0,0 l0,21600 r21600,0 l21600,0 x e">
+              <v:shape id="A64F7B70-089B-1ACA-69D9A149D064" coordsize="21600,21600" style="width:382784;height:142889;left:1771523;top:44422;rotation:0.000000;" stroked="f" o:spt="1" path="m0,0 l0,21600 r21600,0 l21600,0 x e">
                 <o:lock/>
               </v:shape>
-              <v:shape id="81983CDB-AEA0-07B2-D028E520C708" coordsize="21600,21600" style="width:42236;height:169501;left:2058035;top:24194;rotation:0.000000;" stroked="f" o:spt="1" path="m0,0 l0,21600 r21600,0 l21600,0 x e">
+              <v:shape id="E8B8F769-4E16-D833-B005C07221F1" coordsize="21600,21600" style="width:42236;height:169501;left:2058035;top:24194;rotation:0.000000;" stroked="f" o:spt="1" path="m0,0 l0,21600 r21600,0 l21600,0 x e">
                 <o:lock/>
               </v:shape>
-              <v:rect id="A9713889-7DA7-BB52-5C264D798444" style="width:42672;height:190500;left:2054352;top:17907;rotation:0.000000;" stroked="f" o:spt="75">
+              <v:rect id="0B34F11E-E86F-B62F-DF8E9FFD1826" style="width:42672;height:190500;left:2054352;top:17907;rotation:0.000000;" stroked="f" o:spt="75">
                 <v:imagedata r:id="rId20" o:title=""/>
                 <o:lock/>
               </v:rect>
-              <v:shape id="7B269041-21C8-091C-08240B53F5B9" coordsize="21600,21600" style="width:42261;height:142889;left:2054987;top:44422;rotation:0.000000;" stroked="f" o:spt="1" path="m0,0 l0,21600 r21600,0 l21600,0 x e">
+              <v:shape id="E38CF6D1-42EC-EC11-7A33F705C997" coordsize="21600,21600" style="width:42261;height:142889;left:2054987;top:44422;rotation:0.000000;" stroked="f" o:spt="1" path="m0,0 l0,21600 r21600,0 l21600,0 x e">
                 <o:lock/>
               </v:shape>
-              <v:shape id="CA52BC79-5C34-E355-1B13B7586DD8" coordsize="21600,21600" style="width:42236;height:169501;left:2086991;top:24194;rotation:0.000000;" stroked="f" o:spt="1" path="m0,0 l0,21600 r21600,0 l21600,0 x e">
+              <v:shape id="7A864F4B-BB87-FC45-734E540CAEC3" coordsize="21600,21600" style="width:42236;height:169501;left:2086991;top:24194;rotation:0.000000;" stroked="f" o:spt="1" path="m0,0 l0,21600 r21600,0 l21600,0 x e">
                 <o:lock/>
               </v:shape>
-              <v:rect id="91355481-D2C2-F0E9-2F999CC4AB13" style="width:1337310;height:677545;left:3372866;top:35561;rotation:0.000000;" stroked="f" o:spt="75">
+              <v:rect id="F41F1950-E806-BCF1-5E545E7D16A8" style="width:1337310;height:677545;left:3372866;top:35561;rotation:0.000000;" stroked="f" o:spt="75">
                 <v:imagedata r:id="rId21" o:title=""/>
                 <o:lock/>
               </v:rect>
-              <v:rect id="3117D43B-3AEA-297A-F8FF9C6A43DB" style="width:861682;height:722630;left:596138;top:0;rotation:0.000000;" stroked="f" o:spt="75">
+              <v:rect id="31F9C835-DE11-9A76-0054DC9AECD6" style="width:861682;height:722630;left:596138;top:0;rotation:0.000000;" stroked="f" o:spt="75">
                 <v:imagedata r:id="rId22" o:title=""/>
                 <o:lock/>
               </v:rect>
-              <v:rect id="4EEDD1B0-EE69-8A14-B0A28E80E7E3" style="width:985507;height:318770;left:1516761;top:194311;rotation:0.000000;" stroked="f" o:spt="75">
+              <v:rect id="094A48FC-FB2C-C24C-CE25B09158DF" style="width:985507;height:318770;left:1516761;top:194311;rotation:0.000000;" stroked="f" o:spt="75">
                 <v:imagedata r:id="rId23" o:title=""/>
                 <o:lock/>
               </v:rect>
-              <v:rect id="357FF21D-A3AB-1A57-8C522A849477" style="width:940422;height:306705;left:2580386;top:203213;rotation:0.000000;" stroked="f" o:spt="75">
+              <v:rect id="BE928B5C-6B13-53AF-241A3FDA33BD" style="width:940422;height:306705;left:2580386;top:203213;rotation:0.000000;" stroked="f" o:spt="75">
                 <v:imagedata r:id="rId24" o:title=""/>
                 <o:lock/>
               </v:rect>
@@ -16768,7 +15206,7 @@
           <wp:extent cx="1200150" cy="384797"/>
           <wp:effectExtent l="0" t="0" r="0" b="0"/>
           <wp:wrapSquare wrapText="bothSides"/>
-          <wp:docPr id="1066330372" name="Picture 1066330369"/>
+          <wp:docPr id="1066330382" name="Picture 1066330369"/>
           <wp:cNvGraphicFramePr>
             <a:graphicFrameLocks xmlns:a="http://schemas.openxmlformats.org/drawingml/2006/main"/>
           </wp:cNvGraphicFramePr>
@@ -17797,6 +16235,16 @@
       </w:rPr>
     </w:lvl>
   </w:abstractNum>
+  <w:abstractNum w:abstractNumId="6"/>
+  <w:abstractNum w:abstractNumId="7"/>
+  <w:abstractNum w:abstractNumId="8"/>
+  <w:abstractNum w:abstractNumId="9"/>
+  <w:abstractNum w:abstractNumId="10"/>
+  <w:abstractNum w:abstractNumId="11"/>
+  <w:abstractNum w:abstractNumId="12"/>
+  <w:abstractNum w:abstractNumId="13"/>
+  <w:abstractNum w:abstractNumId="14"/>
+  <w:abstractNum w:abstractNumId="15"/>
   <w:num w:numId="1">
     <w:abstractNumId w:val="4"/>
   </w:num>
@@ -17814,6 +16262,116 @@
   </w:num>
   <w:num w:numId="6">
     <w:abstractNumId w:val="2"/>
+  </w:num>
+  <w:num w:numId="7">
+    <w:abstractNumId w:val="6"/>
+    <w:lvlOverride w:ilvl="0">
+      <w:lvl w:ilvl="0" w:tentative="1">
+        <w:numFmt w:val="bullet"/>
+        <w:suff w:val="tab"/>
+        <w:lvlText w:val="·"/>
+        <w:rPr/>
+      </w:lvl>
+    </w:lvlOverride>
+  </w:num>
+  <w:num w:numId="8">
+    <w:abstractNumId w:val="7"/>
+    <w:lvlOverride w:ilvl="0">
+      <w:lvl w:ilvl="0" w:tentative="1">
+        <w:numFmt w:val="bullet"/>
+        <w:suff w:val="tab"/>
+        <w:lvlText w:val="·"/>
+        <w:rPr/>
+      </w:lvl>
+    </w:lvlOverride>
+  </w:num>
+  <w:num w:numId="9">
+    <w:abstractNumId w:val="8"/>
+    <w:lvlOverride w:ilvl="0">
+      <w:lvl w:ilvl="0" w:tentative="1">
+        <w:numFmt w:val="bullet"/>
+        <w:suff w:val="tab"/>
+        <w:lvlText w:val="·"/>
+        <w:rPr/>
+      </w:lvl>
+    </w:lvlOverride>
+  </w:num>
+  <w:num w:numId="10">
+    <w:abstractNumId w:val="9"/>
+    <w:lvlOverride w:ilvl="0">
+      <w:lvl w:ilvl="0" w:tentative="1">
+        <w:numFmt w:val="bullet"/>
+        <w:suff w:val="tab"/>
+        <w:lvlText w:val="·"/>
+        <w:rPr/>
+      </w:lvl>
+    </w:lvlOverride>
+  </w:num>
+  <w:num w:numId="11">
+    <w:abstractNumId w:val="10"/>
+    <w:lvlOverride w:ilvl="0">
+      <w:lvl w:ilvl="0" w:tentative="1">
+        <w:numFmt w:val="bullet"/>
+        <w:suff w:val="tab"/>
+        <w:lvlText w:val="·"/>
+        <w:rPr/>
+      </w:lvl>
+    </w:lvlOverride>
+  </w:num>
+  <w:num w:numId="12">
+    <w:abstractNumId w:val="11"/>
+    <w:lvlOverride w:ilvl="0">
+      <w:lvl w:ilvl="0" w:tentative="1">
+        <w:numFmt w:val="bullet"/>
+        <w:suff w:val="tab"/>
+        <w:lvlText w:val="·"/>
+        <w:rPr/>
+      </w:lvl>
+    </w:lvlOverride>
+  </w:num>
+  <w:num w:numId="13">
+    <w:abstractNumId w:val="12"/>
+    <w:lvlOverride w:ilvl="0">
+      <w:lvl w:ilvl="0" w:tentative="1">
+        <w:numFmt w:val="bullet"/>
+        <w:suff w:val="tab"/>
+        <w:lvlText w:val="·"/>
+        <w:rPr/>
+      </w:lvl>
+    </w:lvlOverride>
+  </w:num>
+  <w:num w:numId="14">
+    <w:abstractNumId w:val="13"/>
+    <w:lvlOverride w:ilvl="0">
+      <w:lvl w:ilvl="0" w:tentative="1">
+        <w:numFmt w:val="bullet"/>
+        <w:suff w:val="tab"/>
+        <w:lvlText w:val="·"/>
+        <w:rPr/>
+      </w:lvl>
+    </w:lvlOverride>
+  </w:num>
+  <w:num w:numId="15">
+    <w:abstractNumId w:val="14"/>
+    <w:lvlOverride w:ilvl="0">
+      <w:lvl w:ilvl="0" w:tentative="1">
+        <w:numFmt w:val="bullet"/>
+        <w:suff w:val="tab"/>
+        <w:lvlText w:val="·"/>
+        <w:rPr/>
+      </w:lvl>
+    </w:lvlOverride>
+  </w:num>
+  <w:num w:numId="16">
+    <w:abstractNumId w:val="15"/>
+    <w:lvlOverride w:ilvl="0">
+      <w:lvl w:ilvl="0" w:tentative="1">
+        <w:numFmt w:val="bullet"/>
+        <w:suff w:val="tab"/>
+        <w:lvlText w:val="·"/>
+        <w:rPr/>
+      </w:lvl>
+    </w:lvlOverride>
   </w:num>
 </w:numbering>
 </file>

</xml_diff>